<commit_message>
docs: Avance documento identificacion
</commit_message>
<xml_diff>
--- a/Gestion/1.1.2 Documento de registro de definición e identificación del proyecto.docx
+++ b/Gestion/1.1.2 Documento de registro de definición e identificación del proyecto.docx
@@ -1,6 +1,6 @@
 
 <file path=word/document.xml><?xml version="1.0" encoding="utf-8"?>
-<w:document xmlns:wpc="http://schemas.microsoft.com/office/word/2010/wordprocessingCanvas" xmlns:cx="http://schemas.microsoft.com/office/drawing/2014/chartex" xmlns:cx1="http://schemas.microsoft.com/office/drawing/2015/9/8/chartex" xmlns:cx2="http://schemas.microsoft.com/office/drawing/2015/10/21/chartex" xmlns:cx3="http://schemas.microsoft.com/office/drawing/2016/5/9/chartex" xmlns:cx4="http://schemas.microsoft.com/office/drawing/2016/5/10/chartex" xmlns:cx5="http://schemas.microsoft.com/office/drawing/2016/5/11/chartex" xmlns:cx6="http://schemas.microsoft.com/office/drawing/2016/5/12/chartex" xmlns:cx7="http://schemas.microsoft.com/office/drawing/2016/5/13/chartex" xmlns:cx8="http://schemas.microsoft.com/office/drawing/2016/5/14/chartex" xmlns:mc="http://schemas.openxmlformats.org/markup-compatibility/2006" xmlns:aink="http://schemas.microsoft.com/office/drawing/2016/ink" xmlns:am3d="http://schemas.microsoft.com/office/drawing/2017/model3d" xmlns:o="urn:schemas-microsoft-com:office:office" xmlns:oel="http://schemas.microsoft.com/office/2019/extlst" xmlns:r="http://schemas.openxmlformats.org/officeDocument/2006/relationships" xmlns:m="http://schemas.openxmlformats.org/officeDocument/2006/math" xmlns:v="urn:schemas-microsoft-com:vml" xmlns:wp14="http://schemas.microsoft.com/office/word/2010/wordprocessingDrawing" xmlns:wp="http://schemas.openxmlformats.org/drawingml/2006/wordprocessingDrawing" xmlns:w10="urn:schemas-microsoft-com:office:word" xmlns:w="http://schemas.openxmlformats.org/wordprocessingml/2006/main" xmlns:w14="http://schemas.microsoft.com/office/word/2010/wordml" xmlns:w15="http://schemas.microsoft.com/office/word/2012/wordml" xmlns:w16cex="http://schemas.microsoft.com/office/word/2018/wordml/cex" xmlns:w16cid="http://schemas.microsoft.com/office/word/2016/wordml/cid" xmlns:w16="http://schemas.microsoft.com/office/word/2018/wordml" xmlns:w16du="http://schemas.microsoft.com/office/word/2023/wordml/word16du" xmlns:w16sdtdh="http://schemas.microsoft.com/office/word/2020/wordml/sdtdatahash" xmlns:w16sdtfl="http://schemas.microsoft.com/office/word/2024/wordml/sdtformatlock" xmlns:w16se="http://schemas.microsoft.com/office/word/2015/wordml/symex" xmlns:wpg="http://schemas.microsoft.com/office/word/2010/wordprocessingGroup" xmlns:wpi="http://schemas.microsoft.com/office/word/2010/wordprocessingInk" xmlns:wne="http://schemas.microsoft.com/office/word/2006/wordml" xmlns:wps="http://schemas.microsoft.com/office/word/2010/wordprocessingShape" mc:Ignorable="w14 w15 w16se w16cid w16 w16cex w16sdtdh w16sdtfl w16du wp14">
+<w:document xmlns:wpc="http://schemas.microsoft.com/office/word/2010/wordprocessingCanvas" xmlns:cx="http://schemas.microsoft.com/office/drawing/2014/chartex" xmlns:cx1="http://schemas.microsoft.com/office/drawing/2015/9/8/chartex" xmlns:cx2="http://schemas.microsoft.com/office/drawing/2015/10/21/chartex" xmlns:cx3="http://schemas.microsoft.com/office/drawing/2016/5/9/chartex" xmlns:cx4="http://schemas.microsoft.com/office/drawing/2016/5/10/chartex" xmlns:cx5="http://schemas.microsoft.com/office/drawing/2016/5/11/chartex" xmlns:cx6="http://schemas.microsoft.com/office/drawing/2016/5/12/chartex" xmlns:cx7="http://schemas.microsoft.com/office/drawing/2016/5/13/chartex" xmlns:cx8="http://schemas.microsoft.com/office/drawing/2016/5/14/chartex" xmlns:mc="http://schemas.openxmlformats.org/markup-compatibility/2006" xmlns:aink="http://schemas.microsoft.com/office/drawing/2016/ink" xmlns:am3d="http://schemas.microsoft.com/office/drawing/2017/model3d" xmlns:o="urn:schemas-microsoft-com:office:office" xmlns:r="http://schemas.openxmlformats.org/officeDocument/2006/relationships" xmlns:m="http://schemas.openxmlformats.org/officeDocument/2006/math" xmlns:v="urn:schemas-microsoft-com:vml" xmlns:wp14="http://schemas.microsoft.com/office/word/2010/wordprocessingDrawing" xmlns:wp="http://schemas.openxmlformats.org/drawingml/2006/wordprocessingDrawing" xmlns:w10="urn:schemas-microsoft-com:office:word" xmlns:w="http://schemas.openxmlformats.org/wordprocessingml/2006/main" xmlns:w14="http://schemas.microsoft.com/office/word/2010/wordml" xmlns:w15="http://schemas.microsoft.com/office/word/2012/wordml" xmlns:w16cex="http://schemas.microsoft.com/office/word/2018/wordml/cex" xmlns:w16cid="http://schemas.microsoft.com/office/word/2016/wordml/cid" xmlns:w16="http://schemas.microsoft.com/office/word/2018/wordml" xmlns:w16sdtdh="http://schemas.microsoft.com/office/word/2020/wordml/sdtdatahash" xmlns:w16se="http://schemas.microsoft.com/office/word/2015/wordml/symex" xmlns:wpg="http://schemas.microsoft.com/office/word/2010/wordprocessingGroup" xmlns:wpi="http://schemas.microsoft.com/office/word/2010/wordprocessingInk" xmlns:wne="http://schemas.microsoft.com/office/word/2006/wordml" xmlns:wps="http://schemas.microsoft.com/office/word/2010/wordprocessingShape" mc:Ignorable="w14 w15 w16se w16cid w16 w16cex w16sdtdh wp14">
   <w:body>
     <w:tbl>
       <w:tblPr>
@@ -1002,7 +1002,7 @@
               </wp:anchor>
             </w:drawing>
           </mc:Choice>
-          <mc:Fallback xmlns:a="http://schemas.openxmlformats.org/drawingml/2006/main" xmlns:pic="http://schemas.openxmlformats.org/drawingml/2006/picture" xmlns:asvg="http://schemas.microsoft.com/office/drawing/2016/SVG/main">
+          <mc:Fallback xmlns:asvg="http://schemas.microsoft.com/office/drawing/2016/SVG/main" xmlns:pic="http://schemas.openxmlformats.org/drawingml/2006/picture" xmlns:a="http://schemas.openxmlformats.org/drawingml/2006/main" xmlns:w16sdtfl="http://schemas.microsoft.com/office/word/2024/wordml/sdtformatlock" xmlns:w16du="http://schemas.microsoft.com/office/word/2023/wordml/word16du" xmlns:oel="http://schemas.microsoft.com/office/2019/extlst">
             <w:pict>
               <v:line id="Conector recto 12" style="position:absolute;flip:y;z-index:251671555;visibility:visible;mso-wrap-style:square;mso-width-percent:0;mso-height-percent:0;mso-wrap-distance-left:9pt;mso-wrap-distance-top:-3e-5mm;mso-wrap-distance-right:9pt;mso-wrap-distance-bottom:-3e-5mm;mso-position-horizontal:absolute;mso-position-horizontal-relative:text;mso-position-vertical:absolute;mso-position-vertical-relative:text;mso-width-percent:0;mso-height-percent:0;mso-width-relative:margin;mso-height-relative:margin" o:spid="_x0000_s1026" strokecolor="#b4c6e7 [1300]" strokeweight=".5pt" from="1.2pt,6.25pt" to="440.55pt,6.25pt" w14:anchorId="0C8B07C6" o:gfxdata="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">
                 <v:stroke joinstyle="miter"/>
@@ -1323,7 +1323,7 @@
               </wp:anchor>
             </w:drawing>
           </mc:Choice>
-          <mc:Fallback xmlns:a="http://schemas.openxmlformats.org/drawingml/2006/main" xmlns:pic="http://schemas.openxmlformats.org/drawingml/2006/picture" xmlns:asvg="http://schemas.microsoft.com/office/drawing/2016/SVG/main">
+          <mc:Fallback xmlns:asvg="http://schemas.microsoft.com/office/drawing/2016/SVG/main" xmlns:pic="http://schemas.openxmlformats.org/drawingml/2006/picture" xmlns:a="http://schemas.openxmlformats.org/drawingml/2006/main" xmlns:w16sdtfl="http://schemas.microsoft.com/office/word/2024/wordml/sdtformatlock" xmlns:w16du="http://schemas.microsoft.com/office/word/2023/wordml/word16du" xmlns:oel="http://schemas.microsoft.com/office/2019/extlst">
             <w:pict>
               <v:line id="Conector recto 11" style="position:absolute;z-index:251673603;visibility:visible;mso-wrap-style:square;mso-width-percent:0;mso-height-percent:0;mso-wrap-distance-left:9pt;mso-wrap-distance-top:-3e-5mm;mso-wrap-distance-right:9pt;mso-wrap-distance-bottom:-3e-5mm;mso-position-horizontal:absolute;mso-position-horizontal-relative:text;mso-position-vertical:absolute;mso-position-vertical-relative:text;mso-width-percent:0;mso-height-percent:0;mso-width-relative:page;mso-height-relative:page" o:spid="_x0000_s1026" strokecolor="#b4c6e7 [1300]" strokeweight=".5pt" from="0,-.05pt" to="440.15pt,-.05pt" w14:anchorId="4878FEF2" o:gfxdata="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">
                 <v:stroke joinstyle="miter"/>
@@ -1697,7 +1697,7 @@
               </wp:anchor>
             </w:drawing>
           </mc:Choice>
-          <mc:Fallback xmlns:a="http://schemas.openxmlformats.org/drawingml/2006/main" xmlns:pic="http://schemas.openxmlformats.org/drawingml/2006/picture" xmlns:asvg="http://schemas.microsoft.com/office/drawing/2016/SVG/main">
+          <mc:Fallback xmlns:asvg="http://schemas.microsoft.com/office/drawing/2016/SVG/main" xmlns:pic="http://schemas.openxmlformats.org/drawingml/2006/picture" xmlns:a="http://schemas.openxmlformats.org/drawingml/2006/main" xmlns:w16sdtfl="http://schemas.microsoft.com/office/word/2024/wordml/sdtformatlock" xmlns:w16du="http://schemas.microsoft.com/office/word/2023/wordml/word16du" xmlns:oel="http://schemas.microsoft.com/office/2019/extlst">
             <w:pict>
               <v:line id="Conector recto 10" style="position:absolute;z-index:251675651;visibility:visible;mso-wrap-style:square;mso-width-percent:0;mso-height-percent:0;mso-wrap-distance-left:9pt;mso-wrap-distance-top:-3e-5mm;mso-wrap-distance-right:9pt;mso-wrap-distance-bottom:-3e-5mm;mso-position-horizontal:absolute;mso-position-horizontal-relative:text;mso-position-vertical:absolute;mso-position-vertical-relative:text;mso-width-percent:0;mso-height-percent:0;mso-width-relative:margin;mso-height-relative:margin" o:spid="_x0000_s1026" strokecolor="#b4c6e7 [1300]" strokeweight=".5pt" from="-.05pt,3.4pt" to="440.1pt,3.4pt" w14:anchorId="4A06B2A9" o:gfxdata="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">
                 <v:stroke joinstyle="miter"/>
@@ -2479,6 +2479,14 @@
                 <w:szCs w:val="22"/>
               </w:rPr>
             </w:pPr>
+            <w:r>
+              <w:rPr>
+                <w:rFonts w:ascii="Calibri" w:eastAsia="Calibri" w:hAnsi="Calibri" w:cs="Calibri"/>
+                <w:sz w:val="22"/>
+                <w:szCs w:val="22"/>
+              </w:rPr>
+              <w:t>21.924.398-7</w:t>
+            </w:r>
           </w:p>
         </w:tc>
         <w:tc>
@@ -2610,8 +2618,18 @@
                 <w:sz w:val="22"/>
                 <w:szCs w:val="22"/>
               </w:rPr>
-              <w:t>José Matias</w:t>
-            </w:r>
+              <w:t xml:space="preserve">José </w:t>
+            </w:r>
+            <w:proofErr w:type="spellStart"/>
+            <w:r>
+              <w:rPr>
+                <w:rFonts w:ascii="Calibri" w:eastAsia="Calibri" w:hAnsi="Calibri" w:cs="Calibri"/>
+                <w:sz w:val="22"/>
+                <w:szCs w:val="22"/>
+              </w:rPr>
+              <w:t>Matias</w:t>
+            </w:r>
+            <w:proofErr w:type="spellEnd"/>
           </w:p>
         </w:tc>
         <w:tc>
@@ -2896,35 +2914,9 @@
                 <w:sz w:val="20"/>
                 <w:szCs w:val="20"/>
               </w:rPr>
-              <w:t>QA/Testing/front end</w:t>
-            </w:r>
-          </w:p>
-        </w:tc>
-        <w:tc>
-          <w:tcPr>
-            <w:tcW w:w="2539" w:type="dxa"/>
-            <w:tcBorders>
-              <w:top w:val="single" w:sz="6" w:space="0" w:color="BFBFBF" w:themeColor="background1" w:themeShade="BF"/>
-              <w:left w:val="single" w:sz="6" w:space="0" w:color="BFBFBF" w:themeColor="background1" w:themeShade="BF"/>
-              <w:bottom w:val="single" w:sz="6" w:space="0" w:color="BFBFBF" w:themeColor="background1" w:themeShade="BF"/>
-              <w:right w:val="single" w:sz="6" w:space="0" w:color="BFBFBF" w:themeColor="background1" w:themeShade="BF"/>
-            </w:tcBorders>
-            <w:tcMar>
-              <w:left w:w="105" w:type="dxa"/>
-              <w:right w:w="105" w:type="dxa"/>
-            </w:tcMar>
-          </w:tcPr>
-          <w:p>
-            <w:pPr>
-              <w:spacing w:line="259" w:lineRule="auto"/>
-              <w:jc w:val="both"/>
-              <w:rPr>
-                <w:rFonts w:ascii="Calibri" w:eastAsia="Calibri" w:hAnsi="Calibri" w:cs="Calibri"/>
-                <w:color w:val="548DD4"/>
-                <w:sz w:val="20"/>
-                <w:szCs w:val="20"/>
-              </w:rPr>
-            </w:pPr>
+              <w:t>QA/</w:t>
+            </w:r>
+            <w:proofErr w:type="spellStart"/>
             <w:r>
               <w:rPr>
                 <w:rFonts w:ascii="Calibri" w:eastAsia="Calibri" w:hAnsi="Calibri" w:cs="Calibri"/>
@@ -2934,35 +2926,9 @@
                 <w:sz w:val="20"/>
                 <w:szCs w:val="20"/>
               </w:rPr>
-              <w:t>DBA/ Analista Funcional/Lider</w:t>
-            </w:r>
-          </w:p>
-        </w:tc>
-        <w:tc>
-          <w:tcPr>
-            <w:tcW w:w="2539" w:type="dxa"/>
-            <w:tcBorders>
-              <w:top w:val="single" w:sz="6" w:space="0" w:color="BFBFBF" w:themeColor="background1" w:themeShade="BF"/>
-              <w:left w:val="single" w:sz="6" w:space="0" w:color="BFBFBF" w:themeColor="background1" w:themeShade="BF"/>
-              <w:bottom w:val="single" w:sz="6" w:space="0" w:color="BFBFBF" w:themeColor="background1" w:themeShade="BF"/>
-              <w:right w:val="single" w:sz="6" w:space="0" w:color="BFBFBF" w:themeColor="background1" w:themeShade="BF"/>
-            </w:tcBorders>
-            <w:tcMar>
-              <w:left w:w="105" w:type="dxa"/>
-              <w:right w:w="105" w:type="dxa"/>
-            </w:tcMar>
-          </w:tcPr>
-          <w:p>
-            <w:pPr>
-              <w:spacing w:line="259" w:lineRule="auto"/>
-              <w:jc w:val="both"/>
-              <w:rPr>
-                <w:rFonts w:ascii="Calibri" w:eastAsia="Calibri" w:hAnsi="Calibri" w:cs="Calibri"/>
-                <w:color w:val="548DD4"/>
-                <w:sz w:val="20"/>
-                <w:szCs w:val="20"/>
-              </w:rPr>
-            </w:pPr>
+              <w:t>Testing</w:t>
+            </w:r>
+            <w:proofErr w:type="spellEnd"/>
             <w:r>
               <w:rPr>
                 <w:rFonts w:ascii="Calibri" w:eastAsia="Calibri" w:hAnsi="Calibri" w:cs="Calibri"/>
@@ -2972,7 +2938,157 @@
                 <w:sz w:val="20"/>
                 <w:szCs w:val="20"/>
               </w:rPr>
-              <w:t>Back end/ Otros…</w:t>
+              <w:t>/</w:t>
+            </w:r>
+            <w:proofErr w:type="spellStart"/>
+            <w:r>
+              <w:rPr>
+                <w:rFonts w:ascii="Calibri" w:eastAsia="Calibri" w:hAnsi="Calibri" w:cs="Calibri"/>
+                <w:i/>
+                <w:iCs/>
+                <w:color w:val="548DD4"/>
+                <w:sz w:val="20"/>
+                <w:szCs w:val="20"/>
+              </w:rPr>
+              <w:t>front</w:t>
+            </w:r>
+            <w:proofErr w:type="spellEnd"/>
+            <w:r>
+              <w:rPr>
+                <w:rFonts w:ascii="Calibri" w:eastAsia="Calibri" w:hAnsi="Calibri" w:cs="Calibri"/>
+                <w:i/>
+                <w:iCs/>
+                <w:color w:val="548DD4"/>
+                <w:sz w:val="20"/>
+                <w:szCs w:val="20"/>
+              </w:rPr>
+              <w:t xml:space="preserve"> </w:t>
+            </w:r>
+            <w:proofErr w:type="spellStart"/>
+            <w:r>
+              <w:rPr>
+                <w:rFonts w:ascii="Calibri" w:eastAsia="Calibri" w:hAnsi="Calibri" w:cs="Calibri"/>
+                <w:i/>
+                <w:iCs/>
+                <w:color w:val="548DD4"/>
+                <w:sz w:val="20"/>
+                <w:szCs w:val="20"/>
+              </w:rPr>
+              <w:t>end</w:t>
+            </w:r>
+            <w:proofErr w:type="spellEnd"/>
+          </w:p>
+        </w:tc>
+        <w:tc>
+          <w:tcPr>
+            <w:tcW w:w="2539" w:type="dxa"/>
+            <w:tcBorders>
+              <w:top w:val="single" w:sz="6" w:space="0" w:color="BFBFBF" w:themeColor="background1" w:themeShade="BF"/>
+              <w:left w:val="single" w:sz="6" w:space="0" w:color="BFBFBF" w:themeColor="background1" w:themeShade="BF"/>
+              <w:bottom w:val="single" w:sz="6" w:space="0" w:color="BFBFBF" w:themeColor="background1" w:themeShade="BF"/>
+              <w:right w:val="single" w:sz="6" w:space="0" w:color="BFBFBF" w:themeColor="background1" w:themeShade="BF"/>
+            </w:tcBorders>
+            <w:tcMar>
+              <w:left w:w="105" w:type="dxa"/>
+              <w:right w:w="105" w:type="dxa"/>
+            </w:tcMar>
+          </w:tcPr>
+          <w:p>
+            <w:pPr>
+              <w:spacing w:line="259" w:lineRule="auto"/>
+              <w:jc w:val="both"/>
+              <w:rPr>
+                <w:rFonts w:ascii="Calibri" w:eastAsia="Calibri" w:hAnsi="Calibri" w:cs="Calibri"/>
+                <w:color w:val="548DD4"/>
+                <w:sz w:val="20"/>
+                <w:szCs w:val="20"/>
+              </w:rPr>
+            </w:pPr>
+            <w:r>
+              <w:rPr>
+                <w:rFonts w:ascii="Calibri" w:eastAsia="Calibri" w:hAnsi="Calibri" w:cs="Calibri"/>
+                <w:i/>
+                <w:iCs/>
+                <w:color w:val="548DD4"/>
+                <w:sz w:val="20"/>
+                <w:szCs w:val="20"/>
+              </w:rPr>
+              <w:t>DBA/ Analista Funcional/</w:t>
+            </w:r>
+            <w:proofErr w:type="spellStart"/>
+            <w:r>
+              <w:rPr>
+                <w:rFonts w:ascii="Calibri" w:eastAsia="Calibri" w:hAnsi="Calibri" w:cs="Calibri"/>
+                <w:i/>
+                <w:iCs/>
+                <w:color w:val="548DD4"/>
+                <w:sz w:val="20"/>
+                <w:szCs w:val="20"/>
+              </w:rPr>
+              <w:t>Lider</w:t>
+            </w:r>
+            <w:proofErr w:type="spellEnd"/>
+          </w:p>
+        </w:tc>
+        <w:tc>
+          <w:tcPr>
+            <w:tcW w:w="2539" w:type="dxa"/>
+            <w:tcBorders>
+              <w:top w:val="single" w:sz="6" w:space="0" w:color="BFBFBF" w:themeColor="background1" w:themeShade="BF"/>
+              <w:left w:val="single" w:sz="6" w:space="0" w:color="BFBFBF" w:themeColor="background1" w:themeShade="BF"/>
+              <w:bottom w:val="single" w:sz="6" w:space="0" w:color="BFBFBF" w:themeColor="background1" w:themeShade="BF"/>
+              <w:right w:val="single" w:sz="6" w:space="0" w:color="BFBFBF" w:themeColor="background1" w:themeShade="BF"/>
+            </w:tcBorders>
+            <w:tcMar>
+              <w:left w:w="105" w:type="dxa"/>
+              <w:right w:w="105" w:type="dxa"/>
+            </w:tcMar>
+          </w:tcPr>
+          <w:p>
+            <w:pPr>
+              <w:spacing w:line="259" w:lineRule="auto"/>
+              <w:jc w:val="both"/>
+              <w:rPr>
+                <w:rFonts w:ascii="Calibri" w:eastAsia="Calibri" w:hAnsi="Calibri" w:cs="Calibri"/>
+                <w:color w:val="548DD4"/>
+                <w:sz w:val="20"/>
+                <w:szCs w:val="20"/>
+              </w:rPr>
+            </w:pPr>
+            <w:r>
+              <w:rPr>
+                <w:rFonts w:ascii="Calibri" w:eastAsia="Calibri" w:hAnsi="Calibri" w:cs="Calibri"/>
+                <w:i/>
+                <w:iCs/>
+                <w:color w:val="548DD4"/>
+                <w:sz w:val="20"/>
+                <w:szCs w:val="20"/>
+              </w:rPr>
+              <w:t xml:space="preserve">Back </w:t>
+            </w:r>
+            <w:proofErr w:type="spellStart"/>
+            <w:r>
+              <w:rPr>
+                <w:rFonts w:ascii="Calibri" w:eastAsia="Calibri" w:hAnsi="Calibri" w:cs="Calibri"/>
+                <w:i/>
+                <w:iCs/>
+                <w:color w:val="548DD4"/>
+                <w:sz w:val="20"/>
+                <w:szCs w:val="20"/>
+              </w:rPr>
+              <w:t>end</w:t>
+            </w:r>
+            <w:proofErr w:type="spellEnd"/>
+            <w:r>
+              <w:rPr>
+                <w:rFonts w:ascii="Calibri" w:eastAsia="Calibri" w:hAnsi="Calibri" w:cs="Calibri"/>
+                <w:i/>
+                <w:iCs/>
+                <w:color w:val="548DD4"/>
+                <w:sz w:val="20"/>
+                <w:szCs w:val="20"/>
+              </w:rPr>
+              <w:t>/ Otros…</w:t>
             </w:r>
           </w:p>
         </w:tc>
@@ -3191,7 +3307,7 @@
                 <w:sz w:val="20"/>
                 <w:szCs w:val="20"/>
               </w:rPr>
-              <w:t>Punto de ventas</w:t>
+              <w:t>App de Trueques</w:t>
             </w:r>
           </w:p>
         </w:tc>
@@ -3270,7 +3386,18 @@
                 <w:sz w:val="20"/>
                 <w:szCs w:val="20"/>
               </w:rPr>
-              <w:t>Permite realizar venta de productos online</w:t>
+              <w:t xml:space="preserve">Permite </w:t>
+            </w:r>
+            <w:r>
+              <w:rPr>
+                <w:rFonts w:ascii="Calibri" w:eastAsia="Calibri" w:hAnsi="Calibri" w:cs="Calibri"/>
+                <w:i/>
+                <w:iCs/>
+                <w:color w:val="548DD4"/>
+                <w:sz w:val="20"/>
+                <w:szCs w:val="20"/>
+              </w:rPr>
+              <w:t>coordinar intercambio de objetos</w:t>
             </w:r>
           </w:p>
         </w:tc>
@@ -3349,7 +3476,40 @@
                 <w:sz w:val="20"/>
                 <w:szCs w:val="20"/>
               </w:rPr>
-              <w:t>Falta de canal de ventas.</w:t>
+              <w:t xml:space="preserve">Falta de </w:t>
+            </w:r>
+            <w:r>
+              <w:rPr>
+                <w:rFonts w:ascii="Calibri" w:eastAsia="Calibri" w:hAnsi="Calibri" w:cs="Calibri"/>
+                <w:i/>
+                <w:iCs/>
+                <w:color w:val="548DD4"/>
+                <w:sz w:val="20"/>
+                <w:szCs w:val="20"/>
+              </w:rPr>
+              <w:t xml:space="preserve">apps dedicadas al intercambio de objeto </w:t>
+            </w:r>
+            <w:r>
+              <w:rPr>
+                <w:rFonts w:ascii="Calibri" w:eastAsia="Calibri" w:hAnsi="Calibri" w:cs="Calibri"/>
+                <w:i/>
+                <w:iCs/>
+                <w:color w:val="548DD4"/>
+                <w:sz w:val="20"/>
+                <w:szCs w:val="20"/>
+              </w:rPr>
+              <w:t>e</w:t>
+            </w:r>
+            <w:r>
+              <w:rPr>
+                <w:rFonts w:ascii="Calibri" w:eastAsia="Calibri" w:hAnsi="Calibri" w:cs="Calibri"/>
+                <w:i/>
+                <w:iCs/>
+                <w:color w:val="548DD4"/>
+                <w:sz w:val="20"/>
+                <w:szCs w:val="20"/>
+              </w:rPr>
+              <w:t xml:space="preserve"> hiperconsumo desechable.</w:t>
             </w:r>
           </w:p>
         </w:tc>
@@ -3428,7 +3588,7 @@
                 <w:sz w:val="20"/>
                 <w:szCs w:val="20"/>
               </w:rPr>
-              <w:t>Carrito</w:t>
+              <w:t>Plataforma de Intercambios</w:t>
             </w:r>
           </w:p>
         </w:tc>
@@ -3507,7 +3667,7 @@
                 <w:sz w:val="20"/>
                 <w:szCs w:val="20"/>
               </w:rPr>
-              <w:t>Aumentar las ventas agregando una nueva forma de vender para la empresa</w:t>
+              <w:t>Incentivar la economía circular y dar un espacio dedicado al intercambio</w:t>
             </w:r>
           </w:p>
         </w:tc>
@@ -3586,7 +3746,7 @@
                 <w:sz w:val="20"/>
                 <w:szCs w:val="20"/>
               </w:rPr>
-              <w:t>Creación de un canal de ventas mediante una página web que incluye carrito de compras y pasarela de pagos</w:t>
+              <w:t>Creación de una plataforma con su respectiva aplicación móvil y web que permita a los usuarios comunicarse para intercambiar objetos.</w:t>
             </w:r>
           </w:p>
         </w:tc>
@@ -3665,7 +3825,95 @@
                 <w:sz w:val="20"/>
                 <w:szCs w:val="20"/>
               </w:rPr>
-              <w:t>La aplicación permitirá la venta online de los productos ingresados por el cliente, controlando el stock, estados de ventas y pagos.</w:t>
+              <w:t xml:space="preserve">La aplicación permitirá </w:t>
+            </w:r>
+            <w:r>
+              <w:rPr>
+                <w:rFonts w:ascii="Calibri" w:eastAsia="Calibri" w:hAnsi="Calibri" w:cs="Calibri"/>
+                <w:i/>
+                <w:iCs/>
+                <w:color w:val="548DD4"/>
+                <w:sz w:val="20"/>
+                <w:szCs w:val="20"/>
+              </w:rPr>
+              <w:t xml:space="preserve">el intercambio </w:t>
+            </w:r>
+            <w:r>
+              <w:rPr>
+                <w:rFonts w:ascii="Calibri" w:eastAsia="Calibri" w:hAnsi="Calibri" w:cs="Calibri"/>
+                <w:i/>
+                <w:iCs/>
+                <w:color w:val="548DD4"/>
+                <w:sz w:val="20"/>
+                <w:szCs w:val="20"/>
+              </w:rPr>
+              <w:t xml:space="preserve">online de los </w:t>
+            </w:r>
+            <w:r>
+              <w:rPr>
+                <w:rFonts w:ascii="Calibri" w:eastAsia="Calibri" w:hAnsi="Calibri" w:cs="Calibri"/>
+                <w:i/>
+                <w:iCs/>
+                <w:color w:val="548DD4"/>
+                <w:sz w:val="20"/>
+                <w:szCs w:val="20"/>
+              </w:rPr>
+              <w:t xml:space="preserve">objetos </w:t>
+            </w:r>
+            <w:r>
+              <w:rPr>
+                <w:rFonts w:ascii="Calibri" w:eastAsia="Calibri" w:hAnsi="Calibri" w:cs="Calibri"/>
+                <w:i/>
+                <w:iCs/>
+                <w:color w:val="548DD4"/>
+                <w:sz w:val="20"/>
+                <w:szCs w:val="20"/>
+              </w:rPr>
+              <w:t>ingresados</w:t>
+            </w:r>
+            <w:r>
+              <w:rPr>
+                <w:rFonts w:ascii="Calibri" w:eastAsia="Calibri" w:hAnsi="Calibri" w:cs="Calibri"/>
+                <w:i/>
+                <w:iCs/>
+                <w:color w:val="548DD4"/>
+                <w:sz w:val="20"/>
+                <w:szCs w:val="20"/>
+              </w:rPr>
+              <w:t xml:space="preserve"> por el </w:t>
+            </w:r>
+            <w:r>
+              <w:rPr>
+                <w:rFonts w:ascii="Calibri" w:eastAsia="Calibri" w:hAnsi="Calibri" w:cs="Calibri"/>
+                <w:i/>
+                <w:iCs/>
+                <w:color w:val="548DD4"/>
+                <w:sz w:val="20"/>
+                <w:szCs w:val="20"/>
+              </w:rPr>
+              <w:t>usuario</w:t>
+            </w:r>
+            <w:r>
+              <w:rPr>
+                <w:rFonts w:ascii="Calibri" w:eastAsia="Calibri" w:hAnsi="Calibri" w:cs="Calibri"/>
+                <w:i/>
+                <w:iCs/>
+                <w:color w:val="548DD4"/>
+                <w:sz w:val="20"/>
+                <w:szCs w:val="20"/>
+              </w:rPr>
+              <w:t xml:space="preserve">, </w:t>
+            </w:r>
+            <w:r>
+              <w:rPr>
+                <w:rFonts w:ascii="Calibri" w:eastAsia="Calibri" w:hAnsi="Calibri" w:cs="Calibri"/>
+                <w:i/>
+                <w:iCs/>
+                <w:color w:val="548DD4"/>
+                <w:sz w:val="20"/>
+                <w:szCs w:val="20"/>
+              </w:rPr>
+              <w:t>coordinando los intercambios, confirmándolos y haciendo coincidir el lugar del intercambio.</w:t>
             </w:r>
           </w:p>
         </w:tc>
@@ -3806,23 +4054,13 @@
               <w:spacing w:line="259" w:lineRule="auto"/>
               <w:rPr>
                 <w:rFonts w:ascii="Calibri" w:eastAsia="Calibri" w:hAnsi="Calibri" w:cs="Calibri"/>
-                <w:color w:val="548DD4"/>
-                <w:sz w:val="20"/>
-                <w:szCs w:val="20"/>
-                <w:lang w:val="es-ES"/>
-              </w:rPr>
-            </w:pPr>
-            <w:r>
-              <w:rPr>
-                <w:rFonts w:ascii="Calibri" w:eastAsia="Calibri" w:hAnsi="Calibri" w:cs="Calibri"/>
                 <w:i/>
                 <w:iCs/>
                 <w:color w:val="548DD4"/>
                 <w:sz w:val="20"/>
                 <w:szCs w:val="20"/>
               </w:rPr>
-              <w:t xml:space="preserve">Especificar los antecedentes y motivación que llevaron a la creación del proyecto y la </w:t>
-            </w:r>
+            </w:pPr>
             <w:r>
               <w:rPr>
                 <w:rFonts w:ascii="Calibri" w:eastAsia="Calibri" w:hAnsi="Calibri" w:cs="Calibri"/>
@@ -3832,7 +4070,7 @@
                 <w:sz w:val="20"/>
                 <w:szCs w:val="20"/>
               </w:rPr>
-              <w:t xml:space="preserve">oportunidad o </w:t>
+              <w:t xml:space="preserve">Especificar los antecedentes y motivación que llevaron a la creación del proyecto y la </w:t>
             </w:r>
             <w:r>
               <w:rPr>
@@ -3843,8 +4081,9 @@
                 <w:sz w:val="20"/>
                 <w:szCs w:val="20"/>
               </w:rPr>
-              <w:t>problemática</w:t>
-            </w:r>
+              <w:t xml:space="preserve">oportunidad o </w:t>
+            </w:r>
+            <w:proofErr w:type="gramStart"/>
             <w:r>
               <w:rPr>
                 <w:rFonts w:ascii="Calibri" w:eastAsia="Calibri" w:hAnsi="Calibri" w:cs="Calibri"/>
@@ -3854,7 +4093,7 @@
                 <w:sz w:val="20"/>
                 <w:szCs w:val="20"/>
               </w:rPr>
-              <w:t xml:space="preserve"> </w:t>
+              <w:t>problemática</w:t>
             </w:r>
             <w:r>
               <w:rPr>
@@ -3865,8 +4104,43 @@
                 <w:sz w:val="20"/>
                 <w:szCs w:val="20"/>
               </w:rPr>
-              <w:t xml:space="preserve"> a resolver</w:t>
-            </w:r>
+              <w:t xml:space="preserve"> </w:t>
+            </w:r>
+            <w:r>
+              <w:rPr>
+                <w:rFonts w:ascii="Calibri" w:eastAsia="Calibri" w:hAnsi="Calibri" w:cs="Calibri"/>
+                <w:i/>
+                <w:iCs/>
+                <w:color w:val="548DD4"/>
+                <w:sz w:val="20"/>
+                <w:szCs w:val="20"/>
+              </w:rPr>
+              <w:t xml:space="preserve"> a</w:t>
+            </w:r>
+            <w:proofErr w:type="gramEnd"/>
+            <w:r>
+              <w:rPr>
+                <w:rFonts w:ascii="Calibri" w:eastAsia="Calibri" w:hAnsi="Calibri" w:cs="Calibri"/>
+                <w:i/>
+                <w:iCs/>
+                <w:color w:val="548DD4"/>
+                <w:sz w:val="20"/>
+                <w:szCs w:val="20"/>
+              </w:rPr>
+              <w:t xml:space="preserve"> resolver</w:t>
+            </w:r>
+          </w:p>
+          <w:p>
+            <w:pPr>
+              <w:spacing w:line="259" w:lineRule="auto"/>
+              <w:rPr>
+                <w:rFonts w:ascii="Calibri" w:eastAsia="Calibri" w:hAnsi="Calibri" w:cs="Calibri"/>
+                <w:color w:val="548DD4"/>
+                <w:sz w:val="20"/>
+                <w:szCs w:val="20"/>
+                <w:lang w:val="es-ES"/>
+              </w:rPr>
+            </w:pPr>
           </w:p>
           <w:p>
             <w:pPr>
@@ -3878,6 +4152,15 @@
                 <w:szCs w:val="22"/>
               </w:rPr>
             </w:pPr>
+            <w:r>
+              <w:rPr>
+                <w:rFonts w:ascii="Calibri" w:eastAsia="Calibri" w:hAnsi="Calibri" w:cs="Calibri"/>
+                <w:color w:val="1F4E79" w:themeColor="accent5" w:themeShade="80"/>
+                <w:sz w:val="22"/>
+                <w:szCs w:val="22"/>
+              </w:rPr>
+              <w:t>Sabemos como sociedad del hiperconsumo que el sistema económico y la idiosincrasia actual provoca, siendo miles de objetos con uso posible dejados en vertederos, lo que nos motiva a realizar este proyecto es el ver que quienes buscando ahorrar, cuidar el planeta y fortalecer el tejido social intercambian objetos no poseen un espacio digital dedicado a esto. Es un nicho de plataformas o aplicaciones claro que debe ser utilizado por una aplicación que dé una experiencia de usuario adecuada para coordinar estos intercambios.</w:t>
+            </w:r>
           </w:p>
           <w:p>
             <w:pPr>
@@ -4067,7 +4350,6 @@
                 <w:sz w:val="28"/>
                 <w:szCs w:val="28"/>
               </w:rPr>
-              <w:lastRenderedPageBreak/>
               <w:t>4. Metodología</w:t>
             </w:r>
           </w:p>
@@ -4259,6 +4541,391 @@
                 <w:szCs w:val="20"/>
               </w:rPr>
               <w:t>Cuando el proyecto a desarrollar es grupal, es necesario, incorporar la definición de las funciones, tareas y responsabilidades asociadas a cada integrante del equipo.</w:t>
+            </w:r>
+          </w:p>
+          <w:p>
+            <w:pPr>
+              <w:spacing w:line="259" w:lineRule="auto"/>
+              <w:jc w:val="both"/>
+              <w:rPr>
+                <w:rFonts w:ascii="Calibri" w:eastAsia="Calibri" w:hAnsi="Calibri" w:cs="Calibri"/>
+                <w:i/>
+                <w:iCs/>
+                <w:color w:val="548DD4"/>
+                <w:sz w:val="20"/>
+                <w:szCs w:val="20"/>
+              </w:rPr>
+            </w:pPr>
+          </w:p>
+          <w:p>
+            <w:pPr>
+              <w:pStyle w:val="Piedepgina"/>
+              <w:rPr>
+                <w:rFonts w:ascii="Calibri" w:eastAsia="Calibri" w:hAnsi="Calibri" w:cs="Calibri"/>
+                <w:color w:val="1F4E79" w:themeColor="accent5" w:themeShade="80"/>
+                <w:sz w:val="22"/>
+                <w:szCs w:val="22"/>
+              </w:rPr>
+            </w:pPr>
+            <w:r>
+              <w:rPr>
+                <w:rFonts w:ascii="Calibri" w:eastAsia="Calibri" w:hAnsi="Calibri" w:cs="Calibri"/>
+                <w:color w:val="1F4E79" w:themeColor="accent5" w:themeShade="80"/>
+                <w:sz w:val="22"/>
+                <w:szCs w:val="22"/>
+              </w:rPr>
+              <w:t>Principales etapas del proyecto</w:t>
+            </w:r>
+          </w:p>
+          <w:p>
+            <w:pPr>
+              <w:pStyle w:val="Piedepgina"/>
+              <w:numPr>
+                <w:ilvl w:val="0"/>
+                <w:numId w:val="11"/>
+              </w:numPr>
+              <w:rPr>
+                <w:rFonts w:ascii="Calibri" w:eastAsia="Calibri" w:hAnsi="Calibri" w:cs="Calibri"/>
+                <w:color w:val="1F4E79" w:themeColor="accent5" w:themeShade="80"/>
+                <w:sz w:val="22"/>
+                <w:szCs w:val="22"/>
+              </w:rPr>
+            </w:pPr>
+            <w:r>
+              <w:rPr>
+                <w:rFonts w:ascii="Calibri" w:eastAsia="Calibri" w:hAnsi="Calibri" w:cs="Calibri"/>
+                <w:b/>
+                <w:bCs/>
+                <w:color w:val="1F4E79" w:themeColor="accent5" w:themeShade="80"/>
+                <w:sz w:val="22"/>
+                <w:szCs w:val="22"/>
+              </w:rPr>
+              <w:t>Análisis y Requerimientos</w:t>
+            </w:r>
+            <w:r>
+              <w:rPr>
+                <w:rFonts w:ascii="Calibri" w:eastAsia="Calibri" w:hAnsi="Calibri" w:cs="Calibri"/>
+                <w:color w:val="1F4E79" w:themeColor="accent5" w:themeShade="80"/>
+                <w:sz w:val="22"/>
+                <w:szCs w:val="22"/>
+              </w:rPr>
+              <w:t>: Levantamiento de HU y definición de reglas de negocio (como el flujo de biometría).</w:t>
+            </w:r>
+          </w:p>
+          <w:p>
+            <w:pPr>
+              <w:pStyle w:val="Piedepgina"/>
+              <w:numPr>
+                <w:ilvl w:val="0"/>
+                <w:numId w:val="11"/>
+              </w:numPr>
+              <w:rPr>
+                <w:rFonts w:ascii="Calibri" w:eastAsia="Calibri" w:hAnsi="Calibri" w:cs="Calibri"/>
+                <w:color w:val="1F4E79" w:themeColor="accent5" w:themeShade="80"/>
+                <w:sz w:val="22"/>
+                <w:szCs w:val="22"/>
+              </w:rPr>
+            </w:pPr>
+            <w:r>
+              <w:rPr>
+                <w:rFonts w:ascii="Calibri" w:eastAsia="Calibri" w:hAnsi="Calibri" w:cs="Calibri"/>
+                <w:b/>
+                <w:bCs/>
+                <w:color w:val="1F4E79" w:themeColor="accent5" w:themeShade="80"/>
+                <w:sz w:val="22"/>
+                <w:szCs w:val="22"/>
+              </w:rPr>
+              <w:t>Diseño de Arquitectura y Datos</w:t>
+            </w:r>
+            <w:r>
+              <w:rPr>
+                <w:rFonts w:ascii="Calibri" w:eastAsia="Calibri" w:hAnsi="Calibri" w:cs="Calibri"/>
+                <w:color w:val="1F4E79" w:themeColor="accent5" w:themeShade="80"/>
+                <w:sz w:val="22"/>
+                <w:szCs w:val="22"/>
+              </w:rPr>
+              <w:t xml:space="preserve">: Modelado de la base de datos </w:t>
+            </w:r>
+            <w:proofErr w:type="spellStart"/>
+            <w:r>
+              <w:rPr>
+                <w:rFonts w:ascii="Calibri" w:eastAsia="Calibri" w:hAnsi="Calibri" w:cs="Calibri"/>
+                <w:color w:val="1F4E79" w:themeColor="accent5" w:themeShade="80"/>
+                <w:sz w:val="22"/>
+                <w:szCs w:val="22"/>
+              </w:rPr>
+              <w:t>postgreSQL</w:t>
+            </w:r>
+            <w:proofErr w:type="spellEnd"/>
+            <w:r>
+              <w:rPr>
+                <w:rFonts w:ascii="Calibri" w:eastAsia="Calibri" w:hAnsi="Calibri" w:cs="Calibri"/>
+                <w:color w:val="1F4E79" w:themeColor="accent5" w:themeShade="80"/>
+                <w:sz w:val="22"/>
+                <w:szCs w:val="22"/>
+              </w:rPr>
+              <w:t xml:space="preserve"> (</w:t>
+            </w:r>
+            <w:proofErr w:type="spellStart"/>
+            <w:r>
+              <w:rPr>
+                <w:rFonts w:ascii="Calibri" w:eastAsia="Calibri" w:hAnsi="Calibri" w:cs="Calibri"/>
+                <w:color w:val="1F4E79" w:themeColor="accent5" w:themeShade="80"/>
+                <w:sz w:val="22"/>
+                <w:szCs w:val="22"/>
+              </w:rPr>
+              <w:t>supabase</w:t>
+            </w:r>
+            <w:proofErr w:type="spellEnd"/>
+            <w:r>
+              <w:rPr>
+                <w:rFonts w:ascii="Calibri" w:eastAsia="Calibri" w:hAnsi="Calibri" w:cs="Calibri"/>
+                <w:color w:val="1F4E79" w:themeColor="accent5" w:themeShade="80"/>
+                <w:sz w:val="22"/>
+                <w:szCs w:val="22"/>
+              </w:rPr>
+              <w:t>) y prototipado de pantallas (UI/UX) móvil y web.</w:t>
+            </w:r>
+          </w:p>
+          <w:p>
+            <w:pPr>
+              <w:pStyle w:val="Piedepgina"/>
+              <w:numPr>
+                <w:ilvl w:val="0"/>
+                <w:numId w:val="11"/>
+              </w:numPr>
+              <w:rPr>
+                <w:rFonts w:ascii="Calibri" w:eastAsia="Calibri" w:hAnsi="Calibri" w:cs="Calibri"/>
+                <w:color w:val="1F4E79" w:themeColor="accent5" w:themeShade="80"/>
+                <w:sz w:val="22"/>
+                <w:szCs w:val="22"/>
+              </w:rPr>
+            </w:pPr>
+            <w:r>
+              <w:rPr>
+                <w:rFonts w:ascii="Calibri" w:eastAsia="Calibri" w:hAnsi="Calibri" w:cs="Calibri"/>
+                <w:b/>
+                <w:bCs/>
+                <w:color w:val="1F4E79" w:themeColor="accent5" w:themeShade="80"/>
+                <w:sz w:val="22"/>
+                <w:szCs w:val="22"/>
+              </w:rPr>
+              <w:t xml:space="preserve">Desarrollo del </w:t>
+            </w:r>
+            <w:proofErr w:type="spellStart"/>
+            <w:r>
+              <w:rPr>
+                <w:rFonts w:ascii="Calibri" w:eastAsia="Calibri" w:hAnsi="Calibri" w:cs="Calibri"/>
+                <w:b/>
+                <w:bCs/>
+                <w:color w:val="1F4E79" w:themeColor="accent5" w:themeShade="80"/>
+                <w:sz w:val="22"/>
+                <w:szCs w:val="22"/>
+              </w:rPr>
+              <w:t>Backend</w:t>
+            </w:r>
+            <w:proofErr w:type="spellEnd"/>
+            <w:r>
+              <w:rPr>
+                <w:rFonts w:ascii="Calibri" w:eastAsia="Calibri" w:hAnsi="Calibri" w:cs="Calibri"/>
+                <w:color w:val="1F4E79" w:themeColor="accent5" w:themeShade="80"/>
+                <w:sz w:val="22"/>
+                <w:szCs w:val="22"/>
+              </w:rPr>
+              <w:t xml:space="preserve">: Configuración de Spring </w:t>
+            </w:r>
+            <w:proofErr w:type="spellStart"/>
+            <w:r>
+              <w:rPr>
+                <w:rFonts w:ascii="Calibri" w:eastAsia="Calibri" w:hAnsi="Calibri" w:cs="Calibri"/>
+                <w:color w:val="1F4E79" w:themeColor="accent5" w:themeShade="80"/>
+                <w:sz w:val="22"/>
+                <w:szCs w:val="22"/>
+              </w:rPr>
+              <w:t>boot</w:t>
+            </w:r>
+            <w:proofErr w:type="spellEnd"/>
+            <w:r>
+              <w:rPr>
+                <w:rFonts w:ascii="Calibri" w:eastAsia="Calibri" w:hAnsi="Calibri" w:cs="Calibri"/>
+                <w:color w:val="1F4E79" w:themeColor="accent5" w:themeShade="80"/>
+                <w:sz w:val="22"/>
+                <w:szCs w:val="22"/>
+              </w:rPr>
+              <w:t xml:space="preserve"> para la lógica de negocio pesada y gestión de la base de datos.</w:t>
+            </w:r>
+          </w:p>
+          <w:p>
+            <w:pPr>
+              <w:pStyle w:val="Piedepgina"/>
+              <w:numPr>
+                <w:ilvl w:val="0"/>
+                <w:numId w:val="11"/>
+              </w:numPr>
+              <w:rPr>
+                <w:rFonts w:ascii="Calibri" w:eastAsia="Calibri" w:hAnsi="Calibri" w:cs="Calibri"/>
+                <w:color w:val="1F4E79" w:themeColor="accent5" w:themeShade="80"/>
+                <w:sz w:val="22"/>
+                <w:szCs w:val="22"/>
+              </w:rPr>
+            </w:pPr>
+            <w:r>
+              <w:rPr>
+                <w:rFonts w:ascii="Calibri" w:eastAsia="Calibri" w:hAnsi="Calibri" w:cs="Calibri"/>
+                <w:b/>
+                <w:bCs/>
+                <w:color w:val="1F4E79" w:themeColor="accent5" w:themeShade="80"/>
+                <w:sz w:val="22"/>
+                <w:szCs w:val="22"/>
+              </w:rPr>
+              <w:t xml:space="preserve">Desarrollo del </w:t>
+            </w:r>
+            <w:proofErr w:type="spellStart"/>
+            <w:r>
+              <w:rPr>
+                <w:rFonts w:ascii="Calibri" w:eastAsia="Calibri" w:hAnsi="Calibri" w:cs="Calibri"/>
+                <w:b/>
+                <w:bCs/>
+                <w:color w:val="1F4E79" w:themeColor="accent5" w:themeShade="80"/>
+                <w:sz w:val="22"/>
+                <w:szCs w:val="22"/>
+              </w:rPr>
+              <w:t>Frontend</w:t>
+            </w:r>
+            <w:proofErr w:type="spellEnd"/>
+            <w:r>
+              <w:rPr>
+                <w:rFonts w:ascii="Calibri" w:eastAsia="Calibri" w:hAnsi="Calibri" w:cs="Calibri"/>
+                <w:color w:val="1F4E79" w:themeColor="accent5" w:themeShade="80"/>
+                <w:sz w:val="22"/>
+                <w:szCs w:val="22"/>
+              </w:rPr>
+              <w:t>: Implementación de la interfaz y consumo de servicios.</w:t>
+            </w:r>
+          </w:p>
+          <w:p>
+            <w:pPr>
+              <w:pStyle w:val="Piedepgina"/>
+              <w:numPr>
+                <w:ilvl w:val="0"/>
+                <w:numId w:val="11"/>
+              </w:numPr>
+              <w:rPr>
+                <w:rFonts w:ascii="Calibri" w:eastAsia="Calibri" w:hAnsi="Calibri" w:cs="Calibri"/>
+                <w:color w:val="1F4E79" w:themeColor="accent5" w:themeShade="80"/>
+                <w:sz w:val="22"/>
+                <w:szCs w:val="22"/>
+              </w:rPr>
+            </w:pPr>
+            <w:r>
+              <w:rPr>
+                <w:rFonts w:ascii="Calibri" w:eastAsia="Calibri" w:hAnsi="Calibri" w:cs="Calibri"/>
+                <w:b/>
+                <w:bCs/>
+                <w:color w:val="1F4E79" w:themeColor="accent5" w:themeShade="80"/>
+                <w:sz w:val="22"/>
+                <w:szCs w:val="22"/>
+              </w:rPr>
+              <w:t>Integración de Servicios Externos</w:t>
+            </w:r>
+            <w:r>
+              <w:rPr>
+                <w:rFonts w:ascii="Calibri" w:eastAsia="Calibri" w:hAnsi="Calibri" w:cs="Calibri"/>
+                <w:color w:val="1F4E79" w:themeColor="accent5" w:themeShade="80"/>
+                <w:sz w:val="22"/>
+                <w:szCs w:val="22"/>
+              </w:rPr>
+              <w:t>: Implementación del escaneo facial y Mapas.</w:t>
+            </w:r>
+          </w:p>
+          <w:p>
+            <w:pPr>
+              <w:pStyle w:val="Piedepgina"/>
+              <w:numPr>
+                <w:ilvl w:val="0"/>
+                <w:numId w:val="11"/>
+              </w:numPr>
+              <w:rPr>
+                <w:rFonts w:ascii="Calibri" w:eastAsia="Calibri" w:hAnsi="Calibri" w:cs="Calibri"/>
+                <w:color w:val="1F4E79" w:themeColor="accent5" w:themeShade="80"/>
+                <w:sz w:val="22"/>
+                <w:szCs w:val="22"/>
+              </w:rPr>
+            </w:pPr>
+            <w:r>
+              <w:rPr>
+                <w:rFonts w:ascii="Calibri" w:eastAsia="Calibri" w:hAnsi="Calibri" w:cs="Calibri"/>
+                <w:b/>
+                <w:bCs/>
+                <w:color w:val="1F4E79" w:themeColor="accent5" w:themeShade="80"/>
+                <w:sz w:val="22"/>
+                <w:szCs w:val="22"/>
+              </w:rPr>
+              <w:t>Pruebas y QA</w:t>
+            </w:r>
+            <w:r>
+              <w:rPr>
+                <w:rFonts w:ascii="Calibri" w:eastAsia="Calibri" w:hAnsi="Calibri" w:cs="Calibri"/>
+                <w:color w:val="1F4E79" w:themeColor="accent5" w:themeShade="80"/>
+                <w:sz w:val="22"/>
+                <w:szCs w:val="22"/>
+              </w:rPr>
+              <w:t xml:space="preserve">: Pruebas unitarias con librerías estándar para </w:t>
+            </w:r>
+            <w:proofErr w:type="spellStart"/>
+            <w:r>
+              <w:rPr>
+                <w:rFonts w:ascii="Calibri" w:eastAsia="Calibri" w:hAnsi="Calibri" w:cs="Calibri"/>
+                <w:color w:val="1F4E79" w:themeColor="accent5" w:themeShade="80"/>
+                <w:sz w:val="22"/>
+                <w:szCs w:val="22"/>
+              </w:rPr>
+              <w:t>React</w:t>
+            </w:r>
+            <w:proofErr w:type="spellEnd"/>
+            <w:r>
+              <w:rPr>
+                <w:rFonts w:ascii="Calibri" w:eastAsia="Calibri" w:hAnsi="Calibri" w:cs="Calibri"/>
+                <w:color w:val="1F4E79" w:themeColor="accent5" w:themeShade="80"/>
+                <w:sz w:val="22"/>
+                <w:szCs w:val="22"/>
+              </w:rPr>
+              <w:t xml:space="preserve"> Native/JS.</w:t>
+            </w:r>
+          </w:p>
+          <w:p>
+            <w:pPr>
+              <w:pStyle w:val="Piedepgina"/>
+              <w:numPr>
+                <w:ilvl w:val="0"/>
+                <w:numId w:val="11"/>
+              </w:numPr>
+              <w:rPr>
+                <w:rFonts w:ascii="Calibri" w:eastAsia="Calibri" w:hAnsi="Calibri" w:cs="Calibri"/>
+                <w:color w:val="1F4E79" w:themeColor="accent5" w:themeShade="80"/>
+                <w:sz w:val="22"/>
+                <w:szCs w:val="22"/>
+              </w:rPr>
+            </w:pPr>
+            <w:r>
+              <w:rPr>
+                <w:rFonts w:ascii="Calibri" w:eastAsia="Calibri" w:hAnsi="Calibri" w:cs="Calibri"/>
+                <w:b/>
+                <w:bCs/>
+                <w:color w:val="1F4E79" w:themeColor="accent5" w:themeShade="80"/>
+                <w:sz w:val="22"/>
+                <w:szCs w:val="22"/>
+              </w:rPr>
+              <w:t>Cierre y Validación</w:t>
+            </w:r>
+            <w:r>
+              <w:rPr>
+                <w:rFonts w:ascii="Calibri" w:eastAsia="Calibri" w:hAnsi="Calibri" w:cs="Calibri"/>
+                <w:color w:val="1F4E79" w:themeColor="accent5" w:themeShade="80"/>
+                <w:sz w:val="22"/>
+                <w:szCs w:val="22"/>
+              </w:rPr>
+              <w:t>: Pruebas de usuario final y despliegue inicial.</w:t>
             </w:r>
           </w:p>
           <w:p>
@@ -5171,7 +5838,31 @@
                 <w:sz w:val="22"/>
                 <w:szCs w:val="22"/>
               </w:rPr>
-              <w:t>Nombre de  Actividades/Tareas</w:t>
+              <w:t xml:space="preserve">Nombre </w:t>
+            </w:r>
+            <w:proofErr w:type="gramStart"/>
+            <w:r>
+              <w:rPr>
+                <w:rFonts w:ascii="Calibri" w:eastAsia="Calibri" w:hAnsi="Calibri" w:cs="Calibri"/>
+                <w:b/>
+                <w:bCs/>
+                <w:color w:val="1F4E79" w:themeColor="accent5" w:themeShade="80"/>
+                <w:sz w:val="22"/>
+                <w:szCs w:val="22"/>
+              </w:rPr>
+              <w:t>de  Actividades</w:t>
+            </w:r>
+            <w:proofErr w:type="gramEnd"/>
+            <w:r>
+              <w:rPr>
+                <w:rFonts w:ascii="Calibri" w:eastAsia="Calibri" w:hAnsi="Calibri" w:cs="Calibri"/>
+                <w:b/>
+                <w:bCs/>
+                <w:color w:val="1F4E79" w:themeColor="accent5" w:themeShade="80"/>
+                <w:sz w:val="22"/>
+                <w:szCs w:val="22"/>
+              </w:rPr>
+              <w:t>/Tareas</w:t>
             </w:r>
           </w:p>
         </w:tc>
@@ -6173,7 +6864,47 @@
                 <w:sz w:val="22"/>
                 <w:szCs w:val="22"/>
               </w:rPr>
-              <w:t>Declarar las evidencias a diseñar para el proyecto. Estas evidencias deben ser acordadas con el docente, dependiendo de la dimensión del proyecto. Todas las evidencias deben estar en formato .pdf, .xls, .xlsx, .doc o .docx, según corresponda y deben ser legibles para el docente.</w:t>
+              <w:t>Declarar las evidencias a diseñar para el proyecto. Estas evidencias deben ser acordadas con el docente, dependiendo de la dimensión del proyecto. Todas las evidencias deben estar en formato .</w:t>
+            </w:r>
+            <w:proofErr w:type="spellStart"/>
+            <w:r>
+              <w:rPr>
+                <w:rFonts w:ascii="Calibri" w:eastAsia="Calibri" w:hAnsi="Calibri" w:cs="Calibri"/>
+                <w:color w:val="1F4E79" w:themeColor="accent5" w:themeShade="80"/>
+                <w:sz w:val="22"/>
+                <w:szCs w:val="22"/>
+              </w:rPr>
+              <w:t>pdf</w:t>
+            </w:r>
+            <w:proofErr w:type="spellEnd"/>
+            <w:r>
+              <w:rPr>
+                <w:rFonts w:ascii="Calibri" w:eastAsia="Calibri" w:hAnsi="Calibri" w:cs="Calibri"/>
+                <w:color w:val="1F4E79" w:themeColor="accent5" w:themeShade="80"/>
+                <w:sz w:val="22"/>
+                <w:szCs w:val="22"/>
+              </w:rPr>
+              <w:t>, .xls, .xlsx, .</w:t>
+            </w:r>
+            <w:proofErr w:type="spellStart"/>
+            <w:r>
+              <w:rPr>
+                <w:rFonts w:ascii="Calibri" w:eastAsia="Calibri" w:hAnsi="Calibri" w:cs="Calibri"/>
+                <w:color w:val="1F4E79" w:themeColor="accent5" w:themeShade="80"/>
+                <w:sz w:val="22"/>
+                <w:szCs w:val="22"/>
+              </w:rPr>
+              <w:t>doc</w:t>
+            </w:r>
+            <w:proofErr w:type="spellEnd"/>
+            <w:r>
+              <w:rPr>
+                <w:rFonts w:ascii="Calibri" w:eastAsia="Calibri" w:hAnsi="Calibri" w:cs="Calibri"/>
+                <w:color w:val="1F4E79" w:themeColor="accent5" w:themeShade="80"/>
+                <w:sz w:val="22"/>
+                <w:szCs w:val="22"/>
+              </w:rPr>
+              <w:t xml:space="preserve"> o .docx, según corresponda y deben ser legibles para el docente.</w:t>
             </w:r>
           </w:p>
         </w:tc>
@@ -6461,35 +7192,9 @@
                 <w:sz w:val="18"/>
                 <w:szCs w:val="18"/>
               </w:rPr>
-              <w:t>Describir tipo de información que entregará esta evidencia. Ej: Planificación, MER, Caso de uso, etc</w:t>
-            </w:r>
-          </w:p>
-        </w:tc>
-        <w:tc>
-          <w:tcPr>
-            <w:tcW w:w="2413" w:type="dxa"/>
-            <w:tcBorders>
-              <w:top w:val="single" w:sz="6" w:space="0" w:color="BFBFBF" w:themeColor="background1" w:themeShade="BF"/>
-              <w:left w:val="single" w:sz="6" w:space="0" w:color="BFBFBF" w:themeColor="background1" w:themeShade="BF"/>
-              <w:bottom w:val="single" w:sz="6" w:space="0" w:color="BFBFBF" w:themeColor="background1" w:themeShade="BF"/>
-              <w:right w:val="single" w:sz="6" w:space="0" w:color="BFBFBF" w:themeColor="background1" w:themeShade="BF"/>
-            </w:tcBorders>
-            <w:tcMar>
-              <w:left w:w="105" w:type="dxa"/>
-              <w:right w:w="105" w:type="dxa"/>
-            </w:tcMar>
-          </w:tcPr>
-          <w:p>
-            <w:pPr>
-              <w:pStyle w:val="Piedepgina"/>
-              <w:jc w:val="both"/>
-              <w:rPr>
-                <w:rFonts w:ascii="Calibri" w:eastAsia="Calibri" w:hAnsi="Calibri" w:cs="Calibri"/>
-                <w:color w:val="5B9BD5" w:themeColor="accent5"/>
-                <w:sz w:val="18"/>
-                <w:szCs w:val="18"/>
-              </w:rPr>
-            </w:pPr>
+              <w:t xml:space="preserve">Describir tipo de información que entregará esta evidencia. </w:t>
+            </w:r>
+            <w:proofErr w:type="spellStart"/>
             <w:r>
               <w:rPr>
                 <w:rFonts w:ascii="Calibri" w:eastAsia="Calibri" w:hAnsi="Calibri" w:cs="Calibri"/>
@@ -6499,6 +7204,69 @@
                 <w:sz w:val="18"/>
                 <w:szCs w:val="18"/>
               </w:rPr>
+              <w:t>Ej</w:t>
+            </w:r>
+            <w:proofErr w:type="spellEnd"/>
+            <w:r>
+              <w:rPr>
+                <w:rFonts w:ascii="Calibri" w:eastAsia="Calibri" w:hAnsi="Calibri" w:cs="Calibri"/>
+                <w:i/>
+                <w:iCs/>
+                <w:color w:val="5B9BD5" w:themeColor="accent5"/>
+                <w:sz w:val="18"/>
+                <w:szCs w:val="18"/>
+              </w:rPr>
+              <w:t xml:space="preserve">: Planificación, MER, Caso de uso, </w:t>
+            </w:r>
+            <w:proofErr w:type="spellStart"/>
+            <w:r>
+              <w:rPr>
+                <w:rFonts w:ascii="Calibri" w:eastAsia="Calibri" w:hAnsi="Calibri" w:cs="Calibri"/>
+                <w:i/>
+                <w:iCs/>
+                <w:color w:val="5B9BD5" w:themeColor="accent5"/>
+                <w:sz w:val="18"/>
+                <w:szCs w:val="18"/>
+              </w:rPr>
+              <w:t>etc</w:t>
+            </w:r>
+            <w:proofErr w:type="spellEnd"/>
+          </w:p>
+        </w:tc>
+        <w:tc>
+          <w:tcPr>
+            <w:tcW w:w="2413" w:type="dxa"/>
+            <w:tcBorders>
+              <w:top w:val="single" w:sz="6" w:space="0" w:color="BFBFBF" w:themeColor="background1" w:themeShade="BF"/>
+              <w:left w:val="single" w:sz="6" w:space="0" w:color="BFBFBF" w:themeColor="background1" w:themeShade="BF"/>
+              <w:bottom w:val="single" w:sz="6" w:space="0" w:color="BFBFBF" w:themeColor="background1" w:themeShade="BF"/>
+              <w:right w:val="single" w:sz="6" w:space="0" w:color="BFBFBF" w:themeColor="background1" w:themeShade="BF"/>
+            </w:tcBorders>
+            <w:tcMar>
+              <w:left w:w="105" w:type="dxa"/>
+              <w:right w:w="105" w:type="dxa"/>
+            </w:tcMar>
+          </w:tcPr>
+          <w:p>
+            <w:pPr>
+              <w:pStyle w:val="Piedepgina"/>
+              <w:jc w:val="both"/>
+              <w:rPr>
+                <w:rFonts w:ascii="Calibri" w:eastAsia="Calibri" w:hAnsi="Calibri" w:cs="Calibri"/>
+                <w:color w:val="5B9BD5" w:themeColor="accent5"/>
+                <w:sz w:val="18"/>
+                <w:szCs w:val="18"/>
+              </w:rPr>
+            </w:pPr>
+            <w:r>
+              <w:rPr>
+                <w:rFonts w:ascii="Calibri" w:eastAsia="Calibri" w:hAnsi="Calibri" w:cs="Calibri"/>
+                <w:i/>
+                <w:iCs/>
+                <w:color w:val="5B9BD5" w:themeColor="accent5"/>
+                <w:sz w:val="18"/>
+                <w:szCs w:val="18"/>
+              </w:rPr>
               <w:t>Describir de forma sencilla la información que tendrá el documento.</w:t>
             </w:r>
           </w:p>
@@ -6986,6 +7754,7 @@
                 <w:sz w:val="18"/>
                 <w:szCs w:val="18"/>
               </w:rPr>
+              <w:lastRenderedPageBreak/>
               <w:t>5</w:t>
             </w:r>
           </w:p>
@@ -8297,7 +9066,6 @@
                 <w:sz w:val="16"/>
                 <w:szCs w:val="16"/>
               </w:rPr>
-              <w:lastRenderedPageBreak/>
               <w:t>Describe actividades del punto anterior</w:t>
             </w:r>
           </w:p>
@@ -10024,7 +10792,7 @@
 </file>
 
 <file path=word/endnotes.xml><?xml version="1.0" encoding="utf-8"?>
-<w:endnotes xmlns:wpc="http://schemas.microsoft.com/office/word/2010/wordprocessingCanvas" xmlns:cx="http://schemas.microsoft.com/office/drawing/2014/chartex" xmlns:cx1="http://schemas.microsoft.com/office/drawing/2015/9/8/chartex" xmlns:cx2="http://schemas.microsoft.com/office/drawing/2015/10/21/chartex" xmlns:cx3="http://schemas.microsoft.com/office/drawing/2016/5/9/chartex" xmlns:cx4="http://schemas.microsoft.com/office/drawing/2016/5/10/chartex" xmlns:cx5="http://schemas.microsoft.com/office/drawing/2016/5/11/chartex" xmlns:cx6="http://schemas.microsoft.com/office/drawing/2016/5/12/chartex" xmlns:cx7="http://schemas.microsoft.com/office/drawing/2016/5/13/chartex" xmlns:cx8="http://schemas.microsoft.com/office/drawing/2016/5/14/chartex" xmlns:mc="http://schemas.openxmlformats.org/markup-compatibility/2006" xmlns:aink="http://schemas.microsoft.com/office/drawing/2016/ink" xmlns:am3d="http://schemas.microsoft.com/office/drawing/2017/model3d" xmlns:o="urn:schemas-microsoft-com:office:office" xmlns:oel="http://schemas.microsoft.com/office/2019/extlst" xmlns:r="http://schemas.openxmlformats.org/officeDocument/2006/relationships" xmlns:m="http://schemas.openxmlformats.org/officeDocument/2006/math" xmlns:v="urn:schemas-microsoft-com:vml" xmlns:wp14="http://schemas.microsoft.com/office/word/2010/wordprocessingDrawing" xmlns:wp="http://schemas.openxmlformats.org/drawingml/2006/wordprocessingDrawing" xmlns:w10="urn:schemas-microsoft-com:office:word" xmlns:w="http://schemas.openxmlformats.org/wordprocessingml/2006/main" xmlns:w14="http://schemas.microsoft.com/office/word/2010/wordml" xmlns:w15="http://schemas.microsoft.com/office/word/2012/wordml" xmlns:w16cex="http://schemas.microsoft.com/office/word/2018/wordml/cex" xmlns:w16cid="http://schemas.microsoft.com/office/word/2016/wordml/cid" xmlns:w16="http://schemas.microsoft.com/office/word/2018/wordml" xmlns:w16du="http://schemas.microsoft.com/office/word/2023/wordml/word16du" xmlns:w16sdtdh="http://schemas.microsoft.com/office/word/2020/wordml/sdtdatahash" xmlns:w16sdtfl="http://schemas.microsoft.com/office/word/2024/wordml/sdtformatlock" xmlns:w16se="http://schemas.microsoft.com/office/word/2015/wordml/symex" xmlns:wpg="http://schemas.microsoft.com/office/word/2010/wordprocessingGroup" xmlns:wpi="http://schemas.microsoft.com/office/word/2010/wordprocessingInk" xmlns:wne="http://schemas.microsoft.com/office/word/2006/wordml" xmlns:wps="http://schemas.microsoft.com/office/word/2010/wordprocessingShape" mc:Ignorable="w14 w15 w16se w16cid w16 w16cex w16sdtdh w16sdtfl w16du wp14">
+<w:endnotes xmlns:wpc="http://schemas.microsoft.com/office/word/2010/wordprocessingCanvas" xmlns:cx="http://schemas.microsoft.com/office/drawing/2014/chartex" xmlns:cx1="http://schemas.microsoft.com/office/drawing/2015/9/8/chartex" xmlns:cx2="http://schemas.microsoft.com/office/drawing/2015/10/21/chartex" xmlns:cx3="http://schemas.microsoft.com/office/drawing/2016/5/9/chartex" xmlns:cx4="http://schemas.microsoft.com/office/drawing/2016/5/10/chartex" xmlns:cx5="http://schemas.microsoft.com/office/drawing/2016/5/11/chartex" xmlns:cx6="http://schemas.microsoft.com/office/drawing/2016/5/12/chartex" xmlns:cx7="http://schemas.microsoft.com/office/drawing/2016/5/13/chartex" xmlns:cx8="http://schemas.microsoft.com/office/drawing/2016/5/14/chartex" xmlns:mc="http://schemas.openxmlformats.org/markup-compatibility/2006" xmlns:aink="http://schemas.microsoft.com/office/drawing/2016/ink" xmlns:am3d="http://schemas.microsoft.com/office/drawing/2017/model3d" xmlns:o="urn:schemas-microsoft-com:office:office" xmlns:r="http://schemas.openxmlformats.org/officeDocument/2006/relationships" xmlns:m="http://schemas.openxmlformats.org/officeDocument/2006/math" xmlns:v="urn:schemas-microsoft-com:vml" xmlns:wp14="http://schemas.microsoft.com/office/word/2010/wordprocessingDrawing" xmlns:wp="http://schemas.openxmlformats.org/drawingml/2006/wordprocessingDrawing" xmlns:w10="urn:schemas-microsoft-com:office:word" xmlns:w="http://schemas.openxmlformats.org/wordprocessingml/2006/main" xmlns:w14="http://schemas.microsoft.com/office/word/2010/wordml" xmlns:w15="http://schemas.microsoft.com/office/word/2012/wordml" xmlns:w16cex="http://schemas.microsoft.com/office/word/2018/wordml/cex" xmlns:w16cid="http://schemas.microsoft.com/office/word/2016/wordml/cid" xmlns:w16="http://schemas.microsoft.com/office/word/2018/wordml" xmlns:w16sdtdh="http://schemas.microsoft.com/office/word/2020/wordml/sdtdatahash" xmlns:w16se="http://schemas.microsoft.com/office/word/2015/wordml/symex" xmlns:wpg="http://schemas.microsoft.com/office/word/2010/wordprocessingGroup" xmlns:wpi="http://schemas.microsoft.com/office/word/2010/wordprocessingInk" xmlns:wne="http://schemas.microsoft.com/office/word/2006/wordml" xmlns:wps="http://schemas.microsoft.com/office/word/2010/wordprocessingShape" mc:Ignorable="w14 w15 w16se w16cid w16 w16cex w16sdtdh wp14">
   <w:endnote w:type="separator" w:id="-1">
     <w:p>
       <w:r>
@@ -10046,7 +10814,7 @@
 </file>
 
 <file path=word/footer1.xml><?xml version="1.0" encoding="utf-8"?>
-<w:ftr xmlns:wpc="http://schemas.microsoft.com/office/word/2010/wordprocessingCanvas" xmlns:cx="http://schemas.microsoft.com/office/drawing/2014/chartex" xmlns:cx1="http://schemas.microsoft.com/office/drawing/2015/9/8/chartex" xmlns:cx2="http://schemas.microsoft.com/office/drawing/2015/10/21/chartex" xmlns:cx3="http://schemas.microsoft.com/office/drawing/2016/5/9/chartex" xmlns:cx4="http://schemas.microsoft.com/office/drawing/2016/5/10/chartex" xmlns:cx5="http://schemas.microsoft.com/office/drawing/2016/5/11/chartex" xmlns:cx6="http://schemas.microsoft.com/office/drawing/2016/5/12/chartex" xmlns:cx7="http://schemas.microsoft.com/office/drawing/2016/5/13/chartex" xmlns:cx8="http://schemas.microsoft.com/office/drawing/2016/5/14/chartex" xmlns:mc="http://schemas.openxmlformats.org/markup-compatibility/2006" xmlns:aink="http://schemas.microsoft.com/office/drawing/2016/ink" xmlns:am3d="http://schemas.microsoft.com/office/drawing/2017/model3d" xmlns:o="urn:schemas-microsoft-com:office:office" xmlns:oel="http://schemas.microsoft.com/office/2019/extlst" xmlns:r="http://schemas.openxmlformats.org/officeDocument/2006/relationships" xmlns:m="http://schemas.openxmlformats.org/officeDocument/2006/math" xmlns:v="urn:schemas-microsoft-com:vml" xmlns:wp14="http://schemas.microsoft.com/office/word/2010/wordprocessingDrawing" xmlns:wp="http://schemas.openxmlformats.org/drawingml/2006/wordprocessingDrawing" xmlns:w10="urn:schemas-microsoft-com:office:word" xmlns:w="http://schemas.openxmlformats.org/wordprocessingml/2006/main" xmlns:w14="http://schemas.microsoft.com/office/word/2010/wordml" xmlns:w15="http://schemas.microsoft.com/office/word/2012/wordml" xmlns:w16cex="http://schemas.microsoft.com/office/word/2018/wordml/cex" xmlns:w16cid="http://schemas.microsoft.com/office/word/2016/wordml/cid" xmlns:w16="http://schemas.microsoft.com/office/word/2018/wordml" xmlns:w16du="http://schemas.microsoft.com/office/word/2023/wordml/word16du" xmlns:w16sdtdh="http://schemas.microsoft.com/office/word/2020/wordml/sdtdatahash" xmlns:w16sdtfl="http://schemas.microsoft.com/office/word/2024/wordml/sdtformatlock" xmlns:w16se="http://schemas.microsoft.com/office/word/2015/wordml/symex" xmlns:wpg="http://schemas.microsoft.com/office/word/2010/wordprocessingGroup" xmlns:wpi="http://schemas.microsoft.com/office/word/2010/wordprocessingInk" xmlns:wne="http://schemas.microsoft.com/office/word/2006/wordml" xmlns:wps="http://schemas.microsoft.com/office/word/2010/wordprocessingShape" mc:Ignorable="w14 w15 w16se w16cid w16 w16cex w16sdtdh w16sdtfl w16du wp14">
+<w:ftr xmlns:wpc="http://schemas.microsoft.com/office/word/2010/wordprocessingCanvas" xmlns:cx="http://schemas.microsoft.com/office/drawing/2014/chartex" xmlns:cx1="http://schemas.microsoft.com/office/drawing/2015/9/8/chartex" xmlns:cx2="http://schemas.microsoft.com/office/drawing/2015/10/21/chartex" xmlns:cx3="http://schemas.microsoft.com/office/drawing/2016/5/9/chartex" xmlns:cx4="http://schemas.microsoft.com/office/drawing/2016/5/10/chartex" xmlns:cx5="http://schemas.microsoft.com/office/drawing/2016/5/11/chartex" xmlns:cx6="http://schemas.microsoft.com/office/drawing/2016/5/12/chartex" xmlns:cx7="http://schemas.microsoft.com/office/drawing/2016/5/13/chartex" xmlns:cx8="http://schemas.microsoft.com/office/drawing/2016/5/14/chartex" xmlns:mc="http://schemas.openxmlformats.org/markup-compatibility/2006" xmlns:aink="http://schemas.microsoft.com/office/drawing/2016/ink" xmlns:am3d="http://schemas.microsoft.com/office/drawing/2017/model3d" xmlns:o="urn:schemas-microsoft-com:office:office" xmlns:r="http://schemas.openxmlformats.org/officeDocument/2006/relationships" xmlns:m="http://schemas.openxmlformats.org/officeDocument/2006/math" xmlns:v="urn:schemas-microsoft-com:vml" xmlns:wp14="http://schemas.microsoft.com/office/word/2010/wordprocessingDrawing" xmlns:wp="http://schemas.openxmlformats.org/drawingml/2006/wordprocessingDrawing" xmlns:w10="urn:schemas-microsoft-com:office:word" xmlns:w="http://schemas.openxmlformats.org/wordprocessingml/2006/main" xmlns:w14="http://schemas.microsoft.com/office/word/2010/wordml" xmlns:w15="http://schemas.microsoft.com/office/word/2012/wordml" xmlns:w16cex="http://schemas.microsoft.com/office/word/2018/wordml/cex" xmlns:w16cid="http://schemas.microsoft.com/office/word/2016/wordml/cid" xmlns:w16="http://schemas.microsoft.com/office/word/2018/wordml" xmlns:w16sdtdh="http://schemas.microsoft.com/office/word/2020/wordml/sdtdatahash" xmlns:w16se="http://schemas.microsoft.com/office/word/2015/wordml/symex" xmlns:wpg="http://schemas.microsoft.com/office/word/2010/wordprocessingGroup" xmlns:wpi="http://schemas.microsoft.com/office/word/2010/wordprocessingInk" xmlns:wne="http://schemas.microsoft.com/office/word/2006/wordml" xmlns:wps="http://schemas.microsoft.com/office/word/2010/wordprocessingShape" mc:Ignorable="w14 w15 w16se w16cid w16 w16cex w16sdtdh wp14">
   <w:p>
     <w:pPr>
       <w:pStyle w:val="Textoindependiente"/>
@@ -10228,7 +10996,7 @@
 </file>
 
 <file path=word/footnotes.xml><?xml version="1.0" encoding="utf-8"?>
-<w:footnotes xmlns:wpc="http://schemas.microsoft.com/office/word/2010/wordprocessingCanvas" xmlns:cx="http://schemas.microsoft.com/office/drawing/2014/chartex" xmlns:cx1="http://schemas.microsoft.com/office/drawing/2015/9/8/chartex" xmlns:cx2="http://schemas.microsoft.com/office/drawing/2015/10/21/chartex" xmlns:cx3="http://schemas.microsoft.com/office/drawing/2016/5/9/chartex" xmlns:cx4="http://schemas.microsoft.com/office/drawing/2016/5/10/chartex" xmlns:cx5="http://schemas.microsoft.com/office/drawing/2016/5/11/chartex" xmlns:cx6="http://schemas.microsoft.com/office/drawing/2016/5/12/chartex" xmlns:cx7="http://schemas.microsoft.com/office/drawing/2016/5/13/chartex" xmlns:cx8="http://schemas.microsoft.com/office/drawing/2016/5/14/chartex" xmlns:mc="http://schemas.openxmlformats.org/markup-compatibility/2006" xmlns:aink="http://schemas.microsoft.com/office/drawing/2016/ink" xmlns:am3d="http://schemas.microsoft.com/office/drawing/2017/model3d" xmlns:o="urn:schemas-microsoft-com:office:office" xmlns:oel="http://schemas.microsoft.com/office/2019/extlst" xmlns:r="http://schemas.openxmlformats.org/officeDocument/2006/relationships" xmlns:m="http://schemas.openxmlformats.org/officeDocument/2006/math" xmlns:v="urn:schemas-microsoft-com:vml" xmlns:wp14="http://schemas.microsoft.com/office/word/2010/wordprocessingDrawing" xmlns:wp="http://schemas.openxmlformats.org/drawingml/2006/wordprocessingDrawing" xmlns:w10="urn:schemas-microsoft-com:office:word" xmlns:w="http://schemas.openxmlformats.org/wordprocessingml/2006/main" xmlns:w14="http://schemas.microsoft.com/office/word/2010/wordml" xmlns:w15="http://schemas.microsoft.com/office/word/2012/wordml" xmlns:w16cex="http://schemas.microsoft.com/office/word/2018/wordml/cex" xmlns:w16cid="http://schemas.microsoft.com/office/word/2016/wordml/cid" xmlns:w16="http://schemas.microsoft.com/office/word/2018/wordml" xmlns:w16du="http://schemas.microsoft.com/office/word/2023/wordml/word16du" xmlns:w16sdtdh="http://schemas.microsoft.com/office/word/2020/wordml/sdtdatahash" xmlns:w16sdtfl="http://schemas.microsoft.com/office/word/2024/wordml/sdtformatlock" xmlns:w16se="http://schemas.microsoft.com/office/word/2015/wordml/symex" xmlns:wpg="http://schemas.microsoft.com/office/word/2010/wordprocessingGroup" xmlns:wpi="http://schemas.microsoft.com/office/word/2010/wordprocessingInk" xmlns:wne="http://schemas.microsoft.com/office/word/2006/wordml" xmlns:wps="http://schemas.microsoft.com/office/word/2010/wordprocessingShape" mc:Ignorable="w14 w15 w16se w16cid w16 w16cex w16sdtdh w16sdtfl w16du wp14">
+<w:footnotes xmlns:wpc="http://schemas.microsoft.com/office/word/2010/wordprocessingCanvas" xmlns:cx="http://schemas.microsoft.com/office/drawing/2014/chartex" xmlns:cx1="http://schemas.microsoft.com/office/drawing/2015/9/8/chartex" xmlns:cx2="http://schemas.microsoft.com/office/drawing/2015/10/21/chartex" xmlns:cx3="http://schemas.microsoft.com/office/drawing/2016/5/9/chartex" xmlns:cx4="http://schemas.microsoft.com/office/drawing/2016/5/10/chartex" xmlns:cx5="http://schemas.microsoft.com/office/drawing/2016/5/11/chartex" xmlns:cx6="http://schemas.microsoft.com/office/drawing/2016/5/12/chartex" xmlns:cx7="http://schemas.microsoft.com/office/drawing/2016/5/13/chartex" xmlns:cx8="http://schemas.microsoft.com/office/drawing/2016/5/14/chartex" xmlns:mc="http://schemas.openxmlformats.org/markup-compatibility/2006" xmlns:aink="http://schemas.microsoft.com/office/drawing/2016/ink" xmlns:am3d="http://schemas.microsoft.com/office/drawing/2017/model3d" xmlns:o="urn:schemas-microsoft-com:office:office" xmlns:r="http://schemas.openxmlformats.org/officeDocument/2006/relationships" xmlns:m="http://schemas.openxmlformats.org/officeDocument/2006/math" xmlns:v="urn:schemas-microsoft-com:vml" xmlns:wp14="http://schemas.microsoft.com/office/word/2010/wordprocessingDrawing" xmlns:wp="http://schemas.openxmlformats.org/drawingml/2006/wordprocessingDrawing" xmlns:w10="urn:schemas-microsoft-com:office:word" xmlns:w="http://schemas.openxmlformats.org/wordprocessingml/2006/main" xmlns:w14="http://schemas.microsoft.com/office/word/2010/wordml" xmlns:w15="http://schemas.microsoft.com/office/word/2012/wordml" xmlns:w16cex="http://schemas.microsoft.com/office/word/2018/wordml/cex" xmlns:w16cid="http://schemas.microsoft.com/office/word/2016/wordml/cid" xmlns:w16="http://schemas.microsoft.com/office/word/2018/wordml" xmlns:w16sdtdh="http://schemas.microsoft.com/office/word/2020/wordml/sdtdatahash" xmlns:w16se="http://schemas.microsoft.com/office/word/2015/wordml/symex" xmlns:wpg="http://schemas.microsoft.com/office/word/2010/wordprocessingGroup" xmlns:wpi="http://schemas.microsoft.com/office/word/2010/wordprocessingInk" xmlns:wne="http://schemas.microsoft.com/office/word/2006/wordml" xmlns:wps="http://schemas.microsoft.com/office/word/2010/wordprocessingShape" mc:Ignorable="w14 w15 w16se w16cid w16 w16cex w16sdtdh wp14">
   <w:footnote w:type="separator" w:id="-1">
     <w:p>
       <w:r>
@@ -10250,7 +11018,7 @@
 </file>
 
 <file path=word/header1.xml><?xml version="1.0" encoding="utf-8"?>
-<w:hdr xmlns:wpc="http://schemas.microsoft.com/office/word/2010/wordprocessingCanvas" xmlns:cx="http://schemas.microsoft.com/office/drawing/2014/chartex" xmlns:cx1="http://schemas.microsoft.com/office/drawing/2015/9/8/chartex" xmlns:cx2="http://schemas.microsoft.com/office/drawing/2015/10/21/chartex" xmlns:cx3="http://schemas.microsoft.com/office/drawing/2016/5/9/chartex" xmlns:cx4="http://schemas.microsoft.com/office/drawing/2016/5/10/chartex" xmlns:cx5="http://schemas.microsoft.com/office/drawing/2016/5/11/chartex" xmlns:cx6="http://schemas.microsoft.com/office/drawing/2016/5/12/chartex" xmlns:cx7="http://schemas.microsoft.com/office/drawing/2016/5/13/chartex" xmlns:cx8="http://schemas.microsoft.com/office/drawing/2016/5/14/chartex" xmlns:mc="http://schemas.openxmlformats.org/markup-compatibility/2006" xmlns:aink="http://schemas.microsoft.com/office/drawing/2016/ink" xmlns:am3d="http://schemas.microsoft.com/office/drawing/2017/model3d" xmlns:o="urn:schemas-microsoft-com:office:office" xmlns:oel="http://schemas.microsoft.com/office/2019/extlst" xmlns:r="http://schemas.openxmlformats.org/officeDocument/2006/relationships" xmlns:m="http://schemas.openxmlformats.org/officeDocument/2006/math" xmlns:v="urn:schemas-microsoft-com:vml" xmlns:wp14="http://schemas.microsoft.com/office/word/2010/wordprocessingDrawing" xmlns:wp="http://schemas.openxmlformats.org/drawingml/2006/wordprocessingDrawing" xmlns:w10="urn:schemas-microsoft-com:office:word" xmlns:w="http://schemas.openxmlformats.org/wordprocessingml/2006/main" xmlns:w14="http://schemas.microsoft.com/office/word/2010/wordml" xmlns:w15="http://schemas.microsoft.com/office/word/2012/wordml" xmlns:w16cex="http://schemas.microsoft.com/office/word/2018/wordml/cex" xmlns:w16cid="http://schemas.microsoft.com/office/word/2016/wordml/cid" xmlns:w16="http://schemas.microsoft.com/office/word/2018/wordml" xmlns:w16du="http://schemas.microsoft.com/office/word/2023/wordml/word16du" xmlns:w16sdtdh="http://schemas.microsoft.com/office/word/2020/wordml/sdtdatahash" xmlns:w16sdtfl="http://schemas.microsoft.com/office/word/2024/wordml/sdtformatlock" xmlns:w16se="http://schemas.microsoft.com/office/word/2015/wordml/symex" xmlns:wpg="http://schemas.microsoft.com/office/word/2010/wordprocessingGroup" xmlns:wpi="http://schemas.microsoft.com/office/word/2010/wordprocessingInk" xmlns:wne="http://schemas.microsoft.com/office/word/2006/wordml" xmlns:wps="http://schemas.microsoft.com/office/word/2010/wordprocessingShape" mc:Ignorable="w14 w15 w16se w16cid w16 w16cex w16sdtdh w16sdtfl w16du wp14">
+<w:hdr xmlns:wpc="http://schemas.microsoft.com/office/word/2010/wordprocessingCanvas" xmlns:cx="http://schemas.microsoft.com/office/drawing/2014/chartex" xmlns:cx1="http://schemas.microsoft.com/office/drawing/2015/9/8/chartex" xmlns:cx2="http://schemas.microsoft.com/office/drawing/2015/10/21/chartex" xmlns:cx3="http://schemas.microsoft.com/office/drawing/2016/5/9/chartex" xmlns:cx4="http://schemas.microsoft.com/office/drawing/2016/5/10/chartex" xmlns:cx5="http://schemas.microsoft.com/office/drawing/2016/5/11/chartex" xmlns:cx6="http://schemas.microsoft.com/office/drawing/2016/5/12/chartex" xmlns:cx7="http://schemas.microsoft.com/office/drawing/2016/5/13/chartex" xmlns:cx8="http://schemas.microsoft.com/office/drawing/2016/5/14/chartex" xmlns:mc="http://schemas.openxmlformats.org/markup-compatibility/2006" xmlns:aink="http://schemas.microsoft.com/office/drawing/2016/ink" xmlns:am3d="http://schemas.microsoft.com/office/drawing/2017/model3d" xmlns:o="urn:schemas-microsoft-com:office:office" xmlns:r="http://schemas.openxmlformats.org/officeDocument/2006/relationships" xmlns:m="http://schemas.openxmlformats.org/officeDocument/2006/math" xmlns:v="urn:schemas-microsoft-com:vml" xmlns:wp14="http://schemas.microsoft.com/office/word/2010/wordprocessingDrawing" xmlns:wp="http://schemas.openxmlformats.org/drawingml/2006/wordprocessingDrawing" xmlns:w10="urn:schemas-microsoft-com:office:word" xmlns:w="http://schemas.openxmlformats.org/wordprocessingml/2006/main" xmlns:w14="http://schemas.microsoft.com/office/word/2010/wordml" xmlns:w15="http://schemas.microsoft.com/office/word/2012/wordml" xmlns:w16cex="http://schemas.microsoft.com/office/word/2018/wordml/cex" xmlns:w16cid="http://schemas.microsoft.com/office/word/2016/wordml/cid" xmlns:w16="http://schemas.microsoft.com/office/word/2018/wordml" xmlns:w16sdtdh="http://schemas.microsoft.com/office/word/2020/wordml/sdtdatahash" xmlns:w16se="http://schemas.microsoft.com/office/word/2015/wordml/symex" xmlns:wpg="http://schemas.microsoft.com/office/word/2010/wordprocessingGroup" xmlns:wpi="http://schemas.microsoft.com/office/word/2010/wordprocessingInk" xmlns:wne="http://schemas.microsoft.com/office/word/2006/wordml" xmlns:wps="http://schemas.microsoft.com/office/word/2010/wordprocessingShape" mc:Ignorable="w14 w15 w16se w16cid w16 w16cex w16sdtdh wp14">
   <w:p>
     <w:pPr>
       <w:pStyle w:val="Encabezado"/>
@@ -10388,7 +11156,7 @@
 </file>
 
 <file path=word/numbering.xml><?xml version="1.0" encoding="utf-8"?>
-<w:numbering xmlns:wpc="http://schemas.microsoft.com/office/word/2010/wordprocessingCanvas" xmlns:cx="http://schemas.microsoft.com/office/drawing/2014/chartex" xmlns:cx1="http://schemas.microsoft.com/office/drawing/2015/9/8/chartex" xmlns:cx2="http://schemas.microsoft.com/office/drawing/2015/10/21/chartex" xmlns:cx3="http://schemas.microsoft.com/office/drawing/2016/5/9/chartex" xmlns:cx4="http://schemas.microsoft.com/office/drawing/2016/5/10/chartex" xmlns:cx5="http://schemas.microsoft.com/office/drawing/2016/5/11/chartex" xmlns:cx6="http://schemas.microsoft.com/office/drawing/2016/5/12/chartex" xmlns:cx7="http://schemas.microsoft.com/office/drawing/2016/5/13/chartex" xmlns:cx8="http://schemas.microsoft.com/office/drawing/2016/5/14/chartex" xmlns:mc="http://schemas.openxmlformats.org/markup-compatibility/2006" xmlns:aink="http://schemas.microsoft.com/office/drawing/2016/ink" xmlns:am3d="http://schemas.microsoft.com/office/drawing/2017/model3d" xmlns:o="urn:schemas-microsoft-com:office:office" xmlns:oel="http://schemas.microsoft.com/office/2019/extlst" xmlns:r="http://schemas.openxmlformats.org/officeDocument/2006/relationships" xmlns:m="http://schemas.openxmlformats.org/officeDocument/2006/math" xmlns:v="urn:schemas-microsoft-com:vml" xmlns:wp14="http://schemas.microsoft.com/office/word/2010/wordprocessingDrawing" xmlns:wp="http://schemas.openxmlformats.org/drawingml/2006/wordprocessingDrawing" xmlns:w10="urn:schemas-microsoft-com:office:word" xmlns:w="http://schemas.openxmlformats.org/wordprocessingml/2006/main" xmlns:w14="http://schemas.microsoft.com/office/word/2010/wordml" xmlns:w15="http://schemas.microsoft.com/office/word/2012/wordml" xmlns:w16cex="http://schemas.microsoft.com/office/word/2018/wordml/cex" xmlns:w16cid="http://schemas.microsoft.com/office/word/2016/wordml/cid" xmlns:w16="http://schemas.microsoft.com/office/word/2018/wordml" xmlns:w16du="http://schemas.microsoft.com/office/word/2023/wordml/word16du" xmlns:w16sdtdh="http://schemas.microsoft.com/office/word/2020/wordml/sdtdatahash" xmlns:w16sdtfl="http://schemas.microsoft.com/office/word/2024/wordml/sdtformatlock" xmlns:w16se="http://schemas.microsoft.com/office/word/2015/wordml/symex" xmlns:wpg="http://schemas.microsoft.com/office/word/2010/wordprocessingGroup" xmlns:wpi="http://schemas.microsoft.com/office/word/2010/wordprocessingInk" xmlns:wne="http://schemas.microsoft.com/office/word/2006/wordml" xmlns:wps="http://schemas.microsoft.com/office/word/2010/wordprocessingShape" mc:Ignorable="w14 w15 w16se w16cid w16 w16cex w16sdtdh w16sdtfl w16du wp14">
+<w:numbering xmlns:wpc="http://schemas.microsoft.com/office/word/2010/wordprocessingCanvas" xmlns:cx="http://schemas.microsoft.com/office/drawing/2014/chartex" xmlns:cx1="http://schemas.microsoft.com/office/drawing/2015/9/8/chartex" xmlns:cx2="http://schemas.microsoft.com/office/drawing/2015/10/21/chartex" xmlns:cx3="http://schemas.microsoft.com/office/drawing/2016/5/9/chartex" xmlns:cx4="http://schemas.microsoft.com/office/drawing/2016/5/10/chartex" xmlns:cx5="http://schemas.microsoft.com/office/drawing/2016/5/11/chartex" xmlns:cx6="http://schemas.microsoft.com/office/drawing/2016/5/12/chartex" xmlns:cx7="http://schemas.microsoft.com/office/drawing/2016/5/13/chartex" xmlns:cx8="http://schemas.microsoft.com/office/drawing/2016/5/14/chartex" xmlns:mc="http://schemas.openxmlformats.org/markup-compatibility/2006" xmlns:aink="http://schemas.microsoft.com/office/drawing/2016/ink" xmlns:am3d="http://schemas.microsoft.com/office/drawing/2017/model3d" xmlns:o="urn:schemas-microsoft-com:office:office" xmlns:r="http://schemas.openxmlformats.org/officeDocument/2006/relationships" xmlns:m="http://schemas.openxmlformats.org/officeDocument/2006/math" xmlns:v="urn:schemas-microsoft-com:vml" xmlns:wp14="http://schemas.microsoft.com/office/word/2010/wordprocessingDrawing" xmlns:wp="http://schemas.openxmlformats.org/drawingml/2006/wordprocessingDrawing" xmlns:w10="urn:schemas-microsoft-com:office:word" xmlns:w="http://schemas.openxmlformats.org/wordprocessingml/2006/main" xmlns:w14="http://schemas.microsoft.com/office/word/2010/wordml" xmlns:w15="http://schemas.microsoft.com/office/word/2012/wordml" xmlns:w16cex="http://schemas.microsoft.com/office/word/2018/wordml/cex" xmlns:w16cid="http://schemas.microsoft.com/office/word/2016/wordml/cid" xmlns:w16="http://schemas.microsoft.com/office/word/2018/wordml" xmlns:w16sdtdh="http://schemas.microsoft.com/office/word/2020/wordml/sdtdatahash" xmlns:w16se="http://schemas.microsoft.com/office/word/2015/wordml/symex" xmlns:wpg="http://schemas.microsoft.com/office/word/2010/wordprocessingGroup" xmlns:wpi="http://schemas.microsoft.com/office/word/2010/wordprocessingInk" xmlns:wne="http://schemas.microsoft.com/office/word/2006/wordml" xmlns:wps="http://schemas.microsoft.com/office/word/2010/wordprocessingShape" mc:Ignorable="w14 w15 w16se w16cid w16 w16cex w16sdtdh wp14">
   <w:abstractNum w:abstractNumId="0" w15:restartNumberingAfterBreak="0">
     <w:nsid w:val="101F1C0A"/>
     <w:multiLevelType w:val="hybridMultilevel"/>
@@ -10562,6 +11330,92 @@
     </w:lvl>
   </w:abstractNum>
   <w:abstractNum w:abstractNumId="2" w15:restartNumberingAfterBreak="0">
+    <w:nsid w:val="25EE4316"/>
+    <w:multiLevelType w:val="hybridMultilevel"/>
+    <w:tmpl w:val="C0A4E704"/>
+    <w:lvl w:ilvl="0" w:tplc="340A000F">
+      <w:start w:val="1"/>
+      <w:numFmt w:val="decimal"/>
+      <w:lvlText w:val="%1."/>
+      <w:lvlJc w:val="left"/>
+      <w:pPr>
+        <w:ind w:left="720" w:hanging="360"/>
+      </w:pPr>
+    </w:lvl>
+    <w:lvl w:ilvl="1" w:tplc="340A0019" w:tentative="1">
+      <w:start w:val="1"/>
+      <w:numFmt w:val="lowerLetter"/>
+      <w:lvlText w:val="%2."/>
+      <w:lvlJc w:val="left"/>
+      <w:pPr>
+        <w:ind w:left="1440" w:hanging="360"/>
+      </w:pPr>
+    </w:lvl>
+    <w:lvl w:ilvl="2" w:tplc="340A001B" w:tentative="1">
+      <w:start w:val="1"/>
+      <w:numFmt w:val="lowerRoman"/>
+      <w:lvlText w:val="%3."/>
+      <w:lvlJc w:val="right"/>
+      <w:pPr>
+        <w:ind w:left="2160" w:hanging="180"/>
+      </w:pPr>
+    </w:lvl>
+    <w:lvl w:ilvl="3" w:tplc="340A000F" w:tentative="1">
+      <w:start w:val="1"/>
+      <w:numFmt w:val="decimal"/>
+      <w:lvlText w:val="%4."/>
+      <w:lvlJc w:val="left"/>
+      <w:pPr>
+        <w:ind w:left="2880" w:hanging="360"/>
+      </w:pPr>
+    </w:lvl>
+    <w:lvl w:ilvl="4" w:tplc="340A0019" w:tentative="1">
+      <w:start w:val="1"/>
+      <w:numFmt w:val="lowerLetter"/>
+      <w:lvlText w:val="%5."/>
+      <w:lvlJc w:val="left"/>
+      <w:pPr>
+        <w:ind w:left="3600" w:hanging="360"/>
+      </w:pPr>
+    </w:lvl>
+    <w:lvl w:ilvl="5" w:tplc="340A001B" w:tentative="1">
+      <w:start w:val="1"/>
+      <w:numFmt w:val="lowerRoman"/>
+      <w:lvlText w:val="%6."/>
+      <w:lvlJc w:val="right"/>
+      <w:pPr>
+        <w:ind w:left="4320" w:hanging="180"/>
+      </w:pPr>
+    </w:lvl>
+    <w:lvl w:ilvl="6" w:tplc="340A000F" w:tentative="1">
+      <w:start w:val="1"/>
+      <w:numFmt w:val="decimal"/>
+      <w:lvlText w:val="%7."/>
+      <w:lvlJc w:val="left"/>
+      <w:pPr>
+        <w:ind w:left="5040" w:hanging="360"/>
+      </w:pPr>
+    </w:lvl>
+    <w:lvl w:ilvl="7" w:tplc="340A0019" w:tentative="1">
+      <w:start w:val="1"/>
+      <w:numFmt w:val="lowerLetter"/>
+      <w:lvlText w:val="%8."/>
+      <w:lvlJc w:val="left"/>
+      <w:pPr>
+        <w:ind w:left="5760" w:hanging="360"/>
+      </w:pPr>
+    </w:lvl>
+    <w:lvl w:ilvl="8" w:tplc="340A001B" w:tentative="1">
+      <w:start w:val="1"/>
+      <w:numFmt w:val="lowerRoman"/>
+      <w:lvlText w:val="%9."/>
+      <w:lvlJc w:val="right"/>
+      <w:pPr>
+        <w:ind w:left="6480" w:hanging="180"/>
+      </w:pPr>
+    </w:lvl>
+  </w:abstractNum>
+  <w:abstractNum w:abstractNumId="3" w15:restartNumberingAfterBreak="0">
     <w:nsid w:val="29C77841"/>
     <w:multiLevelType w:val="hybridMultilevel"/>
     <w:tmpl w:val="D694A52A"/>
@@ -10650,7 +11504,7 @@
       </w:pPr>
     </w:lvl>
   </w:abstractNum>
-  <w:abstractNum w:abstractNumId="3" w15:restartNumberingAfterBreak="0">
+  <w:abstractNum w:abstractNumId="4" w15:restartNumberingAfterBreak="0">
     <w:nsid w:val="2E5A74FC"/>
     <w:multiLevelType w:val="hybridMultilevel"/>
     <w:tmpl w:val="6FA0A5C8"/>
@@ -10743,7 +11597,7 @@
       </w:pPr>
     </w:lvl>
   </w:abstractNum>
-  <w:abstractNum w:abstractNumId="4" w15:restartNumberingAfterBreak="0">
+  <w:abstractNum w:abstractNumId="5" w15:restartNumberingAfterBreak="0">
     <w:nsid w:val="389A3118"/>
     <w:multiLevelType w:val="multilevel"/>
     <w:tmpl w:val="191A6260"/>
@@ -10856,7 +11710,7 @@
       </w:rPr>
     </w:lvl>
   </w:abstractNum>
-  <w:abstractNum w:abstractNumId="5" w15:restartNumberingAfterBreak="0">
+  <w:abstractNum w:abstractNumId="6" w15:restartNumberingAfterBreak="0">
     <w:nsid w:val="52D16E84"/>
     <w:multiLevelType w:val="multilevel"/>
     <w:tmpl w:val="FD403E30"/>
@@ -10978,7 +11832,120 @@
       </w:rPr>
     </w:lvl>
   </w:abstractNum>
-  <w:abstractNum w:abstractNumId="6" w15:restartNumberingAfterBreak="0">
+  <w:abstractNum w:abstractNumId="7" w15:restartNumberingAfterBreak="0">
+    <w:nsid w:val="5C6A28F3"/>
+    <w:multiLevelType w:val="multilevel"/>
+    <w:tmpl w:val="5B7286E2"/>
+    <w:lvl w:ilvl="0">
+      <w:start w:val="1"/>
+      <w:numFmt w:val="decimal"/>
+      <w:lvlText w:val="%1."/>
+      <w:lvlJc w:val="left"/>
+      <w:pPr>
+        <w:ind w:left="720" w:hanging="360"/>
+      </w:pPr>
+      <w:rPr>
+        <w:u w:val="none"/>
+      </w:rPr>
+    </w:lvl>
+    <w:lvl w:ilvl="1">
+      <w:start w:val="1"/>
+      <w:numFmt w:val="lowerLetter"/>
+      <w:lvlText w:val="%2."/>
+      <w:lvlJc w:val="left"/>
+      <w:pPr>
+        <w:ind w:left="1440" w:hanging="360"/>
+      </w:pPr>
+      <w:rPr>
+        <w:u w:val="none"/>
+      </w:rPr>
+    </w:lvl>
+    <w:lvl w:ilvl="2">
+      <w:start w:val="1"/>
+      <w:numFmt w:val="lowerRoman"/>
+      <w:lvlText w:val="%3."/>
+      <w:lvlJc w:val="right"/>
+      <w:pPr>
+        <w:ind w:left="2160" w:hanging="360"/>
+      </w:pPr>
+      <w:rPr>
+        <w:u w:val="none"/>
+      </w:rPr>
+    </w:lvl>
+    <w:lvl w:ilvl="3">
+      <w:start w:val="1"/>
+      <w:numFmt w:val="decimal"/>
+      <w:lvlText w:val="%4."/>
+      <w:lvlJc w:val="left"/>
+      <w:pPr>
+        <w:ind w:left="2880" w:hanging="360"/>
+      </w:pPr>
+      <w:rPr>
+        <w:u w:val="none"/>
+      </w:rPr>
+    </w:lvl>
+    <w:lvl w:ilvl="4">
+      <w:start w:val="1"/>
+      <w:numFmt w:val="lowerLetter"/>
+      <w:lvlText w:val="%5."/>
+      <w:lvlJc w:val="left"/>
+      <w:pPr>
+        <w:ind w:left="3600" w:hanging="360"/>
+      </w:pPr>
+      <w:rPr>
+        <w:u w:val="none"/>
+      </w:rPr>
+    </w:lvl>
+    <w:lvl w:ilvl="5">
+      <w:start w:val="1"/>
+      <w:numFmt w:val="lowerRoman"/>
+      <w:lvlText w:val="%6."/>
+      <w:lvlJc w:val="right"/>
+      <w:pPr>
+        <w:ind w:left="4320" w:hanging="360"/>
+      </w:pPr>
+      <w:rPr>
+        <w:u w:val="none"/>
+      </w:rPr>
+    </w:lvl>
+    <w:lvl w:ilvl="6">
+      <w:start w:val="1"/>
+      <w:numFmt w:val="decimal"/>
+      <w:lvlText w:val="%7."/>
+      <w:lvlJc w:val="left"/>
+      <w:pPr>
+        <w:ind w:left="5040" w:hanging="360"/>
+      </w:pPr>
+      <w:rPr>
+        <w:u w:val="none"/>
+      </w:rPr>
+    </w:lvl>
+    <w:lvl w:ilvl="7">
+      <w:start w:val="1"/>
+      <w:numFmt w:val="lowerLetter"/>
+      <w:lvlText w:val="%8."/>
+      <w:lvlJc w:val="left"/>
+      <w:pPr>
+        <w:ind w:left="5760" w:hanging="360"/>
+      </w:pPr>
+      <w:rPr>
+        <w:u w:val="none"/>
+      </w:rPr>
+    </w:lvl>
+    <w:lvl w:ilvl="8">
+      <w:start w:val="1"/>
+      <w:numFmt w:val="lowerRoman"/>
+      <w:lvlText w:val="%9."/>
+      <w:lvlJc w:val="right"/>
+      <w:pPr>
+        <w:ind w:left="6480" w:hanging="360"/>
+      </w:pPr>
+      <w:rPr>
+        <w:u w:val="none"/>
+      </w:rPr>
+    </w:lvl>
+  </w:abstractNum>
+  <w:abstractNum w:abstractNumId="8" w15:restartNumberingAfterBreak="0">
     <w:nsid w:val="67FB56F1"/>
     <w:multiLevelType w:val="hybridMultilevel"/>
     <w:tmpl w:val="23A82E4C"/>
@@ -11091,7 +12058,7 @@
       </w:rPr>
     </w:lvl>
   </w:abstractNum>
-  <w:abstractNum w:abstractNumId="7" w15:restartNumberingAfterBreak="0">
+  <w:abstractNum w:abstractNumId="9" w15:restartNumberingAfterBreak="0">
     <w:nsid w:val="7A530717"/>
     <w:multiLevelType w:val="hybridMultilevel"/>
     <w:tmpl w:val="2332A89A"/>
@@ -11180,7 +12147,7 @@
       </w:pPr>
     </w:lvl>
   </w:abstractNum>
-  <w:abstractNum w:abstractNumId="8" w15:restartNumberingAfterBreak="0">
+  <w:abstractNum w:abstractNumId="10" w15:restartNumberingAfterBreak="0">
     <w:nsid w:val="7F437120"/>
     <w:multiLevelType w:val="hybridMultilevel"/>
     <w:tmpl w:val="57B4066E"/>
@@ -11293,39 +12260,45 @@
       </w:rPr>
     </w:lvl>
   </w:abstractNum>
-  <w:num w:numId="1" w16cid:durableId="630984446">
+  <w:num w:numId="1">
+    <w:abstractNumId w:val="6"/>
+  </w:num>
+  <w:num w:numId="2">
+    <w:abstractNumId w:val="10"/>
+  </w:num>
+  <w:num w:numId="3">
     <w:abstractNumId w:val="5"/>
   </w:num>
-  <w:num w:numId="2" w16cid:durableId="257641103">
+  <w:num w:numId="4">
+    <w:abstractNumId w:val="4"/>
+  </w:num>
+  <w:num w:numId="5">
+    <w:abstractNumId w:val="0"/>
+  </w:num>
+  <w:num w:numId="6">
+    <w:abstractNumId w:val="1"/>
+  </w:num>
+  <w:num w:numId="7">
+    <w:abstractNumId w:val="3"/>
+  </w:num>
+  <w:num w:numId="8">
+    <w:abstractNumId w:val="9"/>
+  </w:num>
+  <w:num w:numId="9">
     <w:abstractNumId w:val="8"/>
   </w:num>
-  <w:num w:numId="3" w16cid:durableId="1376396054">
-    <w:abstractNumId w:val="4"/>
-  </w:num>
-  <w:num w:numId="4" w16cid:durableId="390352966">
-    <w:abstractNumId w:val="3"/>
-  </w:num>
-  <w:num w:numId="5" w16cid:durableId="732388133">
-    <w:abstractNumId w:val="0"/>
-  </w:num>
-  <w:num w:numId="6" w16cid:durableId="929974497">
-    <w:abstractNumId w:val="1"/>
-  </w:num>
-  <w:num w:numId="7" w16cid:durableId="1338386698">
-    <w:abstractNumId w:val="2"/>
-  </w:num>
-  <w:num w:numId="8" w16cid:durableId="1621688646">
+  <w:num w:numId="10">
     <w:abstractNumId w:val="7"/>
   </w:num>
-  <w:num w:numId="9" w16cid:durableId="634876750">
-    <w:abstractNumId w:val="6"/>
+  <w:num w:numId="11">
+    <w:abstractNumId w:val="2"/>
   </w:num>
   <w:numIdMacAtCleanup w:val="4"/>
 </w:numbering>
 </file>
 
 <file path=word/styles.xml><?xml version="1.0" encoding="utf-8"?>
-<w:styles xmlns:mc="http://schemas.openxmlformats.org/markup-compatibility/2006" xmlns:r="http://schemas.openxmlformats.org/officeDocument/2006/relationships" xmlns:w="http://schemas.openxmlformats.org/wordprocessingml/2006/main" xmlns:w14="http://schemas.microsoft.com/office/word/2010/wordml" xmlns:w15="http://schemas.microsoft.com/office/word/2012/wordml" xmlns:w16cex="http://schemas.microsoft.com/office/word/2018/wordml/cex" xmlns:w16cid="http://schemas.microsoft.com/office/word/2016/wordml/cid" xmlns:w16="http://schemas.microsoft.com/office/word/2018/wordml" xmlns:w16du="http://schemas.microsoft.com/office/word/2023/wordml/word16du" xmlns:w16sdtdh="http://schemas.microsoft.com/office/word/2020/wordml/sdtdatahash" xmlns:w16sdtfl="http://schemas.microsoft.com/office/word/2024/wordml/sdtformatlock" xmlns:w16se="http://schemas.microsoft.com/office/word/2015/wordml/symex" mc:Ignorable="w14 w15 w16se w16cid w16 w16cex w16sdtdh w16sdtfl w16du">
+<w:styles xmlns:mc="http://schemas.openxmlformats.org/markup-compatibility/2006" xmlns:r="http://schemas.openxmlformats.org/officeDocument/2006/relationships" xmlns:w="http://schemas.openxmlformats.org/wordprocessingml/2006/main" xmlns:w14="http://schemas.microsoft.com/office/word/2010/wordml" xmlns:w15="http://schemas.microsoft.com/office/word/2012/wordml" xmlns:w16cex="http://schemas.microsoft.com/office/word/2018/wordml/cex" xmlns:w16cid="http://schemas.microsoft.com/office/word/2016/wordml/cid" xmlns:w16="http://schemas.microsoft.com/office/word/2018/wordml" xmlns:w16sdtdh="http://schemas.microsoft.com/office/word/2020/wordml/sdtdatahash" xmlns:w16se="http://schemas.microsoft.com/office/word/2015/wordml/symex" mc:Ignorable="w14 w15 w16se w16cid w16 w16cex w16sdtdh">
   <w:docDefaults>
     <w:rPrDefault>
       <w:rPr>
@@ -11905,7 +12878,6 @@
   <w:style w:type="character" w:default="1" w:styleId="Fuentedeprrafopredeter">
     <w:name w:val="Default Paragraph Font"/>
     <w:uiPriority w:val="1"/>
-    <w:semiHidden/>
     <w:unhideWhenUsed/>
   </w:style>
   <w:style w:type="table" w:default="1" w:styleId="Tablanormal">
@@ -12938,6 +13910,15 @@
 </file>
 
 <file path=customXml/item1.xml><?xml version="1.0" encoding="utf-8"?>
+<?mso-contentType ?>
+<FormTemplates xmlns="http://schemas.microsoft.com/sharepoint/v3/contenttype/forms">
+  <Display>DocumentLibraryForm</Display>
+  <Edit>DocumentLibraryForm</Edit>
+  <New>DocumentLibraryForm</New>
+</FormTemplates>
+</file>
+
+<file path=customXml/item2.xml><?xml version="1.0" encoding="utf-8"?>
 <ct:contentTypeSchema xmlns:ct="http://schemas.microsoft.com/office/2006/metadata/contentType" xmlns:ma="http://schemas.microsoft.com/office/2006/metadata/properties/metaAttributes" ct:_="" ma:_="" ma:contentTypeName="Documento" ma:contentTypeID="0x010100AF28BDBD65D93F4BA99B6439AFEA320E" ma:contentTypeVersion="10" ma:contentTypeDescription="Crear nuevo documento." ma:contentTypeScope="" ma:versionID="11d45d99e0339591c68aad091688ac92">
   <xsd:schema xmlns:xsd="http://www.w3.org/2001/XMLSchema" xmlns:xs="http://www.w3.org/2001/XMLSchema" xmlns:p="http://schemas.microsoft.com/office/2006/metadata/properties" xmlns:ns2="9b0ef35d-78e7-41bf-847f-3c0497ad5352" xmlns:ns3="3c969135-7855-44e0-a9fe-01d799f07605" targetNamespace="http://schemas.microsoft.com/office/2006/metadata/properties" ma:root="true" ma:fieldsID="0e603a3f7bf67670d682b80385fe4b00" ns2:_="" ns3:_="">
     <xsd:import namespace="9b0ef35d-78e7-41bf-847f-3c0497ad5352"/>
@@ -13138,26 +14119,25 @@
 </ct:contentTypeSchema>
 </file>
 
-<file path=customXml/item2.xml><?xml version="1.0" encoding="utf-8"?>
-<?mso-contentType ?>
-<FormTemplates xmlns="http://schemas.microsoft.com/sharepoint/v3/contenttype/forms">
-  <Display>DocumentLibraryForm</Display>
-  <Edit>DocumentLibraryForm</Edit>
-  <New>DocumentLibraryForm</New>
-</FormTemplates>
-</file>
-
 <file path=customXml/item3.xml><?xml version="1.0" encoding="utf-8"?>
-<b:Sources xmlns:b="http://schemas.openxmlformats.org/officeDocument/2006/bibliography" xmlns="http://schemas.openxmlformats.org/officeDocument/2006/bibliography" SelectedStyle="/APASixthEditionOfficeOnline.xsl" StyleName="APA" Version="6"/>
-</file>
-
-<file path=customXml/item4.xml><?xml version="1.0" encoding="utf-8"?>
 <p:properties xmlns:p="http://schemas.microsoft.com/office/2006/metadata/properties" xmlns:xsi="http://www.w3.org/2001/XMLSchema-instance" xmlns:pc="http://schemas.microsoft.com/office/infopath/2007/PartnerControls">
   <documentManagement/>
 </p:properties>
 </file>
 
+<file path=customXml/item4.xml><?xml version="1.0" encoding="utf-8"?>
+<b:Sources xmlns:b="http://schemas.openxmlformats.org/officeDocument/2006/bibliography" xmlns="http://schemas.openxmlformats.org/officeDocument/2006/bibliography" SelectedStyle="/APASixthEditionOfficeOnline.xsl" StyleName="APA" Version="6"/>
+</file>
+
 <file path=customXml/itemProps1.xml><?xml version="1.0" encoding="utf-8"?>
+<ds:datastoreItem xmlns:ds="http://schemas.openxmlformats.org/officeDocument/2006/customXml" ds:itemID="{836CD6ED-D121-451D-9009-89041862BDCC}">
+  <ds:schemaRefs>
+    <ds:schemaRef ds:uri="http://schemas.microsoft.com/sharepoint/v3/contenttype/forms"/>
+  </ds:schemaRefs>
+</ds:datastoreItem>
+</file>
+
+<file path=customXml/itemProps2.xml><?xml version="1.0" encoding="utf-8"?>
 <ds:datastoreItem xmlns:ds="http://schemas.openxmlformats.org/officeDocument/2006/customXml" ds:itemID="{45AF2103-6344-4B3B-BBB6-7B451BD9DA8A}">
   <ds:schemaRefs>
     <ds:schemaRef ds:uri="http://schemas.microsoft.com/office/2006/metadata/contentType"/>
@@ -13176,27 +14156,19 @@
 </ds:datastoreItem>
 </file>
 
-<file path=customXml/itemProps2.xml><?xml version="1.0" encoding="utf-8"?>
-<ds:datastoreItem xmlns:ds="http://schemas.openxmlformats.org/officeDocument/2006/customXml" ds:itemID="{836CD6ED-D121-451D-9009-89041862BDCC}">
-  <ds:schemaRefs>
-    <ds:schemaRef ds:uri="http://schemas.microsoft.com/sharepoint/v3/contenttype/forms"/>
-  </ds:schemaRefs>
-</ds:datastoreItem>
-</file>
-
 <file path=customXml/itemProps3.xml><?xml version="1.0" encoding="utf-8"?>
-<ds:datastoreItem xmlns:ds="http://schemas.openxmlformats.org/officeDocument/2006/customXml" ds:itemID="{7BCEAE7D-0658-4599-9467-160E0680ABF1}">
-  <ds:schemaRefs>
-    <ds:schemaRef ds:uri="http://schemas.openxmlformats.org/officeDocument/2006/bibliography"/>
-  </ds:schemaRefs>
-</ds:datastoreItem>
-</file>
-
-<file path=customXml/itemProps4.xml><?xml version="1.0" encoding="utf-8"?>
 <ds:datastoreItem xmlns:ds="http://schemas.openxmlformats.org/officeDocument/2006/customXml" ds:itemID="{1F0F8696-2F11-4ED2-B3BB-20313B5F1328}">
   <ds:schemaRefs>
     <ds:schemaRef ds:uri="http://schemas.microsoft.com/office/2006/metadata/properties"/>
     <ds:schemaRef ds:uri="http://schemas.microsoft.com/office/infopath/2007/PartnerControls"/>
   </ds:schemaRefs>
 </ds:datastoreItem>
+</file>
+
+<file path=customXml/itemProps4.xml><?xml version="1.0" encoding="utf-8"?>
+<ds:datastoreItem xmlns:ds="http://schemas.openxmlformats.org/officeDocument/2006/customXml" ds:itemID="{7BCEAE7D-0658-4599-9467-160E0680ABF1}">
+  <ds:schemaRefs>
+    <ds:schemaRef ds:uri="http://schemas.openxmlformats.org/officeDocument/2006/bibliography"/>
+  </ds:schemaRefs>
+</ds:datastoreItem>
 </file>
</xml_diff>

<commit_message>
docs: Actualización de doc identif.
</commit_message>
<xml_diff>
--- a/Gestion/1.1.2 Documento de registro de definición e identificación del proyecto.docx
+++ b/Gestion/1.1.2 Documento de registro de definición e identificación del proyecto.docx
@@ -1,6 +1,6 @@
 
 <file path=word/document.xml><?xml version="1.0" encoding="utf-8"?>
-<w:document xmlns:wpc="http://schemas.microsoft.com/office/word/2010/wordprocessingCanvas" xmlns:cx="http://schemas.microsoft.com/office/drawing/2014/chartex" xmlns:cx1="http://schemas.microsoft.com/office/drawing/2015/9/8/chartex" xmlns:cx2="http://schemas.microsoft.com/office/drawing/2015/10/21/chartex" xmlns:cx3="http://schemas.microsoft.com/office/drawing/2016/5/9/chartex" xmlns:cx4="http://schemas.microsoft.com/office/drawing/2016/5/10/chartex" xmlns:cx5="http://schemas.microsoft.com/office/drawing/2016/5/11/chartex" xmlns:cx6="http://schemas.microsoft.com/office/drawing/2016/5/12/chartex" xmlns:cx7="http://schemas.microsoft.com/office/drawing/2016/5/13/chartex" xmlns:cx8="http://schemas.microsoft.com/office/drawing/2016/5/14/chartex" xmlns:mc="http://schemas.openxmlformats.org/markup-compatibility/2006" xmlns:aink="http://schemas.microsoft.com/office/drawing/2016/ink" xmlns:am3d="http://schemas.microsoft.com/office/drawing/2017/model3d" xmlns:o="urn:schemas-microsoft-com:office:office" xmlns:r="http://schemas.openxmlformats.org/officeDocument/2006/relationships" xmlns:m="http://schemas.openxmlformats.org/officeDocument/2006/math" xmlns:v="urn:schemas-microsoft-com:vml" xmlns:wp14="http://schemas.microsoft.com/office/word/2010/wordprocessingDrawing" xmlns:wp="http://schemas.openxmlformats.org/drawingml/2006/wordprocessingDrawing" xmlns:w10="urn:schemas-microsoft-com:office:word" xmlns:w="http://schemas.openxmlformats.org/wordprocessingml/2006/main" xmlns:w14="http://schemas.microsoft.com/office/word/2010/wordml" xmlns:w15="http://schemas.microsoft.com/office/word/2012/wordml" xmlns:w16cex="http://schemas.microsoft.com/office/word/2018/wordml/cex" xmlns:w16cid="http://schemas.microsoft.com/office/word/2016/wordml/cid" xmlns:w16="http://schemas.microsoft.com/office/word/2018/wordml" xmlns:w16sdtdh="http://schemas.microsoft.com/office/word/2020/wordml/sdtdatahash" xmlns:w16se="http://schemas.microsoft.com/office/word/2015/wordml/symex" xmlns:wpg="http://schemas.microsoft.com/office/word/2010/wordprocessingGroup" xmlns:wpi="http://schemas.microsoft.com/office/word/2010/wordprocessingInk" xmlns:wne="http://schemas.microsoft.com/office/word/2006/wordml" xmlns:wps="http://schemas.microsoft.com/office/word/2010/wordprocessingShape" mc:Ignorable="w14 w15 w16se w16cid w16 w16cex w16sdtdh wp14">
+<w:document xmlns:wpc="http://schemas.microsoft.com/office/word/2010/wordprocessingCanvas" xmlns:cx="http://schemas.microsoft.com/office/drawing/2014/chartex" xmlns:cx1="http://schemas.microsoft.com/office/drawing/2015/9/8/chartex" xmlns:cx2="http://schemas.microsoft.com/office/drawing/2015/10/21/chartex" xmlns:cx3="http://schemas.microsoft.com/office/drawing/2016/5/9/chartex" xmlns:cx4="http://schemas.microsoft.com/office/drawing/2016/5/10/chartex" xmlns:cx5="http://schemas.microsoft.com/office/drawing/2016/5/11/chartex" xmlns:cx6="http://schemas.microsoft.com/office/drawing/2016/5/12/chartex" xmlns:cx7="http://schemas.microsoft.com/office/drawing/2016/5/13/chartex" xmlns:cx8="http://schemas.microsoft.com/office/drawing/2016/5/14/chartex" xmlns:mc="http://schemas.openxmlformats.org/markup-compatibility/2006" xmlns:aink="http://schemas.microsoft.com/office/drawing/2016/ink" xmlns:am3d="http://schemas.microsoft.com/office/drawing/2017/model3d" xmlns:o="urn:schemas-microsoft-com:office:office" xmlns:oel="http://schemas.microsoft.com/office/2019/extlst" xmlns:r="http://schemas.openxmlformats.org/officeDocument/2006/relationships" xmlns:m="http://schemas.openxmlformats.org/officeDocument/2006/math" xmlns:v="urn:schemas-microsoft-com:vml" xmlns:wp14="http://schemas.microsoft.com/office/word/2010/wordprocessingDrawing" xmlns:wp="http://schemas.openxmlformats.org/drawingml/2006/wordprocessingDrawing" xmlns:w10="urn:schemas-microsoft-com:office:word" xmlns:w="http://schemas.openxmlformats.org/wordprocessingml/2006/main" xmlns:w14="http://schemas.microsoft.com/office/word/2010/wordml" xmlns:w15="http://schemas.microsoft.com/office/word/2012/wordml" xmlns:w16cex="http://schemas.microsoft.com/office/word/2018/wordml/cex" xmlns:w16cid="http://schemas.microsoft.com/office/word/2016/wordml/cid" xmlns:w16="http://schemas.microsoft.com/office/word/2018/wordml" xmlns:w16sdtdh="http://schemas.microsoft.com/office/word/2020/wordml/sdtdatahash" xmlns:w16se="http://schemas.microsoft.com/office/word/2015/wordml/symex" xmlns:wpg="http://schemas.microsoft.com/office/word/2010/wordprocessingGroup" xmlns:wpi="http://schemas.microsoft.com/office/word/2010/wordprocessingInk" xmlns:wne="http://schemas.microsoft.com/office/word/2006/wordml" xmlns:wps="http://schemas.microsoft.com/office/word/2010/wordprocessingShape" mc:Ignorable="w14 w15 w16se w16cid w16 w16cex w16sdtdh wp14">
   <w:body>
     <w:tbl>
       <w:tblPr>
@@ -1002,7 +1002,7 @@
               </wp:anchor>
             </w:drawing>
           </mc:Choice>
-          <mc:Fallback xmlns:asvg="http://schemas.microsoft.com/office/drawing/2016/SVG/main" xmlns:pic="http://schemas.openxmlformats.org/drawingml/2006/picture" xmlns:a="http://schemas.openxmlformats.org/drawingml/2006/main" xmlns:w16sdtfl="http://schemas.microsoft.com/office/word/2024/wordml/sdtformatlock" xmlns:w16du="http://schemas.microsoft.com/office/word/2023/wordml/word16du" xmlns:oel="http://schemas.microsoft.com/office/2019/extlst">
+          <mc:Fallback xmlns:w16du="http://schemas.microsoft.com/office/word/2023/wordml/word16du" xmlns:w16sdtfl="http://schemas.microsoft.com/office/word/2024/wordml/sdtformatlock" xmlns:a="http://schemas.openxmlformats.org/drawingml/2006/main" xmlns:pic="http://schemas.openxmlformats.org/drawingml/2006/picture" xmlns:asvg="http://schemas.microsoft.com/office/drawing/2016/SVG/main">
             <w:pict>
               <v:line id="Conector recto 12" style="position:absolute;flip:y;z-index:251671555;visibility:visible;mso-wrap-style:square;mso-width-percent:0;mso-height-percent:0;mso-wrap-distance-left:9pt;mso-wrap-distance-top:-3e-5mm;mso-wrap-distance-right:9pt;mso-wrap-distance-bottom:-3e-5mm;mso-position-horizontal:absolute;mso-position-horizontal-relative:text;mso-position-vertical:absolute;mso-position-vertical-relative:text;mso-width-percent:0;mso-height-percent:0;mso-width-relative:margin;mso-height-relative:margin" o:spid="_x0000_s1026" strokecolor="#b4c6e7 [1300]" strokeweight=".5pt" from="1.2pt,6.25pt" to="440.55pt,6.25pt" w14:anchorId="0C8B07C6" o:gfxdata="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">
                 <v:stroke joinstyle="miter"/>
@@ -1323,7 +1323,7 @@
               </wp:anchor>
             </w:drawing>
           </mc:Choice>
-          <mc:Fallback xmlns:asvg="http://schemas.microsoft.com/office/drawing/2016/SVG/main" xmlns:pic="http://schemas.openxmlformats.org/drawingml/2006/picture" xmlns:a="http://schemas.openxmlformats.org/drawingml/2006/main" xmlns:w16sdtfl="http://schemas.microsoft.com/office/word/2024/wordml/sdtformatlock" xmlns:w16du="http://schemas.microsoft.com/office/word/2023/wordml/word16du" xmlns:oel="http://schemas.microsoft.com/office/2019/extlst">
+          <mc:Fallback xmlns:w16du="http://schemas.microsoft.com/office/word/2023/wordml/word16du" xmlns:w16sdtfl="http://schemas.microsoft.com/office/word/2024/wordml/sdtformatlock" xmlns:a="http://schemas.openxmlformats.org/drawingml/2006/main" xmlns:pic="http://schemas.openxmlformats.org/drawingml/2006/picture" xmlns:asvg="http://schemas.microsoft.com/office/drawing/2016/SVG/main">
             <w:pict>
               <v:line id="Conector recto 11" style="position:absolute;z-index:251673603;visibility:visible;mso-wrap-style:square;mso-width-percent:0;mso-height-percent:0;mso-wrap-distance-left:9pt;mso-wrap-distance-top:-3e-5mm;mso-wrap-distance-right:9pt;mso-wrap-distance-bottom:-3e-5mm;mso-position-horizontal:absolute;mso-position-horizontal-relative:text;mso-position-vertical:absolute;mso-position-vertical-relative:text;mso-width-percent:0;mso-height-percent:0;mso-width-relative:page;mso-height-relative:page" o:spid="_x0000_s1026" strokecolor="#b4c6e7 [1300]" strokeweight=".5pt" from="0,-.05pt" to="440.15pt,-.05pt" w14:anchorId="4878FEF2" o:gfxdata="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">
                 <v:stroke joinstyle="miter"/>
@@ -1697,7 +1697,7 @@
               </wp:anchor>
             </w:drawing>
           </mc:Choice>
-          <mc:Fallback xmlns:asvg="http://schemas.microsoft.com/office/drawing/2016/SVG/main" xmlns:pic="http://schemas.openxmlformats.org/drawingml/2006/picture" xmlns:a="http://schemas.openxmlformats.org/drawingml/2006/main" xmlns:w16sdtfl="http://schemas.microsoft.com/office/word/2024/wordml/sdtformatlock" xmlns:w16du="http://schemas.microsoft.com/office/word/2023/wordml/word16du" xmlns:oel="http://schemas.microsoft.com/office/2019/extlst">
+          <mc:Fallback xmlns:w16du="http://schemas.microsoft.com/office/word/2023/wordml/word16du" xmlns:w16sdtfl="http://schemas.microsoft.com/office/word/2024/wordml/sdtformatlock" xmlns:a="http://schemas.openxmlformats.org/drawingml/2006/main" xmlns:pic="http://schemas.openxmlformats.org/drawingml/2006/picture" xmlns:asvg="http://schemas.microsoft.com/office/drawing/2016/SVG/main">
             <w:pict>
               <v:line id="Conector recto 10" style="position:absolute;z-index:251675651;visibility:visible;mso-wrap-style:square;mso-width-percent:0;mso-height-percent:0;mso-wrap-distance-left:9pt;mso-wrap-distance-top:-3e-5mm;mso-wrap-distance-right:9pt;mso-wrap-distance-bottom:-3e-5mm;mso-position-horizontal:absolute;mso-position-horizontal-relative:text;mso-position-vertical:absolute;mso-position-vertical-relative:text;mso-width-percent:0;mso-height-percent:0;mso-width-relative:margin;mso-height-relative:margin" o:spid="_x0000_s1026" strokecolor="#b4c6e7 [1300]" strokeweight=".5pt" from="-.05pt,3.4pt" to="440.1pt,3.4pt" w14:anchorId="4A06B2A9" o:gfxdata="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">
                 <v:stroke joinstyle="miter"/>
@@ -2618,18 +2618,8 @@
                 <w:sz w:val="22"/>
                 <w:szCs w:val="22"/>
               </w:rPr>
-              <w:t xml:space="preserve">José </w:t>
-            </w:r>
-            <w:proofErr w:type="spellStart"/>
-            <w:r>
-              <w:rPr>
-                <w:rFonts w:ascii="Calibri" w:eastAsia="Calibri" w:hAnsi="Calibri" w:cs="Calibri"/>
-                <w:sz w:val="22"/>
-                <w:szCs w:val="22"/>
-              </w:rPr>
-              <w:t>Matias</w:t>
-            </w:r>
-            <w:proofErr w:type="spellEnd"/>
+              <w:t>José Matias</w:t>
+            </w:r>
           </w:p>
         </w:tc>
         <w:tc>
@@ -2914,9 +2904,35 @@
                 <w:sz w:val="20"/>
                 <w:szCs w:val="20"/>
               </w:rPr>
-              <w:t>QA/</w:t>
-            </w:r>
-            <w:proofErr w:type="spellStart"/>
+              <w:t>QA/Testing/front end</w:t>
+            </w:r>
+          </w:p>
+        </w:tc>
+        <w:tc>
+          <w:tcPr>
+            <w:tcW w:w="2539" w:type="dxa"/>
+            <w:tcBorders>
+              <w:top w:val="single" w:sz="6" w:space="0" w:color="BFBFBF" w:themeColor="background1" w:themeShade="BF"/>
+              <w:left w:val="single" w:sz="6" w:space="0" w:color="BFBFBF" w:themeColor="background1" w:themeShade="BF"/>
+              <w:bottom w:val="single" w:sz="6" w:space="0" w:color="BFBFBF" w:themeColor="background1" w:themeShade="BF"/>
+              <w:right w:val="single" w:sz="6" w:space="0" w:color="BFBFBF" w:themeColor="background1" w:themeShade="BF"/>
+            </w:tcBorders>
+            <w:tcMar>
+              <w:left w:w="105" w:type="dxa"/>
+              <w:right w:w="105" w:type="dxa"/>
+            </w:tcMar>
+          </w:tcPr>
+          <w:p>
+            <w:pPr>
+              <w:spacing w:line="259" w:lineRule="auto"/>
+              <w:jc w:val="both"/>
+              <w:rPr>
+                <w:rFonts w:ascii="Calibri" w:eastAsia="Calibri" w:hAnsi="Calibri" w:cs="Calibri"/>
+                <w:color w:val="548DD4"/>
+                <w:sz w:val="20"/>
+                <w:szCs w:val="20"/>
+              </w:rPr>
+            </w:pPr>
             <w:r>
               <w:rPr>
                 <w:rFonts w:ascii="Calibri" w:eastAsia="Calibri" w:hAnsi="Calibri" w:cs="Calibri"/>
@@ -2926,9 +2942,35 @@
                 <w:sz w:val="20"/>
                 <w:szCs w:val="20"/>
               </w:rPr>
-              <w:t>Testing</w:t>
-            </w:r>
-            <w:proofErr w:type="spellEnd"/>
+              <w:t>DBA/ Analista Funcional/Lider</w:t>
+            </w:r>
+          </w:p>
+        </w:tc>
+        <w:tc>
+          <w:tcPr>
+            <w:tcW w:w="2539" w:type="dxa"/>
+            <w:tcBorders>
+              <w:top w:val="single" w:sz="6" w:space="0" w:color="BFBFBF" w:themeColor="background1" w:themeShade="BF"/>
+              <w:left w:val="single" w:sz="6" w:space="0" w:color="BFBFBF" w:themeColor="background1" w:themeShade="BF"/>
+              <w:bottom w:val="single" w:sz="6" w:space="0" w:color="BFBFBF" w:themeColor="background1" w:themeShade="BF"/>
+              <w:right w:val="single" w:sz="6" w:space="0" w:color="BFBFBF" w:themeColor="background1" w:themeShade="BF"/>
+            </w:tcBorders>
+            <w:tcMar>
+              <w:left w:w="105" w:type="dxa"/>
+              <w:right w:w="105" w:type="dxa"/>
+            </w:tcMar>
+          </w:tcPr>
+          <w:p>
+            <w:pPr>
+              <w:spacing w:line="259" w:lineRule="auto"/>
+              <w:jc w:val="both"/>
+              <w:rPr>
+                <w:rFonts w:ascii="Calibri" w:eastAsia="Calibri" w:hAnsi="Calibri" w:cs="Calibri"/>
+                <w:color w:val="548DD4"/>
+                <w:sz w:val="20"/>
+                <w:szCs w:val="20"/>
+              </w:rPr>
+            </w:pPr>
             <w:r>
               <w:rPr>
                 <w:rFonts w:ascii="Calibri" w:eastAsia="Calibri" w:hAnsi="Calibri" w:cs="Calibri"/>
@@ -2938,157 +2980,7 @@
                 <w:sz w:val="20"/>
                 <w:szCs w:val="20"/>
               </w:rPr>
-              <w:t>/</w:t>
-            </w:r>
-            <w:proofErr w:type="spellStart"/>
-            <w:r>
-              <w:rPr>
-                <w:rFonts w:ascii="Calibri" w:eastAsia="Calibri" w:hAnsi="Calibri" w:cs="Calibri"/>
-                <w:i/>
-                <w:iCs/>
-                <w:color w:val="548DD4"/>
-                <w:sz w:val="20"/>
-                <w:szCs w:val="20"/>
-              </w:rPr>
-              <w:t>front</w:t>
-            </w:r>
-            <w:proofErr w:type="spellEnd"/>
-            <w:r>
-              <w:rPr>
-                <w:rFonts w:ascii="Calibri" w:eastAsia="Calibri" w:hAnsi="Calibri" w:cs="Calibri"/>
-                <w:i/>
-                <w:iCs/>
-                <w:color w:val="548DD4"/>
-                <w:sz w:val="20"/>
-                <w:szCs w:val="20"/>
-              </w:rPr>
-              <w:t xml:space="preserve"> </w:t>
-            </w:r>
-            <w:proofErr w:type="spellStart"/>
-            <w:r>
-              <w:rPr>
-                <w:rFonts w:ascii="Calibri" w:eastAsia="Calibri" w:hAnsi="Calibri" w:cs="Calibri"/>
-                <w:i/>
-                <w:iCs/>
-                <w:color w:val="548DD4"/>
-                <w:sz w:val="20"/>
-                <w:szCs w:val="20"/>
-              </w:rPr>
-              <w:t>end</w:t>
-            </w:r>
-            <w:proofErr w:type="spellEnd"/>
-          </w:p>
-        </w:tc>
-        <w:tc>
-          <w:tcPr>
-            <w:tcW w:w="2539" w:type="dxa"/>
-            <w:tcBorders>
-              <w:top w:val="single" w:sz="6" w:space="0" w:color="BFBFBF" w:themeColor="background1" w:themeShade="BF"/>
-              <w:left w:val="single" w:sz="6" w:space="0" w:color="BFBFBF" w:themeColor="background1" w:themeShade="BF"/>
-              <w:bottom w:val="single" w:sz="6" w:space="0" w:color="BFBFBF" w:themeColor="background1" w:themeShade="BF"/>
-              <w:right w:val="single" w:sz="6" w:space="0" w:color="BFBFBF" w:themeColor="background1" w:themeShade="BF"/>
-            </w:tcBorders>
-            <w:tcMar>
-              <w:left w:w="105" w:type="dxa"/>
-              <w:right w:w="105" w:type="dxa"/>
-            </w:tcMar>
-          </w:tcPr>
-          <w:p>
-            <w:pPr>
-              <w:spacing w:line="259" w:lineRule="auto"/>
-              <w:jc w:val="both"/>
-              <w:rPr>
-                <w:rFonts w:ascii="Calibri" w:eastAsia="Calibri" w:hAnsi="Calibri" w:cs="Calibri"/>
-                <w:color w:val="548DD4"/>
-                <w:sz w:val="20"/>
-                <w:szCs w:val="20"/>
-              </w:rPr>
-            </w:pPr>
-            <w:r>
-              <w:rPr>
-                <w:rFonts w:ascii="Calibri" w:eastAsia="Calibri" w:hAnsi="Calibri" w:cs="Calibri"/>
-                <w:i/>
-                <w:iCs/>
-                <w:color w:val="548DD4"/>
-                <w:sz w:val="20"/>
-                <w:szCs w:val="20"/>
-              </w:rPr>
-              <w:t>DBA/ Analista Funcional/</w:t>
-            </w:r>
-            <w:proofErr w:type="spellStart"/>
-            <w:r>
-              <w:rPr>
-                <w:rFonts w:ascii="Calibri" w:eastAsia="Calibri" w:hAnsi="Calibri" w:cs="Calibri"/>
-                <w:i/>
-                <w:iCs/>
-                <w:color w:val="548DD4"/>
-                <w:sz w:val="20"/>
-                <w:szCs w:val="20"/>
-              </w:rPr>
-              <w:t>Lider</w:t>
-            </w:r>
-            <w:proofErr w:type="spellEnd"/>
-          </w:p>
-        </w:tc>
-        <w:tc>
-          <w:tcPr>
-            <w:tcW w:w="2539" w:type="dxa"/>
-            <w:tcBorders>
-              <w:top w:val="single" w:sz="6" w:space="0" w:color="BFBFBF" w:themeColor="background1" w:themeShade="BF"/>
-              <w:left w:val="single" w:sz="6" w:space="0" w:color="BFBFBF" w:themeColor="background1" w:themeShade="BF"/>
-              <w:bottom w:val="single" w:sz="6" w:space="0" w:color="BFBFBF" w:themeColor="background1" w:themeShade="BF"/>
-              <w:right w:val="single" w:sz="6" w:space="0" w:color="BFBFBF" w:themeColor="background1" w:themeShade="BF"/>
-            </w:tcBorders>
-            <w:tcMar>
-              <w:left w:w="105" w:type="dxa"/>
-              <w:right w:w="105" w:type="dxa"/>
-            </w:tcMar>
-          </w:tcPr>
-          <w:p>
-            <w:pPr>
-              <w:spacing w:line="259" w:lineRule="auto"/>
-              <w:jc w:val="both"/>
-              <w:rPr>
-                <w:rFonts w:ascii="Calibri" w:eastAsia="Calibri" w:hAnsi="Calibri" w:cs="Calibri"/>
-                <w:color w:val="548DD4"/>
-                <w:sz w:val="20"/>
-                <w:szCs w:val="20"/>
-              </w:rPr>
-            </w:pPr>
-            <w:r>
-              <w:rPr>
-                <w:rFonts w:ascii="Calibri" w:eastAsia="Calibri" w:hAnsi="Calibri" w:cs="Calibri"/>
-                <w:i/>
-                <w:iCs/>
-                <w:color w:val="548DD4"/>
-                <w:sz w:val="20"/>
-                <w:szCs w:val="20"/>
-              </w:rPr>
-              <w:t xml:space="preserve">Back </w:t>
-            </w:r>
-            <w:proofErr w:type="spellStart"/>
-            <w:r>
-              <w:rPr>
-                <w:rFonts w:ascii="Calibri" w:eastAsia="Calibri" w:hAnsi="Calibri" w:cs="Calibri"/>
-                <w:i/>
-                <w:iCs/>
-                <w:color w:val="548DD4"/>
-                <w:sz w:val="20"/>
-                <w:szCs w:val="20"/>
-              </w:rPr>
-              <w:t>end</w:t>
-            </w:r>
-            <w:proofErr w:type="spellEnd"/>
-            <w:r>
-              <w:rPr>
-                <w:rFonts w:ascii="Calibri" w:eastAsia="Calibri" w:hAnsi="Calibri" w:cs="Calibri"/>
-                <w:i/>
-                <w:iCs/>
-                <w:color w:val="548DD4"/>
-                <w:sz w:val="20"/>
-                <w:szCs w:val="20"/>
-              </w:rPr>
-              <w:t>/ Otros…</w:t>
+              <w:t>Back end/ Otros…</w:t>
             </w:r>
           </w:p>
         </w:tc>
@@ -4083,7 +3975,6 @@
               </w:rPr>
               <w:t xml:space="preserve">oportunidad o </w:t>
             </w:r>
-            <w:proofErr w:type="gramStart"/>
             <w:r>
               <w:rPr>
                 <w:rFonts w:ascii="Calibri" w:eastAsia="Calibri" w:hAnsi="Calibri" w:cs="Calibri"/>
@@ -4115,19 +4006,7 @@
                 <w:sz w:val="20"/>
                 <w:szCs w:val="20"/>
               </w:rPr>
-              <w:t xml:space="preserve"> a</w:t>
-            </w:r>
-            <w:proofErr w:type="gramEnd"/>
-            <w:r>
-              <w:rPr>
-                <w:rFonts w:ascii="Calibri" w:eastAsia="Calibri" w:hAnsi="Calibri" w:cs="Calibri"/>
-                <w:i/>
-                <w:iCs/>
-                <w:color w:val="548DD4"/>
-                <w:sz w:val="20"/>
-                <w:szCs w:val="20"/>
-              </w:rPr>
-              <w:t xml:space="preserve"> resolver</w:t>
+              <w:t xml:space="preserve"> a resolver</w:t>
             </w:r>
           </w:p>
           <w:p>
@@ -4644,47 +4523,7 @@
                 <w:sz w:val="22"/>
                 <w:szCs w:val="22"/>
               </w:rPr>
-              <w:t xml:space="preserve">: Modelado de la base de datos </w:t>
-            </w:r>
-            <w:proofErr w:type="spellStart"/>
-            <w:r>
-              <w:rPr>
-                <w:rFonts w:ascii="Calibri" w:eastAsia="Calibri" w:hAnsi="Calibri" w:cs="Calibri"/>
-                <w:color w:val="1F4E79" w:themeColor="accent5" w:themeShade="80"/>
-                <w:sz w:val="22"/>
-                <w:szCs w:val="22"/>
-              </w:rPr>
-              <w:t>postgreSQL</w:t>
-            </w:r>
-            <w:proofErr w:type="spellEnd"/>
-            <w:r>
-              <w:rPr>
-                <w:rFonts w:ascii="Calibri" w:eastAsia="Calibri" w:hAnsi="Calibri" w:cs="Calibri"/>
-                <w:color w:val="1F4E79" w:themeColor="accent5" w:themeShade="80"/>
-                <w:sz w:val="22"/>
-                <w:szCs w:val="22"/>
-              </w:rPr>
-              <w:t xml:space="preserve"> (</w:t>
-            </w:r>
-            <w:proofErr w:type="spellStart"/>
-            <w:r>
-              <w:rPr>
-                <w:rFonts w:ascii="Calibri" w:eastAsia="Calibri" w:hAnsi="Calibri" w:cs="Calibri"/>
-                <w:color w:val="1F4E79" w:themeColor="accent5" w:themeShade="80"/>
-                <w:sz w:val="22"/>
-                <w:szCs w:val="22"/>
-              </w:rPr>
-              <w:t>supabase</w:t>
-            </w:r>
-            <w:proofErr w:type="spellEnd"/>
-            <w:r>
-              <w:rPr>
-                <w:rFonts w:ascii="Calibri" w:eastAsia="Calibri" w:hAnsi="Calibri" w:cs="Calibri"/>
-                <w:color w:val="1F4E79" w:themeColor="accent5" w:themeShade="80"/>
-                <w:sz w:val="22"/>
-                <w:szCs w:val="22"/>
-              </w:rPr>
-              <w:t>) y prototipado de pantallas (UI/UX) móvil y web.</w:t>
+              <w:t>: Modelado de la base de datos postgreSQL (supabase) y prototipado de pantallas (UI/UX) móvil y web.</w:t>
             </w:r>
           </w:p>
           <w:p>
@@ -4710,49 +4549,16 @@
                 <w:sz w:val="22"/>
                 <w:szCs w:val="22"/>
               </w:rPr>
-              <w:t xml:space="preserve">Desarrollo del </w:t>
-            </w:r>
-            <w:proofErr w:type="spellStart"/>
-            <w:r>
-              <w:rPr>
-                <w:rFonts w:ascii="Calibri" w:eastAsia="Calibri" w:hAnsi="Calibri" w:cs="Calibri"/>
-                <w:b/>
-                <w:bCs/>
+              <w:t>Desarrollo del Backend</w:t>
+            </w:r>
+            <w:r>
+              <w:rPr>
+                <w:rFonts w:ascii="Calibri" w:eastAsia="Calibri" w:hAnsi="Calibri" w:cs="Calibri"/>
                 <w:color w:val="1F4E79" w:themeColor="accent5" w:themeShade="80"/>
                 <w:sz w:val="22"/>
                 <w:szCs w:val="22"/>
               </w:rPr>
-              <w:t>Backend</w:t>
-            </w:r>
-            <w:proofErr w:type="spellEnd"/>
-            <w:r>
-              <w:rPr>
-                <w:rFonts w:ascii="Calibri" w:eastAsia="Calibri" w:hAnsi="Calibri" w:cs="Calibri"/>
-                <w:color w:val="1F4E79" w:themeColor="accent5" w:themeShade="80"/>
-                <w:sz w:val="22"/>
-                <w:szCs w:val="22"/>
-              </w:rPr>
-              <w:t xml:space="preserve">: Configuración de Spring </w:t>
-            </w:r>
-            <w:proofErr w:type="spellStart"/>
-            <w:r>
-              <w:rPr>
-                <w:rFonts w:ascii="Calibri" w:eastAsia="Calibri" w:hAnsi="Calibri" w:cs="Calibri"/>
-                <w:color w:val="1F4E79" w:themeColor="accent5" w:themeShade="80"/>
-                <w:sz w:val="22"/>
-                <w:szCs w:val="22"/>
-              </w:rPr>
-              <w:t>boot</w:t>
-            </w:r>
-            <w:proofErr w:type="spellEnd"/>
-            <w:r>
-              <w:rPr>
-                <w:rFonts w:ascii="Calibri" w:eastAsia="Calibri" w:hAnsi="Calibri" w:cs="Calibri"/>
-                <w:color w:val="1F4E79" w:themeColor="accent5" w:themeShade="80"/>
-                <w:sz w:val="22"/>
-                <w:szCs w:val="22"/>
-              </w:rPr>
-              <w:t xml:space="preserve"> para la lógica de negocio pesada y gestión de la base de datos.</w:t>
+              <w:t>: Configuración de Spring boot para la lógica de negocio pesada y gestión de la base de datos.</w:t>
             </w:r>
           </w:p>
           <w:p>
@@ -4778,21 +4584,8 @@
                 <w:sz w:val="22"/>
                 <w:szCs w:val="22"/>
               </w:rPr>
-              <w:t xml:space="preserve">Desarrollo del </w:t>
-            </w:r>
-            <w:proofErr w:type="spellStart"/>
-            <w:r>
-              <w:rPr>
-                <w:rFonts w:ascii="Calibri" w:eastAsia="Calibri" w:hAnsi="Calibri" w:cs="Calibri"/>
-                <w:b/>
-                <w:bCs/>
-                <w:color w:val="1F4E79" w:themeColor="accent5" w:themeShade="80"/>
-                <w:sz w:val="22"/>
-                <w:szCs w:val="22"/>
-              </w:rPr>
-              <w:t>Frontend</w:t>
-            </w:r>
-            <w:proofErr w:type="spellEnd"/>
+              <w:t>Desarrollo del Frontend</w:t>
+            </w:r>
             <w:r>
               <w:rPr>
                 <w:rFonts w:ascii="Calibri" w:eastAsia="Calibri" w:hAnsi="Calibri" w:cs="Calibri"/>
@@ -4870,27 +4663,7 @@
                 <w:sz w:val="22"/>
                 <w:szCs w:val="22"/>
               </w:rPr>
-              <w:t xml:space="preserve">: Pruebas unitarias con librerías estándar para </w:t>
-            </w:r>
-            <w:proofErr w:type="spellStart"/>
-            <w:r>
-              <w:rPr>
-                <w:rFonts w:ascii="Calibri" w:eastAsia="Calibri" w:hAnsi="Calibri" w:cs="Calibri"/>
-                <w:color w:val="1F4E79" w:themeColor="accent5" w:themeShade="80"/>
-                <w:sz w:val="22"/>
-                <w:szCs w:val="22"/>
-              </w:rPr>
-              <w:t>React</w:t>
-            </w:r>
-            <w:proofErr w:type="spellEnd"/>
-            <w:r>
-              <w:rPr>
-                <w:rFonts w:ascii="Calibri" w:eastAsia="Calibri" w:hAnsi="Calibri" w:cs="Calibri"/>
-                <w:color w:val="1F4E79" w:themeColor="accent5" w:themeShade="80"/>
-                <w:sz w:val="22"/>
-                <w:szCs w:val="22"/>
-              </w:rPr>
-              <w:t xml:space="preserve"> Native/JS.</w:t>
+              <w:t>: Pruebas unitarias con librerías estándar para React Native/JS.</w:t>
             </w:r>
           </w:p>
           <w:p>
@@ -5181,6 +4954,8 @@
               <w:jc w:val="both"/>
               <w:rPr>
                 <w:rFonts w:ascii="Calibri" w:eastAsia="Calibri" w:hAnsi="Calibri" w:cs="Calibri"/>
+                <w:b/>
+                <w:bCs/>
                 <w:color w:val="548DD4"/>
                 <w:sz w:val="20"/>
                 <w:szCs w:val="20"/>
@@ -5189,6 +4964,8 @@
             <w:r>
               <w:rPr>
                 <w:rFonts w:ascii="Calibri" w:eastAsia="Calibri" w:hAnsi="Calibri" w:cs="Calibri"/>
+                <w:b/>
+                <w:bCs/>
                 <w:i/>
                 <w:iCs/>
                 <w:color w:val="548DD4"/>
@@ -5211,30 +4988,6 @@
                 <w:szCs w:val="20"/>
               </w:rPr>
             </w:pPr>
-          </w:p>
-          <w:p>
-            <w:pPr>
-              <w:spacing w:line="259" w:lineRule="auto"/>
-              <w:jc w:val="both"/>
-              <w:rPr>
-                <w:rFonts w:ascii="Calibri" w:eastAsia="Calibri" w:hAnsi="Calibri" w:cs="Calibri"/>
-                <w:color w:val="548DD4"/>
-                <w:sz w:val="20"/>
-                <w:szCs w:val="20"/>
-              </w:rPr>
-            </w:pPr>
-          </w:p>
-          <w:p>
-            <w:pPr>
-              <w:spacing w:line="259" w:lineRule="auto"/>
-              <w:jc w:val="both"/>
-              <w:rPr>
-                <w:rFonts w:ascii="Calibri" w:eastAsia="Calibri" w:hAnsi="Calibri" w:cs="Calibri"/>
-                <w:color w:val="548DD4"/>
-                <w:sz w:val="20"/>
-                <w:szCs w:val="20"/>
-              </w:rPr>
-            </w:pPr>
             <w:r>
               <w:rPr>
                 <w:rFonts w:ascii="Calibri" w:eastAsia="Calibri" w:hAnsi="Calibri" w:cs="Calibri"/>
@@ -5244,13 +4997,9 @@
                 <w:sz w:val="20"/>
                 <w:szCs w:val="20"/>
               </w:rPr>
-              <w:t>Arquitectura de software:</w:t>
-            </w:r>
-          </w:p>
-          <w:p>
-            <w:pPr>
-              <w:spacing w:line="259" w:lineRule="auto"/>
-              <w:jc w:val="both"/>
+              <w:t>Se utilizará un modelo de Cloud Computing sin servidores físicos a través de las capas gratuitas de AWS y Supabase, realizando despliegues automatizados en Render y Vercel junto con almacenamiento en Supabase Storage</w:t>
+            </w:r>
+            <w:r>
               <w:rPr>
                 <w:rFonts w:ascii="Calibri" w:eastAsia="Calibri" w:hAnsi="Calibri" w:cs="Calibri"/>
                 <w:i/>
@@ -5259,7 +5008,8 @@
                 <w:sz w:val="20"/>
                 <w:szCs w:val="20"/>
               </w:rPr>
-            </w:pPr>
+              <w:t>.</w:t>
+            </w:r>
           </w:p>
           <w:p>
             <w:pPr>
@@ -5279,6 +5029,8 @@
               <w:jc w:val="both"/>
               <w:rPr>
                 <w:rFonts w:ascii="Calibri" w:eastAsia="Calibri" w:hAnsi="Calibri" w:cs="Calibri"/>
+                <w:b/>
+                <w:bCs/>
                 <w:color w:val="548DD4"/>
                 <w:sz w:val="20"/>
                 <w:szCs w:val="20"/>
@@ -5287,13 +5039,15 @@
             <w:r>
               <w:rPr>
                 <w:rFonts w:ascii="Calibri" w:eastAsia="Calibri" w:hAnsi="Calibri" w:cs="Calibri"/>
+                <w:b/>
+                <w:bCs/>
                 <w:i/>
                 <w:iCs/>
                 <w:color w:val="548DD4"/>
                 <w:sz w:val="20"/>
                 <w:szCs w:val="20"/>
               </w:rPr>
-              <w:t>Lenguajes de programación:</w:t>
+              <w:t>Arquitectura de software:</w:t>
             </w:r>
           </w:p>
           <w:p>
@@ -5309,30 +5063,6 @@
                 <w:szCs w:val="20"/>
               </w:rPr>
             </w:pPr>
-          </w:p>
-          <w:p>
-            <w:pPr>
-              <w:spacing w:line="259" w:lineRule="auto"/>
-              <w:jc w:val="both"/>
-              <w:rPr>
-                <w:rFonts w:ascii="Calibri" w:eastAsia="Calibri" w:hAnsi="Calibri" w:cs="Calibri"/>
-                <w:color w:val="548DD4"/>
-                <w:sz w:val="20"/>
-                <w:szCs w:val="20"/>
-              </w:rPr>
-            </w:pPr>
-          </w:p>
-          <w:p>
-            <w:pPr>
-              <w:spacing w:line="259" w:lineRule="auto"/>
-              <w:jc w:val="both"/>
-              <w:rPr>
-                <w:rFonts w:ascii="Calibri" w:eastAsia="Calibri" w:hAnsi="Calibri" w:cs="Calibri"/>
-                <w:color w:val="548DD4"/>
-                <w:sz w:val="20"/>
-                <w:szCs w:val="20"/>
-              </w:rPr>
-            </w:pPr>
             <w:r>
               <w:rPr>
                 <w:rFonts w:ascii="Calibri" w:eastAsia="Calibri" w:hAnsi="Calibri" w:cs="Calibri"/>
@@ -5342,7 +5072,7 @@
                 <w:sz w:val="20"/>
                 <w:szCs w:val="20"/>
               </w:rPr>
-              <w:t>Framework, dependencias y/o librerías a utilizar:</w:t>
+              <w:t>Se ha optado por una arquitectura híbrida (Monolito + Microservicios) y desacoplada, utilizando un núcleo central para funciones transversales y módulos u endpoints independientes (Auth API, Inventario y Biometric Broker) que aseguran alta cohesión y bajo acoplamiento.</w:t>
             </w:r>
           </w:p>
           <w:p>
@@ -5351,38 +5081,43 @@
               <w:jc w:val="both"/>
               <w:rPr>
                 <w:rFonts w:ascii="Calibri" w:eastAsia="Calibri" w:hAnsi="Calibri" w:cs="Calibri"/>
+                <w:color w:val="548DD4"/>
+                <w:sz w:val="20"/>
+                <w:szCs w:val="20"/>
+              </w:rPr>
+            </w:pPr>
+          </w:p>
+          <w:p>
+            <w:pPr>
+              <w:spacing w:line="259" w:lineRule="auto"/>
+              <w:jc w:val="both"/>
+              <w:rPr>
+                <w:rFonts w:ascii="Calibri" w:eastAsia="Calibri" w:hAnsi="Calibri" w:cs="Calibri"/>
+                <w:b/>
+                <w:bCs/>
+                <w:color w:val="548DD4"/>
+                <w:sz w:val="20"/>
+                <w:szCs w:val="20"/>
+              </w:rPr>
+            </w:pPr>
+            <w:r>
+              <w:rPr>
+                <w:rFonts w:ascii="Calibri" w:eastAsia="Calibri" w:hAnsi="Calibri" w:cs="Calibri"/>
+                <w:b/>
+                <w:bCs/>
                 <w:i/>
                 <w:iCs/>
                 <w:color w:val="548DD4"/>
                 <w:sz w:val="20"/>
                 <w:szCs w:val="20"/>
               </w:rPr>
-            </w:pPr>
+              <w:t>Lenguajes de programación:</w:t>
+            </w:r>
           </w:p>
           <w:p>
             <w:pPr>
               <w:spacing w:line="259" w:lineRule="auto"/>
               <w:jc w:val="both"/>
-              <w:rPr>
-                <w:rFonts w:ascii="Calibri" w:eastAsia="Calibri" w:hAnsi="Calibri" w:cs="Calibri"/>
-                <w:color w:val="548DD4"/>
-                <w:sz w:val="20"/>
-                <w:szCs w:val="20"/>
-              </w:rPr>
-            </w:pPr>
-          </w:p>
-          <w:p>
-            <w:pPr>
-              <w:spacing w:line="259" w:lineRule="auto"/>
-              <w:jc w:val="both"/>
-              <w:rPr>
-                <w:rFonts w:ascii="Calibri" w:eastAsia="Calibri" w:hAnsi="Calibri" w:cs="Calibri"/>
-                <w:color w:val="548DD4"/>
-                <w:sz w:val="20"/>
-                <w:szCs w:val="20"/>
-              </w:rPr>
-            </w:pPr>
-            <w:r>
               <w:rPr>
                 <w:rFonts w:ascii="Calibri" w:eastAsia="Calibri" w:hAnsi="Calibri" w:cs="Calibri"/>
                 <w:i/>
@@ -5391,13 +5126,8 @@
                 <w:sz w:val="20"/>
                 <w:szCs w:val="20"/>
               </w:rPr>
-              <w:t>Base de datos:</w:t>
-            </w:r>
-          </w:p>
-          <w:p>
-            <w:pPr>
-              <w:spacing w:line="259" w:lineRule="auto"/>
-              <w:jc w:val="both"/>
+            </w:pPr>
+            <w:r>
               <w:rPr>
                 <w:rFonts w:ascii="Calibri" w:eastAsia="Calibri" w:hAnsi="Calibri" w:cs="Calibri"/>
                 <w:i/>
@@ -5406,31 +5136,8 @@
                 <w:sz w:val="20"/>
                 <w:szCs w:val="20"/>
               </w:rPr>
-            </w:pPr>
-          </w:p>
-          <w:p>
-            <w:pPr>
-              <w:spacing w:line="259" w:lineRule="auto"/>
-              <w:jc w:val="both"/>
-              <w:rPr>
-                <w:rFonts w:ascii="Calibri" w:eastAsia="Calibri" w:hAnsi="Calibri" w:cs="Calibri"/>
-                <w:color w:val="548DD4"/>
-                <w:sz w:val="20"/>
-                <w:szCs w:val="20"/>
-              </w:rPr>
-            </w:pPr>
-          </w:p>
-          <w:p>
-            <w:pPr>
-              <w:spacing w:line="259" w:lineRule="auto"/>
-              <w:jc w:val="both"/>
-              <w:rPr>
-                <w:rFonts w:ascii="Calibri" w:eastAsia="Calibri" w:hAnsi="Calibri" w:cs="Calibri"/>
-                <w:color w:val="548DD4"/>
-                <w:sz w:val="20"/>
-                <w:szCs w:val="20"/>
-              </w:rPr>
-            </w:pPr>
+              <w:t>Se emplean JavaScript y TypeScript como lenguajes de programación principales para el desarrollo de interfaces, la lógica de negocio y el tipado estricto en el servidor.</w:t>
+            </w:r>
             <w:r>
               <w:rPr>
                 <w:rFonts w:ascii="Calibri" w:eastAsia="Calibri" w:hAnsi="Calibri" w:cs="Calibri"/>
@@ -5440,7 +5147,7 @@
                 <w:sz w:val="20"/>
                 <w:szCs w:val="20"/>
               </w:rPr>
-              <w:t>Repositorio:</w:t>
+              <w:t xml:space="preserve"> Y se utiliza Java para el backend hecho en Spring Boot.</w:t>
             </w:r>
           </w:p>
           <w:p>
@@ -5449,13 +5156,38 @@
               <w:jc w:val="both"/>
               <w:rPr>
                 <w:rFonts w:ascii="Calibri" w:eastAsia="Calibri" w:hAnsi="Calibri" w:cs="Calibri"/>
+                <w:color w:val="548DD4"/>
+                <w:sz w:val="20"/>
+                <w:szCs w:val="20"/>
+              </w:rPr>
+            </w:pPr>
+          </w:p>
+          <w:p>
+            <w:pPr>
+              <w:spacing w:line="259" w:lineRule="auto"/>
+              <w:jc w:val="both"/>
+              <w:rPr>
+                <w:rFonts w:ascii="Calibri" w:eastAsia="Calibri" w:hAnsi="Calibri" w:cs="Calibri"/>
+                <w:b/>
+                <w:bCs/>
+                <w:color w:val="548DD4"/>
+                <w:sz w:val="20"/>
+                <w:szCs w:val="20"/>
+              </w:rPr>
+            </w:pPr>
+            <w:r>
+              <w:rPr>
+                <w:rFonts w:ascii="Calibri" w:eastAsia="Calibri" w:hAnsi="Calibri" w:cs="Calibri"/>
+                <w:b/>
+                <w:bCs/>
                 <w:i/>
                 <w:iCs/>
                 <w:color w:val="548DD4"/>
                 <w:sz w:val="20"/>
                 <w:szCs w:val="20"/>
               </w:rPr>
-            </w:pPr>
+              <w:t>Framework, dependencias y/o librerías a utilizar:</w:t>
+            </w:r>
           </w:p>
           <w:p>
             <w:pPr>
@@ -5470,18 +5202,6 @@
                 <w:szCs w:val="20"/>
               </w:rPr>
             </w:pPr>
-          </w:p>
-          <w:p>
-            <w:pPr>
-              <w:spacing w:line="259" w:lineRule="auto"/>
-              <w:jc w:val="both"/>
-              <w:rPr>
-                <w:rFonts w:ascii="Calibri" w:eastAsia="Calibri" w:hAnsi="Calibri" w:cs="Calibri"/>
-                <w:color w:val="548DD4"/>
-                <w:sz w:val="20"/>
-                <w:szCs w:val="20"/>
-              </w:rPr>
-            </w:pPr>
             <w:r>
               <w:rPr>
                 <w:rFonts w:ascii="Calibri" w:eastAsia="Calibri" w:hAnsi="Calibri" w:cs="Calibri"/>
@@ -5491,13 +5211,10 @@
                 <w:sz w:val="20"/>
                 <w:szCs w:val="20"/>
               </w:rPr>
-              <w:t>Otros:</w:t>
-            </w:r>
-          </w:p>
-          <w:p>
-            <w:pPr>
-              <w:spacing w:line="259" w:lineRule="auto"/>
-              <w:jc w:val="both"/>
+              <w:lastRenderedPageBreak/>
+              <w:t xml:space="preserve">Se utiliza React y React Native junto con la herramienta estructuradora Expo para el desarrollo multiplataforma móvil y </w:t>
+            </w:r>
+            <w:r>
               <w:rPr>
                 <w:rFonts w:ascii="Calibri" w:eastAsia="Calibri" w:hAnsi="Calibri" w:cs="Calibri"/>
                 <w:i/>
@@ -5506,7 +5223,235 @@
                 <w:sz w:val="20"/>
                 <w:szCs w:val="20"/>
               </w:rPr>
-            </w:pPr>
+              <w:t>web,</w:t>
+            </w:r>
+            <w:r>
+              <w:rPr>
+                <w:rFonts w:ascii="Calibri" w:eastAsia="Calibri" w:hAnsi="Calibri" w:cs="Calibri"/>
+                <w:i/>
+                <w:iCs/>
+                <w:color w:val="548DD4"/>
+                <w:sz w:val="20"/>
+                <w:szCs w:val="20"/>
+              </w:rPr>
+              <w:t xml:space="preserve"> Express.js (o Spring Boot) combinado con el ORM Prisma para la lógica del </w:t>
+            </w:r>
+            <w:r>
+              <w:rPr>
+                <w:rFonts w:ascii="Calibri" w:eastAsia="Calibri" w:hAnsi="Calibri" w:cs="Calibri"/>
+                <w:i/>
+                <w:iCs/>
+                <w:color w:val="548DD4"/>
+                <w:sz w:val="20"/>
+                <w:szCs w:val="20"/>
+              </w:rPr>
+              <w:t>backend,</w:t>
+            </w:r>
+            <w:r>
+              <w:rPr>
+                <w:rFonts w:ascii="Calibri" w:eastAsia="Calibri" w:hAnsi="Calibri" w:cs="Calibri"/>
+                <w:i/>
+                <w:iCs/>
+                <w:color w:val="548DD4"/>
+                <w:sz w:val="20"/>
+                <w:szCs w:val="20"/>
+              </w:rPr>
+              <w:t xml:space="preserve"> y NPM como el gestor de paquetes de dependencias.</w:t>
+            </w:r>
+          </w:p>
+          <w:p>
+            <w:pPr>
+              <w:spacing w:line="259" w:lineRule="auto"/>
+              <w:jc w:val="both"/>
+              <w:rPr>
+                <w:rFonts w:ascii="Calibri" w:eastAsia="Calibri" w:hAnsi="Calibri" w:cs="Calibri"/>
+                <w:color w:val="548DD4"/>
+                <w:sz w:val="20"/>
+                <w:szCs w:val="20"/>
+              </w:rPr>
+            </w:pPr>
+          </w:p>
+          <w:p>
+            <w:pPr>
+              <w:spacing w:line="259" w:lineRule="auto"/>
+              <w:jc w:val="both"/>
+              <w:rPr>
+                <w:rFonts w:ascii="Calibri" w:eastAsia="Calibri" w:hAnsi="Calibri" w:cs="Calibri"/>
+                <w:b/>
+                <w:bCs/>
+                <w:color w:val="548DD4"/>
+                <w:sz w:val="20"/>
+                <w:szCs w:val="20"/>
+              </w:rPr>
+            </w:pPr>
+            <w:r>
+              <w:rPr>
+                <w:rFonts w:ascii="Calibri" w:eastAsia="Calibri" w:hAnsi="Calibri" w:cs="Calibri"/>
+                <w:b/>
+                <w:bCs/>
+                <w:i/>
+                <w:iCs/>
+                <w:color w:val="548DD4"/>
+                <w:sz w:val="20"/>
+                <w:szCs w:val="20"/>
+              </w:rPr>
+              <w:t>Base de datos:</w:t>
+            </w:r>
+          </w:p>
+          <w:p>
+            <w:pPr>
+              <w:spacing w:line="259" w:lineRule="auto"/>
+              <w:jc w:val="both"/>
+              <w:rPr>
+                <w:rFonts w:ascii="Calibri" w:eastAsia="Calibri" w:hAnsi="Calibri" w:cs="Calibri"/>
+                <w:i/>
+                <w:iCs/>
+                <w:color w:val="548DD4"/>
+                <w:sz w:val="20"/>
+                <w:szCs w:val="20"/>
+              </w:rPr>
+            </w:pPr>
+            <w:r>
+              <w:rPr>
+                <w:rFonts w:ascii="Calibri" w:eastAsia="Calibri" w:hAnsi="Calibri" w:cs="Calibri"/>
+                <w:i/>
+                <w:iCs/>
+                <w:color w:val="548DD4"/>
+                <w:sz w:val="20"/>
+                <w:szCs w:val="20"/>
+              </w:rPr>
+              <w:t>Corresponde a un motor relacional PostgreSQL robusto configurado sobre la infraestructura BaaS de Supabase para dar soporte a transacciones cruzadas complejas y sincronización de datos en tiempo real.</w:t>
+            </w:r>
+          </w:p>
+          <w:p>
+            <w:pPr>
+              <w:spacing w:line="259" w:lineRule="auto"/>
+              <w:jc w:val="both"/>
+              <w:rPr>
+                <w:rFonts w:ascii="Calibri" w:eastAsia="Calibri" w:hAnsi="Calibri" w:cs="Calibri"/>
+                <w:color w:val="548DD4"/>
+                <w:sz w:val="20"/>
+                <w:szCs w:val="20"/>
+              </w:rPr>
+            </w:pPr>
+          </w:p>
+          <w:p>
+            <w:pPr>
+              <w:spacing w:line="259" w:lineRule="auto"/>
+              <w:jc w:val="both"/>
+              <w:rPr>
+                <w:rFonts w:ascii="Calibri" w:eastAsia="Calibri" w:hAnsi="Calibri" w:cs="Calibri"/>
+                <w:b/>
+                <w:bCs/>
+                <w:color w:val="548DD4"/>
+                <w:sz w:val="20"/>
+                <w:szCs w:val="20"/>
+              </w:rPr>
+            </w:pPr>
+            <w:r>
+              <w:rPr>
+                <w:rFonts w:ascii="Calibri" w:eastAsia="Calibri" w:hAnsi="Calibri" w:cs="Calibri"/>
+                <w:b/>
+                <w:bCs/>
+                <w:i/>
+                <w:iCs/>
+                <w:color w:val="548DD4"/>
+                <w:sz w:val="20"/>
+                <w:szCs w:val="20"/>
+              </w:rPr>
+              <w:t>Repositorio:</w:t>
+            </w:r>
+          </w:p>
+          <w:p>
+            <w:pPr>
+              <w:spacing w:line="259" w:lineRule="auto"/>
+              <w:jc w:val="both"/>
+              <w:rPr>
+                <w:rFonts w:ascii="Calibri" w:eastAsia="Calibri" w:hAnsi="Calibri" w:cs="Calibri"/>
+                <w:i/>
+                <w:iCs/>
+                <w:color w:val="548DD4"/>
+                <w:sz w:val="20"/>
+                <w:szCs w:val="20"/>
+              </w:rPr>
+            </w:pPr>
+            <w:r>
+              <w:rPr>
+                <w:rFonts w:ascii="Calibri" w:eastAsia="Calibri" w:hAnsi="Calibri" w:cs="Calibri"/>
+                <w:i/>
+                <w:iCs/>
+                <w:color w:val="548DD4"/>
+                <w:sz w:val="20"/>
+                <w:szCs w:val="20"/>
+              </w:rPr>
+              <w:t>Control de versiones distribuido mediante la herramienta Git y alojamiento del código fuente en la nube a través de la plataforma GitHub.</w:t>
+            </w:r>
+          </w:p>
+          <w:p>
+            <w:pPr>
+              <w:spacing w:line="259" w:lineRule="auto"/>
+              <w:jc w:val="both"/>
+              <w:rPr>
+                <w:rFonts w:ascii="Calibri" w:eastAsia="Calibri" w:hAnsi="Calibri" w:cs="Calibri"/>
+                <w:i/>
+                <w:iCs/>
+                <w:color w:val="548DD4"/>
+                <w:sz w:val="20"/>
+                <w:szCs w:val="20"/>
+              </w:rPr>
+            </w:pPr>
+          </w:p>
+          <w:p>
+            <w:pPr>
+              <w:spacing w:line="259" w:lineRule="auto"/>
+              <w:jc w:val="both"/>
+              <w:rPr>
+                <w:rFonts w:ascii="Calibri" w:eastAsia="Calibri" w:hAnsi="Calibri" w:cs="Calibri"/>
+                <w:b/>
+                <w:bCs/>
+                <w:color w:val="548DD4"/>
+                <w:sz w:val="20"/>
+                <w:szCs w:val="20"/>
+              </w:rPr>
+            </w:pPr>
+            <w:r>
+              <w:rPr>
+                <w:rFonts w:ascii="Calibri" w:eastAsia="Calibri" w:hAnsi="Calibri" w:cs="Calibri"/>
+                <w:b/>
+                <w:bCs/>
+                <w:i/>
+                <w:iCs/>
+                <w:color w:val="548DD4"/>
+                <w:sz w:val="20"/>
+                <w:szCs w:val="20"/>
+              </w:rPr>
+              <w:t>Otros:</w:t>
+            </w:r>
+          </w:p>
+          <w:p>
+            <w:pPr>
+              <w:spacing w:line="259" w:lineRule="auto"/>
+              <w:jc w:val="both"/>
+              <w:rPr>
+                <w:rFonts w:ascii="Calibri" w:eastAsia="Calibri" w:hAnsi="Calibri" w:cs="Calibri"/>
+                <w:i/>
+                <w:iCs/>
+                <w:color w:val="548DD4"/>
+                <w:sz w:val="20"/>
+                <w:szCs w:val="20"/>
+              </w:rPr>
+            </w:pPr>
+            <w:r>
+              <w:rPr>
+                <w:rFonts w:ascii="Calibri" w:eastAsia="Calibri" w:hAnsi="Calibri" w:cs="Calibri"/>
+                <w:i/>
+                <w:iCs/>
+                <w:color w:val="548DD4"/>
+                <w:sz w:val="20"/>
+                <w:szCs w:val="20"/>
+              </w:rPr>
+              <w:t>Validación biométrica e identidad facial por medio de la API de Amazon Rekognition, gestión del proyecto bajo el marco de trabajo ágil Scrum y Kanban con Trello o Jira.</w:t>
+            </w:r>
           </w:p>
           <w:p>
             <w:pPr>
@@ -5838,31 +5783,7 @@
                 <w:sz w:val="22"/>
                 <w:szCs w:val="22"/>
               </w:rPr>
-              <w:t xml:space="preserve">Nombre </w:t>
-            </w:r>
-            <w:proofErr w:type="gramStart"/>
-            <w:r>
-              <w:rPr>
-                <w:rFonts w:ascii="Calibri" w:eastAsia="Calibri" w:hAnsi="Calibri" w:cs="Calibri"/>
-                <w:b/>
-                <w:bCs/>
-                <w:color w:val="1F4E79" w:themeColor="accent5" w:themeShade="80"/>
-                <w:sz w:val="22"/>
-                <w:szCs w:val="22"/>
-              </w:rPr>
-              <w:t>de  Actividades</w:t>
-            </w:r>
-            <w:proofErr w:type="gramEnd"/>
-            <w:r>
-              <w:rPr>
-                <w:rFonts w:ascii="Calibri" w:eastAsia="Calibri" w:hAnsi="Calibri" w:cs="Calibri"/>
-                <w:b/>
-                <w:bCs/>
-                <w:color w:val="1F4E79" w:themeColor="accent5" w:themeShade="80"/>
-                <w:sz w:val="22"/>
-                <w:szCs w:val="22"/>
-              </w:rPr>
-              <w:t>/Tareas</w:t>
+              <w:t>Nombre de  Actividades/Tareas</w:t>
             </w:r>
           </w:p>
         </w:tc>
@@ -6864,47 +6785,7 @@
                 <w:sz w:val="22"/>
                 <w:szCs w:val="22"/>
               </w:rPr>
-              <w:t>Declarar las evidencias a diseñar para el proyecto. Estas evidencias deben ser acordadas con el docente, dependiendo de la dimensión del proyecto. Todas las evidencias deben estar en formato .</w:t>
-            </w:r>
-            <w:proofErr w:type="spellStart"/>
-            <w:r>
-              <w:rPr>
-                <w:rFonts w:ascii="Calibri" w:eastAsia="Calibri" w:hAnsi="Calibri" w:cs="Calibri"/>
-                <w:color w:val="1F4E79" w:themeColor="accent5" w:themeShade="80"/>
-                <w:sz w:val="22"/>
-                <w:szCs w:val="22"/>
-              </w:rPr>
-              <w:t>pdf</w:t>
-            </w:r>
-            <w:proofErr w:type="spellEnd"/>
-            <w:r>
-              <w:rPr>
-                <w:rFonts w:ascii="Calibri" w:eastAsia="Calibri" w:hAnsi="Calibri" w:cs="Calibri"/>
-                <w:color w:val="1F4E79" w:themeColor="accent5" w:themeShade="80"/>
-                <w:sz w:val="22"/>
-                <w:szCs w:val="22"/>
-              </w:rPr>
-              <w:t>, .xls, .xlsx, .</w:t>
-            </w:r>
-            <w:proofErr w:type="spellStart"/>
-            <w:r>
-              <w:rPr>
-                <w:rFonts w:ascii="Calibri" w:eastAsia="Calibri" w:hAnsi="Calibri" w:cs="Calibri"/>
-                <w:color w:val="1F4E79" w:themeColor="accent5" w:themeShade="80"/>
-                <w:sz w:val="22"/>
-                <w:szCs w:val="22"/>
-              </w:rPr>
-              <w:t>doc</w:t>
-            </w:r>
-            <w:proofErr w:type="spellEnd"/>
-            <w:r>
-              <w:rPr>
-                <w:rFonts w:ascii="Calibri" w:eastAsia="Calibri" w:hAnsi="Calibri" w:cs="Calibri"/>
-                <w:color w:val="1F4E79" w:themeColor="accent5" w:themeShade="80"/>
-                <w:sz w:val="22"/>
-                <w:szCs w:val="22"/>
-              </w:rPr>
-              <w:t xml:space="preserve"> o .docx, según corresponda y deben ser legibles para el docente.</w:t>
+              <w:t>Declarar las evidencias a diseñar para el proyecto. Estas evidencias deben ser acordadas con el docente, dependiendo de la dimensión del proyecto. Todas las evidencias deben estar en formato .pdf, .xls, .xlsx, .doc o .docx, según corresponda y deben ser legibles para el docente.</w:t>
             </w:r>
           </w:p>
         </w:tc>
@@ -6979,6 +6860,7 @@
                 <w:sz w:val="22"/>
                 <w:szCs w:val="22"/>
               </w:rPr>
+              <w:lastRenderedPageBreak/>
               <w:t>Nro.</w:t>
             </w:r>
           </w:p>
@@ -7192,9 +7074,35 @@
                 <w:sz w:val="18"/>
                 <w:szCs w:val="18"/>
               </w:rPr>
-              <w:t xml:space="preserve">Describir tipo de información que entregará esta evidencia. </w:t>
-            </w:r>
-            <w:proofErr w:type="spellStart"/>
+              <w:t>Describir tipo de información que entregará esta evidencia. Ej: Planificación, MER, Caso de uso, etc</w:t>
+            </w:r>
+          </w:p>
+        </w:tc>
+        <w:tc>
+          <w:tcPr>
+            <w:tcW w:w="2413" w:type="dxa"/>
+            <w:tcBorders>
+              <w:top w:val="single" w:sz="6" w:space="0" w:color="BFBFBF" w:themeColor="background1" w:themeShade="BF"/>
+              <w:left w:val="single" w:sz="6" w:space="0" w:color="BFBFBF" w:themeColor="background1" w:themeShade="BF"/>
+              <w:bottom w:val="single" w:sz="6" w:space="0" w:color="BFBFBF" w:themeColor="background1" w:themeShade="BF"/>
+              <w:right w:val="single" w:sz="6" w:space="0" w:color="BFBFBF" w:themeColor="background1" w:themeShade="BF"/>
+            </w:tcBorders>
+            <w:tcMar>
+              <w:left w:w="105" w:type="dxa"/>
+              <w:right w:w="105" w:type="dxa"/>
+            </w:tcMar>
+          </w:tcPr>
+          <w:p>
+            <w:pPr>
+              <w:pStyle w:val="Piedepgina"/>
+              <w:jc w:val="both"/>
+              <w:rPr>
+                <w:rFonts w:ascii="Calibri" w:eastAsia="Calibri" w:hAnsi="Calibri" w:cs="Calibri"/>
+                <w:color w:val="5B9BD5" w:themeColor="accent5"/>
+                <w:sz w:val="18"/>
+                <w:szCs w:val="18"/>
+              </w:rPr>
+            </w:pPr>
             <w:r>
               <w:rPr>
                 <w:rFonts w:ascii="Calibri" w:eastAsia="Calibri" w:hAnsi="Calibri" w:cs="Calibri"/>
@@ -7204,9 +7112,70 @@
                 <w:sz w:val="18"/>
                 <w:szCs w:val="18"/>
               </w:rPr>
-              <w:t>Ej</w:t>
-            </w:r>
-            <w:proofErr w:type="spellEnd"/>
+              <w:t>Describir de forma sencilla la información que tendrá el documento.</w:t>
+            </w:r>
+          </w:p>
+        </w:tc>
+        <w:tc>
+          <w:tcPr>
+            <w:tcW w:w="2202" w:type="dxa"/>
+            <w:tcBorders>
+              <w:top w:val="single" w:sz="6" w:space="0" w:color="BFBFBF" w:themeColor="background1" w:themeShade="BF"/>
+              <w:left w:val="single" w:sz="6" w:space="0" w:color="BFBFBF" w:themeColor="background1" w:themeShade="BF"/>
+              <w:bottom w:val="single" w:sz="6" w:space="0" w:color="BFBFBF" w:themeColor="background1" w:themeShade="BF"/>
+              <w:right w:val="single" w:sz="6" w:space="0" w:color="BFBFBF" w:themeColor="background1" w:themeShade="BF"/>
+            </w:tcBorders>
+            <w:tcMar>
+              <w:left w:w="105" w:type="dxa"/>
+              <w:right w:w="105" w:type="dxa"/>
+            </w:tcMar>
+          </w:tcPr>
+          <w:p>
+            <w:pPr>
+              <w:tabs>
+                <w:tab w:val="center" w:pos="4419"/>
+                <w:tab w:val="right" w:pos="8838"/>
+              </w:tabs>
+              <w:jc w:val="both"/>
+              <w:rPr>
+                <w:rFonts w:ascii="Calibri" w:eastAsia="Calibri" w:hAnsi="Calibri" w:cs="Calibri"/>
+                <w:color w:val="1F4E79" w:themeColor="accent5" w:themeShade="80"/>
+                <w:sz w:val="22"/>
+                <w:szCs w:val="22"/>
+              </w:rPr>
+            </w:pPr>
+          </w:p>
+        </w:tc>
+      </w:tr>
+      <w:tr>
+        <w:trPr>
+          <w:trHeight w:val="360"/>
+        </w:trPr>
+        <w:tc>
+          <w:tcPr>
+            <w:tcW w:w="541" w:type="dxa"/>
+            <w:tcBorders>
+              <w:top w:val="single" w:sz="6" w:space="0" w:color="BFBFBF" w:themeColor="background1" w:themeShade="BF"/>
+              <w:left w:val="single" w:sz="6" w:space="0" w:color="BFBFBF" w:themeColor="background1" w:themeShade="BF"/>
+              <w:bottom w:val="single" w:sz="6" w:space="0" w:color="BFBFBF" w:themeColor="background1" w:themeShade="BF"/>
+              <w:right w:val="single" w:sz="6" w:space="0" w:color="BFBFBF" w:themeColor="background1" w:themeShade="BF"/>
+            </w:tcBorders>
+            <w:tcMar>
+              <w:left w:w="105" w:type="dxa"/>
+              <w:right w:w="105" w:type="dxa"/>
+            </w:tcMar>
+          </w:tcPr>
+          <w:p>
+            <w:pPr>
+              <w:pStyle w:val="Piedepgina"/>
+              <w:jc w:val="center"/>
+              <w:rPr>
+                <w:rFonts w:ascii="Calibri" w:eastAsia="Calibri" w:hAnsi="Calibri" w:cs="Calibri"/>
+                <w:color w:val="5B9BD5" w:themeColor="accent5"/>
+                <w:sz w:val="18"/>
+                <w:szCs w:val="18"/>
+              </w:rPr>
+            </w:pPr>
             <w:r>
               <w:rPr>
                 <w:rFonts w:ascii="Calibri" w:eastAsia="Calibri" w:hAnsi="Calibri" w:cs="Calibri"/>
@@ -7216,9 +7185,130 @@
                 <w:sz w:val="18"/>
                 <w:szCs w:val="18"/>
               </w:rPr>
-              <w:t xml:space="preserve">: Planificación, MER, Caso de uso, </w:t>
-            </w:r>
-            <w:proofErr w:type="spellStart"/>
+              <w:t>2</w:t>
+            </w:r>
+          </w:p>
+        </w:tc>
+        <w:tc>
+          <w:tcPr>
+            <w:tcW w:w="3679" w:type="dxa"/>
+            <w:tcBorders>
+              <w:top w:val="single" w:sz="6" w:space="0" w:color="BFBFBF" w:themeColor="background1" w:themeShade="BF"/>
+              <w:left w:val="single" w:sz="6" w:space="0" w:color="BFBFBF" w:themeColor="background1" w:themeShade="BF"/>
+              <w:bottom w:val="single" w:sz="6" w:space="0" w:color="BFBFBF" w:themeColor="background1" w:themeShade="BF"/>
+              <w:right w:val="single" w:sz="6" w:space="0" w:color="BFBFBF" w:themeColor="background1" w:themeShade="BF"/>
+            </w:tcBorders>
+            <w:tcMar>
+              <w:left w:w="105" w:type="dxa"/>
+              <w:right w:w="105" w:type="dxa"/>
+            </w:tcMar>
+          </w:tcPr>
+          <w:p>
+            <w:pPr>
+              <w:tabs>
+                <w:tab w:val="center" w:pos="4419"/>
+                <w:tab w:val="right" w:pos="8838"/>
+              </w:tabs>
+              <w:jc w:val="both"/>
+              <w:rPr>
+                <w:rFonts w:ascii="Calibri" w:eastAsia="Calibri" w:hAnsi="Calibri" w:cs="Calibri"/>
+                <w:color w:val="1F4E79" w:themeColor="accent5" w:themeShade="80"/>
+                <w:sz w:val="22"/>
+                <w:szCs w:val="22"/>
+              </w:rPr>
+            </w:pPr>
+          </w:p>
+        </w:tc>
+        <w:tc>
+          <w:tcPr>
+            <w:tcW w:w="2413" w:type="dxa"/>
+            <w:tcBorders>
+              <w:top w:val="single" w:sz="6" w:space="0" w:color="BFBFBF" w:themeColor="background1" w:themeShade="BF"/>
+              <w:left w:val="single" w:sz="6" w:space="0" w:color="BFBFBF" w:themeColor="background1" w:themeShade="BF"/>
+              <w:bottom w:val="single" w:sz="6" w:space="0" w:color="BFBFBF" w:themeColor="background1" w:themeShade="BF"/>
+              <w:right w:val="single" w:sz="6" w:space="0" w:color="BFBFBF" w:themeColor="background1" w:themeShade="BF"/>
+            </w:tcBorders>
+            <w:tcMar>
+              <w:left w:w="105" w:type="dxa"/>
+              <w:right w:w="105" w:type="dxa"/>
+            </w:tcMar>
+          </w:tcPr>
+          <w:p>
+            <w:pPr>
+              <w:tabs>
+                <w:tab w:val="center" w:pos="4419"/>
+                <w:tab w:val="right" w:pos="8838"/>
+              </w:tabs>
+              <w:jc w:val="both"/>
+              <w:rPr>
+                <w:rFonts w:ascii="Calibri" w:eastAsia="Calibri" w:hAnsi="Calibri" w:cs="Calibri"/>
+                <w:color w:val="1F4E79" w:themeColor="accent5" w:themeShade="80"/>
+                <w:sz w:val="22"/>
+                <w:szCs w:val="22"/>
+              </w:rPr>
+            </w:pPr>
+          </w:p>
+        </w:tc>
+        <w:tc>
+          <w:tcPr>
+            <w:tcW w:w="2202" w:type="dxa"/>
+            <w:tcBorders>
+              <w:top w:val="single" w:sz="6" w:space="0" w:color="BFBFBF" w:themeColor="background1" w:themeShade="BF"/>
+              <w:left w:val="single" w:sz="6" w:space="0" w:color="BFBFBF" w:themeColor="background1" w:themeShade="BF"/>
+              <w:bottom w:val="single" w:sz="6" w:space="0" w:color="BFBFBF" w:themeColor="background1" w:themeShade="BF"/>
+              <w:right w:val="single" w:sz="6" w:space="0" w:color="BFBFBF" w:themeColor="background1" w:themeShade="BF"/>
+            </w:tcBorders>
+            <w:tcMar>
+              <w:left w:w="105" w:type="dxa"/>
+              <w:right w:w="105" w:type="dxa"/>
+            </w:tcMar>
+          </w:tcPr>
+          <w:p>
+            <w:pPr>
+              <w:tabs>
+                <w:tab w:val="center" w:pos="4419"/>
+                <w:tab w:val="right" w:pos="8838"/>
+              </w:tabs>
+              <w:jc w:val="both"/>
+              <w:rPr>
+                <w:rFonts w:ascii="Calibri" w:eastAsia="Calibri" w:hAnsi="Calibri" w:cs="Calibri"/>
+                <w:color w:val="1F4E79" w:themeColor="accent5" w:themeShade="80"/>
+                <w:sz w:val="22"/>
+                <w:szCs w:val="22"/>
+              </w:rPr>
+            </w:pPr>
+          </w:p>
+        </w:tc>
+      </w:tr>
+      <w:tr>
+        <w:trPr>
+          <w:trHeight w:val="360"/>
+        </w:trPr>
+        <w:tc>
+          <w:tcPr>
+            <w:tcW w:w="541" w:type="dxa"/>
+            <w:tcBorders>
+              <w:top w:val="single" w:sz="6" w:space="0" w:color="BFBFBF" w:themeColor="background1" w:themeShade="BF"/>
+              <w:left w:val="single" w:sz="6" w:space="0" w:color="BFBFBF" w:themeColor="background1" w:themeShade="BF"/>
+              <w:bottom w:val="single" w:sz="6" w:space="0" w:color="BFBFBF" w:themeColor="background1" w:themeShade="BF"/>
+              <w:right w:val="single" w:sz="6" w:space="0" w:color="BFBFBF" w:themeColor="background1" w:themeShade="BF"/>
+            </w:tcBorders>
+            <w:tcMar>
+              <w:left w:w="105" w:type="dxa"/>
+              <w:right w:w="105" w:type="dxa"/>
+            </w:tcMar>
+          </w:tcPr>
+          <w:p>
+            <w:pPr>
+              <w:pStyle w:val="Piedepgina"/>
+              <w:jc w:val="center"/>
+              <w:rPr>
+                <w:rFonts w:ascii="Calibri" w:eastAsia="Calibri" w:hAnsi="Calibri" w:cs="Calibri"/>
+                <w:color w:val="5B9BD5" w:themeColor="accent5"/>
+                <w:sz w:val="18"/>
+                <w:szCs w:val="18"/>
+              </w:rPr>
+            </w:pPr>
             <w:r>
               <w:rPr>
                 <w:rFonts w:ascii="Calibri" w:eastAsia="Calibri" w:hAnsi="Calibri" w:cs="Calibri"/>
@@ -7228,9 +7318,53 @@
                 <w:sz w:val="18"/>
                 <w:szCs w:val="18"/>
               </w:rPr>
-              <w:t>etc</w:t>
-            </w:r>
-            <w:proofErr w:type="spellEnd"/>
+              <w:t>3</w:t>
+            </w:r>
+          </w:p>
+          <w:p>
+            <w:pPr>
+              <w:tabs>
+                <w:tab w:val="center" w:pos="4419"/>
+                <w:tab w:val="right" w:pos="8838"/>
+              </w:tabs>
+              <w:jc w:val="center"/>
+              <w:rPr>
+                <w:rFonts w:ascii="Calibri" w:eastAsia="Calibri" w:hAnsi="Calibri" w:cs="Calibri"/>
+                <w:color w:val="1F4E79" w:themeColor="accent5" w:themeShade="80"/>
+                <w:sz w:val="22"/>
+                <w:szCs w:val="22"/>
+              </w:rPr>
+            </w:pPr>
+          </w:p>
+        </w:tc>
+        <w:tc>
+          <w:tcPr>
+            <w:tcW w:w="3679" w:type="dxa"/>
+            <w:tcBorders>
+              <w:top w:val="single" w:sz="6" w:space="0" w:color="BFBFBF" w:themeColor="background1" w:themeShade="BF"/>
+              <w:left w:val="single" w:sz="6" w:space="0" w:color="BFBFBF" w:themeColor="background1" w:themeShade="BF"/>
+              <w:bottom w:val="single" w:sz="6" w:space="0" w:color="BFBFBF" w:themeColor="background1" w:themeShade="BF"/>
+              <w:right w:val="single" w:sz="6" w:space="0" w:color="BFBFBF" w:themeColor="background1" w:themeShade="BF"/>
+            </w:tcBorders>
+            <w:tcMar>
+              <w:left w:w="105" w:type="dxa"/>
+              <w:right w:w="105" w:type="dxa"/>
+            </w:tcMar>
+          </w:tcPr>
+          <w:p>
+            <w:pPr>
+              <w:tabs>
+                <w:tab w:val="center" w:pos="4419"/>
+                <w:tab w:val="right" w:pos="8838"/>
+              </w:tabs>
+              <w:jc w:val="both"/>
+              <w:rPr>
+                <w:rFonts w:ascii="Calibri" w:eastAsia="Calibri" w:hAnsi="Calibri" w:cs="Calibri"/>
+                <w:color w:val="1F4E79" w:themeColor="accent5" w:themeShade="80"/>
+                <w:sz w:val="22"/>
+                <w:szCs w:val="22"/>
+              </w:rPr>
+            </w:pPr>
           </w:p>
         </w:tc>
         <w:tc>
@@ -7249,8 +7383,73 @@
           </w:tcPr>
           <w:p>
             <w:pPr>
+              <w:tabs>
+                <w:tab w:val="center" w:pos="4419"/>
+                <w:tab w:val="right" w:pos="8838"/>
+              </w:tabs>
+              <w:jc w:val="both"/>
+              <w:rPr>
+                <w:rFonts w:ascii="Calibri" w:eastAsia="Calibri" w:hAnsi="Calibri" w:cs="Calibri"/>
+                <w:color w:val="1F4E79" w:themeColor="accent5" w:themeShade="80"/>
+                <w:sz w:val="22"/>
+                <w:szCs w:val="22"/>
+              </w:rPr>
+            </w:pPr>
+          </w:p>
+        </w:tc>
+        <w:tc>
+          <w:tcPr>
+            <w:tcW w:w="2202" w:type="dxa"/>
+            <w:tcBorders>
+              <w:top w:val="single" w:sz="6" w:space="0" w:color="BFBFBF" w:themeColor="background1" w:themeShade="BF"/>
+              <w:left w:val="single" w:sz="6" w:space="0" w:color="BFBFBF" w:themeColor="background1" w:themeShade="BF"/>
+              <w:bottom w:val="single" w:sz="6" w:space="0" w:color="BFBFBF" w:themeColor="background1" w:themeShade="BF"/>
+              <w:right w:val="single" w:sz="6" w:space="0" w:color="BFBFBF" w:themeColor="background1" w:themeShade="BF"/>
+            </w:tcBorders>
+            <w:tcMar>
+              <w:left w:w="105" w:type="dxa"/>
+              <w:right w:w="105" w:type="dxa"/>
+            </w:tcMar>
+          </w:tcPr>
+          <w:p>
+            <w:pPr>
+              <w:tabs>
+                <w:tab w:val="center" w:pos="4419"/>
+                <w:tab w:val="right" w:pos="8838"/>
+              </w:tabs>
+              <w:jc w:val="both"/>
+              <w:rPr>
+                <w:rFonts w:ascii="Calibri" w:eastAsia="Calibri" w:hAnsi="Calibri" w:cs="Calibri"/>
+                <w:color w:val="1F4E79" w:themeColor="accent5" w:themeShade="80"/>
+                <w:sz w:val="22"/>
+                <w:szCs w:val="22"/>
+              </w:rPr>
+            </w:pPr>
+          </w:p>
+        </w:tc>
+      </w:tr>
+      <w:tr>
+        <w:trPr>
+          <w:trHeight w:val="360"/>
+        </w:trPr>
+        <w:tc>
+          <w:tcPr>
+            <w:tcW w:w="541" w:type="dxa"/>
+            <w:tcBorders>
+              <w:top w:val="single" w:sz="6" w:space="0" w:color="BFBFBF" w:themeColor="background1" w:themeShade="BF"/>
+              <w:left w:val="single" w:sz="6" w:space="0" w:color="BFBFBF" w:themeColor="background1" w:themeShade="BF"/>
+              <w:bottom w:val="single" w:sz="6" w:space="0" w:color="BFBFBF" w:themeColor="background1" w:themeShade="BF"/>
+              <w:right w:val="single" w:sz="6" w:space="0" w:color="BFBFBF" w:themeColor="background1" w:themeShade="BF"/>
+            </w:tcBorders>
+            <w:tcMar>
+              <w:left w:w="105" w:type="dxa"/>
+              <w:right w:w="105" w:type="dxa"/>
+            </w:tcMar>
+          </w:tcPr>
+          <w:p>
+            <w:pPr>
               <w:pStyle w:val="Piedepgina"/>
-              <w:jc w:val="both"/>
+              <w:jc w:val="center"/>
               <w:rPr>
                 <w:rFonts w:ascii="Calibri" w:eastAsia="Calibri" w:hAnsi="Calibri" w:cs="Calibri"/>
                 <w:color w:val="5B9BD5" w:themeColor="accent5"/>
@@ -7267,13 +7466,13 @@
                 <w:sz w:val="18"/>
                 <w:szCs w:val="18"/>
               </w:rPr>
-              <w:t>Describir de forma sencilla la información que tendrá el documento.</w:t>
-            </w:r>
-          </w:p>
-        </w:tc>
-        <w:tc>
-          <w:tcPr>
-            <w:tcW w:w="2202" w:type="dxa"/>
+              <w:t>4</w:t>
+            </w:r>
+          </w:p>
+        </w:tc>
+        <w:tc>
+          <w:tcPr>
+            <w:tcW w:w="3679" w:type="dxa"/>
             <w:tcBorders>
               <w:top w:val="single" w:sz="6" w:space="0" w:color="BFBFBF" w:themeColor="background1" w:themeShade="BF"/>
               <w:left w:val="single" w:sz="6" w:space="0" w:color="BFBFBF" w:themeColor="background1" w:themeShade="BF"/>
@@ -7301,6 +7500,66 @@
             </w:pPr>
           </w:p>
         </w:tc>
+        <w:tc>
+          <w:tcPr>
+            <w:tcW w:w="2413" w:type="dxa"/>
+            <w:tcBorders>
+              <w:top w:val="single" w:sz="6" w:space="0" w:color="BFBFBF" w:themeColor="background1" w:themeShade="BF"/>
+              <w:left w:val="single" w:sz="6" w:space="0" w:color="BFBFBF" w:themeColor="background1" w:themeShade="BF"/>
+              <w:bottom w:val="single" w:sz="6" w:space="0" w:color="BFBFBF" w:themeColor="background1" w:themeShade="BF"/>
+              <w:right w:val="single" w:sz="6" w:space="0" w:color="BFBFBF" w:themeColor="background1" w:themeShade="BF"/>
+            </w:tcBorders>
+            <w:tcMar>
+              <w:left w:w="105" w:type="dxa"/>
+              <w:right w:w="105" w:type="dxa"/>
+            </w:tcMar>
+          </w:tcPr>
+          <w:p>
+            <w:pPr>
+              <w:tabs>
+                <w:tab w:val="center" w:pos="4419"/>
+                <w:tab w:val="right" w:pos="8838"/>
+              </w:tabs>
+              <w:jc w:val="both"/>
+              <w:rPr>
+                <w:rFonts w:ascii="Calibri" w:eastAsia="Calibri" w:hAnsi="Calibri" w:cs="Calibri"/>
+                <w:color w:val="1F4E79" w:themeColor="accent5" w:themeShade="80"/>
+                <w:sz w:val="22"/>
+                <w:szCs w:val="22"/>
+              </w:rPr>
+            </w:pPr>
+          </w:p>
+        </w:tc>
+        <w:tc>
+          <w:tcPr>
+            <w:tcW w:w="2202" w:type="dxa"/>
+            <w:tcBorders>
+              <w:top w:val="single" w:sz="6" w:space="0" w:color="BFBFBF" w:themeColor="background1" w:themeShade="BF"/>
+              <w:left w:val="single" w:sz="6" w:space="0" w:color="BFBFBF" w:themeColor="background1" w:themeShade="BF"/>
+              <w:bottom w:val="single" w:sz="6" w:space="0" w:color="BFBFBF" w:themeColor="background1" w:themeShade="BF"/>
+              <w:right w:val="single" w:sz="6" w:space="0" w:color="BFBFBF" w:themeColor="background1" w:themeShade="BF"/>
+            </w:tcBorders>
+            <w:tcMar>
+              <w:left w:w="105" w:type="dxa"/>
+              <w:right w:w="105" w:type="dxa"/>
+            </w:tcMar>
+          </w:tcPr>
+          <w:p>
+            <w:pPr>
+              <w:tabs>
+                <w:tab w:val="center" w:pos="4419"/>
+                <w:tab w:val="right" w:pos="8838"/>
+              </w:tabs>
+              <w:jc w:val="both"/>
+              <w:rPr>
+                <w:rFonts w:ascii="Calibri" w:eastAsia="Calibri" w:hAnsi="Calibri" w:cs="Calibri"/>
+                <w:color w:val="1F4E79" w:themeColor="accent5" w:themeShade="80"/>
+                <w:sz w:val="22"/>
+                <w:szCs w:val="22"/>
+              </w:rPr>
+            </w:pPr>
+          </w:p>
+        </w:tc>
       </w:tr>
       <w:tr>
         <w:trPr>
@@ -7340,421 +7599,6 @@
                 <w:sz w:val="18"/>
                 <w:szCs w:val="18"/>
               </w:rPr>
-              <w:t>2</w:t>
-            </w:r>
-          </w:p>
-        </w:tc>
-        <w:tc>
-          <w:tcPr>
-            <w:tcW w:w="3679" w:type="dxa"/>
-            <w:tcBorders>
-              <w:top w:val="single" w:sz="6" w:space="0" w:color="BFBFBF" w:themeColor="background1" w:themeShade="BF"/>
-              <w:left w:val="single" w:sz="6" w:space="0" w:color="BFBFBF" w:themeColor="background1" w:themeShade="BF"/>
-              <w:bottom w:val="single" w:sz="6" w:space="0" w:color="BFBFBF" w:themeColor="background1" w:themeShade="BF"/>
-              <w:right w:val="single" w:sz="6" w:space="0" w:color="BFBFBF" w:themeColor="background1" w:themeShade="BF"/>
-            </w:tcBorders>
-            <w:tcMar>
-              <w:left w:w="105" w:type="dxa"/>
-              <w:right w:w="105" w:type="dxa"/>
-            </w:tcMar>
-          </w:tcPr>
-          <w:p>
-            <w:pPr>
-              <w:tabs>
-                <w:tab w:val="center" w:pos="4419"/>
-                <w:tab w:val="right" w:pos="8838"/>
-              </w:tabs>
-              <w:jc w:val="both"/>
-              <w:rPr>
-                <w:rFonts w:ascii="Calibri" w:eastAsia="Calibri" w:hAnsi="Calibri" w:cs="Calibri"/>
-                <w:color w:val="1F4E79" w:themeColor="accent5" w:themeShade="80"/>
-                <w:sz w:val="22"/>
-                <w:szCs w:val="22"/>
-              </w:rPr>
-            </w:pPr>
-          </w:p>
-        </w:tc>
-        <w:tc>
-          <w:tcPr>
-            <w:tcW w:w="2413" w:type="dxa"/>
-            <w:tcBorders>
-              <w:top w:val="single" w:sz="6" w:space="0" w:color="BFBFBF" w:themeColor="background1" w:themeShade="BF"/>
-              <w:left w:val="single" w:sz="6" w:space="0" w:color="BFBFBF" w:themeColor="background1" w:themeShade="BF"/>
-              <w:bottom w:val="single" w:sz="6" w:space="0" w:color="BFBFBF" w:themeColor="background1" w:themeShade="BF"/>
-              <w:right w:val="single" w:sz="6" w:space="0" w:color="BFBFBF" w:themeColor="background1" w:themeShade="BF"/>
-            </w:tcBorders>
-            <w:tcMar>
-              <w:left w:w="105" w:type="dxa"/>
-              <w:right w:w="105" w:type="dxa"/>
-            </w:tcMar>
-          </w:tcPr>
-          <w:p>
-            <w:pPr>
-              <w:tabs>
-                <w:tab w:val="center" w:pos="4419"/>
-                <w:tab w:val="right" w:pos="8838"/>
-              </w:tabs>
-              <w:jc w:val="both"/>
-              <w:rPr>
-                <w:rFonts w:ascii="Calibri" w:eastAsia="Calibri" w:hAnsi="Calibri" w:cs="Calibri"/>
-                <w:color w:val="1F4E79" w:themeColor="accent5" w:themeShade="80"/>
-                <w:sz w:val="22"/>
-                <w:szCs w:val="22"/>
-              </w:rPr>
-            </w:pPr>
-          </w:p>
-        </w:tc>
-        <w:tc>
-          <w:tcPr>
-            <w:tcW w:w="2202" w:type="dxa"/>
-            <w:tcBorders>
-              <w:top w:val="single" w:sz="6" w:space="0" w:color="BFBFBF" w:themeColor="background1" w:themeShade="BF"/>
-              <w:left w:val="single" w:sz="6" w:space="0" w:color="BFBFBF" w:themeColor="background1" w:themeShade="BF"/>
-              <w:bottom w:val="single" w:sz="6" w:space="0" w:color="BFBFBF" w:themeColor="background1" w:themeShade="BF"/>
-              <w:right w:val="single" w:sz="6" w:space="0" w:color="BFBFBF" w:themeColor="background1" w:themeShade="BF"/>
-            </w:tcBorders>
-            <w:tcMar>
-              <w:left w:w="105" w:type="dxa"/>
-              <w:right w:w="105" w:type="dxa"/>
-            </w:tcMar>
-          </w:tcPr>
-          <w:p>
-            <w:pPr>
-              <w:tabs>
-                <w:tab w:val="center" w:pos="4419"/>
-                <w:tab w:val="right" w:pos="8838"/>
-              </w:tabs>
-              <w:jc w:val="both"/>
-              <w:rPr>
-                <w:rFonts w:ascii="Calibri" w:eastAsia="Calibri" w:hAnsi="Calibri" w:cs="Calibri"/>
-                <w:color w:val="1F4E79" w:themeColor="accent5" w:themeShade="80"/>
-                <w:sz w:val="22"/>
-                <w:szCs w:val="22"/>
-              </w:rPr>
-            </w:pPr>
-          </w:p>
-        </w:tc>
-      </w:tr>
-      <w:tr>
-        <w:trPr>
-          <w:trHeight w:val="360"/>
-        </w:trPr>
-        <w:tc>
-          <w:tcPr>
-            <w:tcW w:w="541" w:type="dxa"/>
-            <w:tcBorders>
-              <w:top w:val="single" w:sz="6" w:space="0" w:color="BFBFBF" w:themeColor="background1" w:themeShade="BF"/>
-              <w:left w:val="single" w:sz="6" w:space="0" w:color="BFBFBF" w:themeColor="background1" w:themeShade="BF"/>
-              <w:bottom w:val="single" w:sz="6" w:space="0" w:color="BFBFBF" w:themeColor="background1" w:themeShade="BF"/>
-              <w:right w:val="single" w:sz="6" w:space="0" w:color="BFBFBF" w:themeColor="background1" w:themeShade="BF"/>
-            </w:tcBorders>
-            <w:tcMar>
-              <w:left w:w="105" w:type="dxa"/>
-              <w:right w:w="105" w:type="dxa"/>
-            </w:tcMar>
-          </w:tcPr>
-          <w:p>
-            <w:pPr>
-              <w:pStyle w:val="Piedepgina"/>
-              <w:jc w:val="center"/>
-              <w:rPr>
-                <w:rFonts w:ascii="Calibri" w:eastAsia="Calibri" w:hAnsi="Calibri" w:cs="Calibri"/>
-                <w:color w:val="5B9BD5" w:themeColor="accent5"/>
-                <w:sz w:val="18"/>
-                <w:szCs w:val="18"/>
-              </w:rPr>
-            </w:pPr>
-            <w:r>
-              <w:rPr>
-                <w:rFonts w:ascii="Calibri" w:eastAsia="Calibri" w:hAnsi="Calibri" w:cs="Calibri"/>
-                <w:i/>
-                <w:iCs/>
-                <w:color w:val="5B9BD5" w:themeColor="accent5"/>
-                <w:sz w:val="18"/>
-                <w:szCs w:val="18"/>
-              </w:rPr>
-              <w:t>3</w:t>
-            </w:r>
-          </w:p>
-          <w:p>
-            <w:pPr>
-              <w:tabs>
-                <w:tab w:val="center" w:pos="4419"/>
-                <w:tab w:val="right" w:pos="8838"/>
-              </w:tabs>
-              <w:jc w:val="center"/>
-              <w:rPr>
-                <w:rFonts w:ascii="Calibri" w:eastAsia="Calibri" w:hAnsi="Calibri" w:cs="Calibri"/>
-                <w:color w:val="1F4E79" w:themeColor="accent5" w:themeShade="80"/>
-                <w:sz w:val="22"/>
-                <w:szCs w:val="22"/>
-              </w:rPr>
-            </w:pPr>
-          </w:p>
-        </w:tc>
-        <w:tc>
-          <w:tcPr>
-            <w:tcW w:w="3679" w:type="dxa"/>
-            <w:tcBorders>
-              <w:top w:val="single" w:sz="6" w:space="0" w:color="BFBFBF" w:themeColor="background1" w:themeShade="BF"/>
-              <w:left w:val="single" w:sz="6" w:space="0" w:color="BFBFBF" w:themeColor="background1" w:themeShade="BF"/>
-              <w:bottom w:val="single" w:sz="6" w:space="0" w:color="BFBFBF" w:themeColor="background1" w:themeShade="BF"/>
-              <w:right w:val="single" w:sz="6" w:space="0" w:color="BFBFBF" w:themeColor="background1" w:themeShade="BF"/>
-            </w:tcBorders>
-            <w:tcMar>
-              <w:left w:w="105" w:type="dxa"/>
-              <w:right w:w="105" w:type="dxa"/>
-            </w:tcMar>
-          </w:tcPr>
-          <w:p>
-            <w:pPr>
-              <w:tabs>
-                <w:tab w:val="center" w:pos="4419"/>
-                <w:tab w:val="right" w:pos="8838"/>
-              </w:tabs>
-              <w:jc w:val="both"/>
-              <w:rPr>
-                <w:rFonts w:ascii="Calibri" w:eastAsia="Calibri" w:hAnsi="Calibri" w:cs="Calibri"/>
-                <w:color w:val="1F4E79" w:themeColor="accent5" w:themeShade="80"/>
-                <w:sz w:val="22"/>
-                <w:szCs w:val="22"/>
-              </w:rPr>
-            </w:pPr>
-          </w:p>
-        </w:tc>
-        <w:tc>
-          <w:tcPr>
-            <w:tcW w:w="2413" w:type="dxa"/>
-            <w:tcBorders>
-              <w:top w:val="single" w:sz="6" w:space="0" w:color="BFBFBF" w:themeColor="background1" w:themeShade="BF"/>
-              <w:left w:val="single" w:sz="6" w:space="0" w:color="BFBFBF" w:themeColor="background1" w:themeShade="BF"/>
-              <w:bottom w:val="single" w:sz="6" w:space="0" w:color="BFBFBF" w:themeColor="background1" w:themeShade="BF"/>
-              <w:right w:val="single" w:sz="6" w:space="0" w:color="BFBFBF" w:themeColor="background1" w:themeShade="BF"/>
-            </w:tcBorders>
-            <w:tcMar>
-              <w:left w:w="105" w:type="dxa"/>
-              <w:right w:w="105" w:type="dxa"/>
-            </w:tcMar>
-          </w:tcPr>
-          <w:p>
-            <w:pPr>
-              <w:tabs>
-                <w:tab w:val="center" w:pos="4419"/>
-                <w:tab w:val="right" w:pos="8838"/>
-              </w:tabs>
-              <w:jc w:val="both"/>
-              <w:rPr>
-                <w:rFonts w:ascii="Calibri" w:eastAsia="Calibri" w:hAnsi="Calibri" w:cs="Calibri"/>
-                <w:color w:val="1F4E79" w:themeColor="accent5" w:themeShade="80"/>
-                <w:sz w:val="22"/>
-                <w:szCs w:val="22"/>
-              </w:rPr>
-            </w:pPr>
-          </w:p>
-        </w:tc>
-        <w:tc>
-          <w:tcPr>
-            <w:tcW w:w="2202" w:type="dxa"/>
-            <w:tcBorders>
-              <w:top w:val="single" w:sz="6" w:space="0" w:color="BFBFBF" w:themeColor="background1" w:themeShade="BF"/>
-              <w:left w:val="single" w:sz="6" w:space="0" w:color="BFBFBF" w:themeColor="background1" w:themeShade="BF"/>
-              <w:bottom w:val="single" w:sz="6" w:space="0" w:color="BFBFBF" w:themeColor="background1" w:themeShade="BF"/>
-              <w:right w:val="single" w:sz="6" w:space="0" w:color="BFBFBF" w:themeColor="background1" w:themeShade="BF"/>
-            </w:tcBorders>
-            <w:tcMar>
-              <w:left w:w="105" w:type="dxa"/>
-              <w:right w:w="105" w:type="dxa"/>
-            </w:tcMar>
-          </w:tcPr>
-          <w:p>
-            <w:pPr>
-              <w:tabs>
-                <w:tab w:val="center" w:pos="4419"/>
-                <w:tab w:val="right" w:pos="8838"/>
-              </w:tabs>
-              <w:jc w:val="both"/>
-              <w:rPr>
-                <w:rFonts w:ascii="Calibri" w:eastAsia="Calibri" w:hAnsi="Calibri" w:cs="Calibri"/>
-                <w:color w:val="1F4E79" w:themeColor="accent5" w:themeShade="80"/>
-                <w:sz w:val="22"/>
-                <w:szCs w:val="22"/>
-              </w:rPr>
-            </w:pPr>
-          </w:p>
-        </w:tc>
-      </w:tr>
-      <w:tr>
-        <w:trPr>
-          <w:trHeight w:val="360"/>
-        </w:trPr>
-        <w:tc>
-          <w:tcPr>
-            <w:tcW w:w="541" w:type="dxa"/>
-            <w:tcBorders>
-              <w:top w:val="single" w:sz="6" w:space="0" w:color="BFBFBF" w:themeColor="background1" w:themeShade="BF"/>
-              <w:left w:val="single" w:sz="6" w:space="0" w:color="BFBFBF" w:themeColor="background1" w:themeShade="BF"/>
-              <w:bottom w:val="single" w:sz="6" w:space="0" w:color="BFBFBF" w:themeColor="background1" w:themeShade="BF"/>
-              <w:right w:val="single" w:sz="6" w:space="0" w:color="BFBFBF" w:themeColor="background1" w:themeShade="BF"/>
-            </w:tcBorders>
-            <w:tcMar>
-              <w:left w:w="105" w:type="dxa"/>
-              <w:right w:w="105" w:type="dxa"/>
-            </w:tcMar>
-          </w:tcPr>
-          <w:p>
-            <w:pPr>
-              <w:pStyle w:val="Piedepgina"/>
-              <w:jc w:val="center"/>
-              <w:rPr>
-                <w:rFonts w:ascii="Calibri" w:eastAsia="Calibri" w:hAnsi="Calibri" w:cs="Calibri"/>
-                <w:color w:val="5B9BD5" w:themeColor="accent5"/>
-                <w:sz w:val="18"/>
-                <w:szCs w:val="18"/>
-              </w:rPr>
-            </w:pPr>
-            <w:r>
-              <w:rPr>
-                <w:rFonts w:ascii="Calibri" w:eastAsia="Calibri" w:hAnsi="Calibri" w:cs="Calibri"/>
-                <w:i/>
-                <w:iCs/>
-                <w:color w:val="5B9BD5" w:themeColor="accent5"/>
-                <w:sz w:val="18"/>
-                <w:szCs w:val="18"/>
-              </w:rPr>
-              <w:t>4</w:t>
-            </w:r>
-          </w:p>
-        </w:tc>
-        <w:tc>
-          <w:tcPr>
-            <w:tcW w:w="3679" w:type="dxa"/>
-            <w:tcBorders>
-              <w:top w:val="single" w:sz="6" w:space="0" w:color="BFBFBF" w:themeColor="background1" w:themeShade="BF"/>
-              <w:left w:val="single" w:sz="6" w:space="0" w:color="BFBFBF" w:themeColor="background1" w:themeShade="BF"/>
-              <w:bottom w:val="single" w:sz="6" w:space="0" w:color="BFBFBF" w:themeColor="background1" w:themeShade="BF"/>
-              <w:right w:val="single" w:sz="6" w:space="0" w:color="BFBFBF" w:themeColor="background1" w:themeShade="BF"/>
-            </w:tcBorders>
-            <w:tcMar>
-              <w:left w:w="105" w:type="dxa"/>
-              <w:right w:w="105" w:type="dxa"/>
-            </w:tcMar>
-          </w:tcPr>
-          <w:p>
-            <w:pPr>
-              <w:tabs>
-                <w:tab w:val="center" w:pos="4419"/>
-                <w:tab w:val="right" w:pos="8838"/>
-              </w:tabs>
-              <w:jc w:val="both"/>
-              <w:rPr>
-                <w:rFonts w:ascii="Calibri" w:eastAsia="Calibri" w:hAnsi="Calibri" w:cs="Calibri"/>
-                <w:color w:val="1F4E79" w:themeColor="accent5" w:themeShade="80"/>
-                <w:sz w:val="22"/>
-                <w:szCs w:val="22"/>
-              </w:rPr>
-            </w:pPr>
-          </w:p>
-        </w:tc>
-        <w:tc>
-          <w:tcPr>
-            <w:tcW w:w="2413" w:type="dxa"/>
-            <w:tcBorders>
-              <w:top w:val="single" w:sz="6" w:space="0" w:color="BFBFBF" w:themeColor="background1" w:themeShade="BF"/>
-              <w:left w:val="single" w:sz="6" w:space="0" w:color="BFBFBF" w:themeColor="background1" w:themeShade="BF"/>
-              <w:bottom w:val="single" w:sz="6" w:space="0" w:color="BFBFBF" w:themeColor="background1" w:themeShade="BF"/>
-              <w:right w:val="single" w:sz="6" w:space="0" w:color="BFBFBF" w:themeColor="background1" w:themeShade="BF"/>
-            </w:tcBorders>
-            <w:tcMar>
-              <w:left w:w="105" w:type="dxa"/>
-              <w:right w:w="105" w:type="dxa"/>
-            </w:tcMar>
-          </w:tcPr>
-          <w:p>
-            <w:pPr>
-              <w:tabs>
-                <w:tab w:val="center" w:pos="4419"/>
-                <w:tab w:val="right" w:pos="8838"/>
-              </w:tabs>
-              <w:jc w:val="both"/>
-              <w:rPr>
-                <w:rFonts w:ascii="Calibri" w:eastAsia="Calibri" w:hAnsi="Calibri" w:cs="Calibri"/>
-                <w:color w:val="1F4E79" w:themeColor="accent5" w:themeShade="80"/>
-                <w:sz w:val="22"/>
-                <w:szCs w:val="22"/>
-              </w:rPr>
-            </w:pPr>
-          </w:p>
-        </w:tc>
-        <w:tc>
-          <w:tcPr>
-            <w:tcW w:w="2202" w:type="dxa"/>
-            <w:tcBorders>
-              <w:top w:val="single" w:sz="6" w:space="0" w:color="BFBFBF" w:themeColor="background1" w:themeShade="BF"/>
-              <w:left w:val="single" w:sz="6" w:space="0" w:color="BFBFBF" w:themeColor="background1" w:themeShade="BF"/>
-              <w:bottom w:val="single" w:sz="6" w:space="0" w:color="BFBFBF" w:themeColor="background1" w:themeShade="BF"/>
-              <w:right w:val="single" w:sz="6" w:space="0" w:color="BFBFBF" w:themeColor="background1" w:themeShade="BF"/>
-            </w:tcBorders>
-            <w:tcMar>
-              <w:left w:w="105" w:type="dxa"/>
-              <w:right w:w="105" w:type="dxa"/>
-            </w:tcMar>
-          </w:tcPr>
-          <w:p>
-            <w:pPr>
-              <w:tabs>
-                <w:tab w:val="center" w:pos="4419"/>
-                <w:tab w:val="right" w:pos="8838"/>
-              </w:tabs>
-              <w:jc w:val="both"/>
-              <w:rPr>
-                <w:rFonts w:ascii="Calibri" w:eastAsia="Calibri" w:hAnsi="Calibri" w:cs="Calibri"/>
-                <w:color w:val="1F4E79" w:themeColor="accent5" w:themeShade="80"/>
-                <w:sz w:val="22"/>
-                <w:szCs w:val="22"/>
-              </w:rPr>
-            </w:pPr>
-          </w:p>
-        </w:tc>
-      </w:tr>
-      <w:tr>
-        <w:trPr>
-          <w:trHeight w:val="360"/>
-        </w:trPr>
-        <w:tc>
-          <w:tcPr>
-            <w:tcW w:w="541" w:type="dxa"/>
-            <w:tcBorders>
-              <w:top w:val="single" w:sz="6" w:space="0" w:color="BFBFBF" w:themeColor="background1" w:themeShade="BF"/>
-              <w:left w:val="single" w:sz="6" w:space="0" w:color="BFBFBF" w:themeColor="background1" w:themeShade="BF"/>
-              <w:bottom w:val="single" w:sz="6" w:space="0" w:color="BFBFBF" w:themeColor="background1" w:themeShade="BF"/>
-              <w:right w:val="single" w:sz="6" w:space="0" w:color="BFBFBF" w:themeColor="background1" w:themeShade="BF"/>
-            </w:tcBorders>
-            <w:tcMar>
-              <w:left w:w="105" w:type="dxa"/>
-              <w:right w:w="105" w:type="dxa"/>
-            </w:tcMar>
-          </w:tcPr>
-          <w:p>
-            <w:pPr>
-              <w:pStyle w:val="Piedepgina"/>
-              <w:jc w:val="center"/>
-              <w:rPr>
-                <w:rFonts w:ascii="Calibri" w:eastAsia="Calibri" w:hAnsi="Calibri" w:cs="Calibri"/>
-                <w:color w:val="5B9BD5" w:themeColor="accent5"/>
-                <w:sz w:val="18"/>
-                <w:szCs w:val="18"/>
-              </w:rPr>
-            </w:pPr>
-            <w:r>
-              <w:rPr>
-                <w:rFonts w:ascii="Calibri" w:eastAsia="Calibri" w:hAnsi="Calibri" w:cs="Calibri"/>
-                <w:i/>
-                <w:iCs/>
-                <w:color w:val="5B9BD5" w:themeColor="accent5"/>
-                <w:sz w:val="18"/>
-                <w:szCs w:val="18"/>
-              </w:rPr>
-              <w:lastRenderedPageBreak/>
               <w:t>5</w:t>
             </w:r>
           </w:p>
@@ -10792,7 +10636,7 @@
 </file>
 
 <file path=word/endnotes.xml><?xml version="1.0" encoding="utf-8"?>
-<w:endnotes xmlns:wpc="http://schemas.microsoft.com/office/word/2010/wordprocessingCanvas" xmlns:cx="http://schemas.microsoft.com/office/drawing/2014/chartex" xmlns:cx1="http://schemas.microsoft.com/office/drawing/2015/9/8/chartex" xmlns:cx2="http://schemas.microsoft.com/office/drawing/2015/10/21/chartex" xmlns:cx3="http://schemas.microsoft.com/office/drawing/2016/5/9/chartex" xmlns:cx4="http://schemas.microsoft.com/office/drawing/2016/5/10/chartex" xmlns:cx5="http://schemas.microsoft.com/office/drawing/2016/5/11/chartex" xmlns:cx6="http://schemas.microsoft.com/office/drawing/2016/5/12/chartex" xmlns:cx7="http://schemas.microsoft.com/office/drawing/2016/5/13/chartex" xmlns:cx8="http://schemas.microsoft.com/office/drawing/2016/5/14/chartex" xmlns:mc="http://schemas.openxmlformats.org/markup-compatibility/2006" xmlns:aink="http://schemas.microsoft.com/office/drawing/2016/ink" xmlns:am3d="http://schemas.microsoft.com/office/drawing/2017/model3d" xmlns:o="urn:schemas-microsoft-com:office:office" xmlns:r="http://schemas.openxmlformats.org/officeDocument/2006/relationships" xmlns:m="http://schemas.openxmlformats.org/officeDocument/2006/math" xmlns:v="urn:schemas-microsoft-com:vml" xmlns:wp14="http://schemas.microsoft.com/office/word/2010/wordprocessingDrawing" xmlns:wp="http://schemas.openxmlformats.org/drawingml/2006/wordprocessingDrawing" xmlns:w10="urn:schemas-microsoft-com:office:word" xmlns:w="http://schemas.openxmlformats.org/wordprocessingml/2006/main" xmlns:w14="http://schemas.microsoft.com/office/word/2010/wordml" xmlns:w15="http://schemas.microsoft.com/office/word/2012/wordml" xmlns:w16cex="http://schemas.microsoft.com/office/word/2018/wordml/cex" xmlns:w16cid="http://schemas.microsoft.com/office/word/2016/wordml/cid" xmlns:w16="http://schemas.microsoft.com/office/word/2018/wordml" xmlns:w16sdtdh="http://schemas.microsoft.com/office/word/2020/wordml/sdtdatahash" xmlns:w16se="http://schemas.microsoft.com/office/word/2015/wordml/symex" xmlns:wpg="http://schemas.microsoft.com/office/word/2010/wordprocessingGroup" xmlns:wpi="http://schemas.microsoft.com/office/word/2010/wordprocessingInk" xmlns:wne="http://schemas.microsoft.com/office/word/2006/wordml" xmlns:wps="http://schemas.microsoft.com/office/word/2010/wordprocessingShape" mc:Ignorable="w14 w15 w16se w16cid w16 w16cex w16sdtdh wp14">
+<w:endnotes xmlns:wpc="http://schemas.microsoft.com/office/word/2010/wordprocessingCanvas" xmlns:cx="http://schemas.microsoft.com/office/drawing/2014/chartex" xmlns:cx1="http://schemas.microsoft.com/office/drawing/2015/9/8/chartex" xmlns:cx2="http://schemas.microsoft.com/office/drawing/2015/10/21/chartex" xmlns:cx3="http://schemas.microsoft.com/office/drawing/2016/5/9/chartex" xmlns:cx4="http://schemas.microsoft.com/office/drawing/2016/5/10/chartex" xmlns:cx5="http://schemas.microsoft.com/office/drawing/2016/5/11/chartex" xmlns:cx6="http://schemas.microsoft.com/office/drawing/2016/5/12/chartex" xmlns:cx7="http://schemas.microsoft.com/office/drawing/2016/5/13/chartex" xmlns:cx8="http://schemas.microsoft.com/office/drawing/2016/5/14/chartex" xmlns:mc="http://schemas.openxmlformats.org/markup-compatibility/2006" xmlns:aink="http://schemas.microsoft.com/office/drawing/2016/ink" xmlns:am3d="http://schemas.microsoft.com/office/drawing/2017/model3d" xmlns:o="urn:schemas-microsoft-com:office:office" xmlns:oel="http://schemas.microsoft.com/office/2019/extlst" xmlns:r="http://schemas.openxmlformats.org/officeDocument/2006/relationships" xmlns:m="http://schemas.openxmlformats.org/officeDocument/2006/math" xmlns:v="urn:schemas-microsoft-com:vml" xmlns:wp14="http://schemas.microsoft.com/office/word/2010/wordprocessingDrawing" xmlns:wp="http://schemas.openxmlformats.org/drawingml/2006/wordprocessingDrawing" xmlns:w10="urn:schemas-microsoft-com:office:word" xmlns:w="http://schemas.openxmlformats.org/wordprocessingml/2006/main" xmlns:w14="http://schemas.microsoft.com/office/word/2010/wordml" xmlns:w15="http://schemas.microsoft.com/office/word/2012/wordml" xmlns:w16cex="http://schemas.microsoft.com/office/word/2018/wordml/cex" xmlns:w16cid="http://schemas.microsoft.com/office/word/2016/wordml/cid" xmlns:w16="http://schemas.microsoft.com/office/word/2018/wordml" xmlns:w16sdtdh="http://schemas.microsoft.com/office/word/2020/wordml/sdtdatahash" xmlns:w16se="http://schemas.microsoft.com/office/word/2015/wordml/symex" xmlns:wpg="http://schemas.microsoft.com/office/word/2010/wordprocessingGroup" xmlns:wpi="http://schemas.microsoft.com/office/word/2010/wordprocessingInk" xmlns:wne="http://schemas.microsoft.com/office/word/2006/wordml" xmlns:wps="http://schemas.microsoft.com/office/word/2010/wordprocessingShape" mc:Ignorable="w14 w15 w16se w16cid w16 w16cex w16sdtdh wp14">
   <w:endnote w:type="separator" w:id="-1">
     <w:p>
       <w:r>
@@ -10814,7 +10658,7 @@
 </file>
 
 <file path=word/footer1.xml><?xml version="1.0" encoding="utf-8"?>
-<w:ftr xmlns:wpc="http://schemas.microsoft.com/office/word/2010/wordprocessingCanvas" xmlns:cx="http://schemas.microsoft.com/office/drawing/2014/chartex" xmlns:cx1="http://schemas.microsoft.com/office/drawing/2015/9/8/chartex" xmlns:cx2="http://schemas.microsoft.com/office/drawing/2015/10/21/chartex" xmlns:cx3="http://schemas.microsoft.com/office/drawing/2016/5/9/chartex" xmlns:cx4="http://schemas.microsoft.com/office/drawing/2016/5/10/chartex" xmlns:cx5="http://schemas.microsoft.com/office/drawing/2016/5/11/chartex" xmlns:cx6="http://schemas.microsoft.com/office/drawing/2016/5/12/chartex" xmlns:cx7="http://schemas.microsoft.com/office/drawing/2016/5/13/chartex" xmlns:cx8="http://schemas.microsoft.com/office/drawing/2016/5/14/chartex" xmlns:mc="http://schemas.openxmlformats.org/markup-compatibility/2006" xmlns:aink="http://schemas.microsoft.com/office/drawing/2016/ink" xmlns:am3d="http://schemas.microsoft.com/office/drawing/2017/model3d" xmlns:o="urn:schemas-microsoft-com:office:office" xmlns:r="http://schemas.openxmlformats.org/officeDocument/2006/relationships" xmlns:m="http://schemas.openxmlformats.org/officeDocument/2006/math" xmlns:v="urn:schemas-microsoft-com:vml" xmlns:wp14="http://schemas.microsoft.com/office/word/2010/wordprocessingDrawing" xmlns:wp="http://schemas.openxmlformats.org/drawingml/2006/wordprocessingDrawing" xmlns:w10="urn:schemas-microsoft-com:office:word" xmlns:w="http://schemas.openxmlformats.org/wordprocessingml/2006/main" xmlns:w14="http://schemas.microsoft.com/office/word/2010/wordml" xmlns:w15="http://schemas.microsoft.com/office/word/2012/wordml" xmlns:w16cex="http://schemas.microsoft.com/office/word/2018/wordml/cex" xmlns:w16cid="http://schemas.microsoft.com/office/word/2016/wordml/cid" xmlns:w16="http://schemas.microsoft.com/office/word/2018/wordml" xmlns:w16sdtdh="http://schemas.microsoft.com/office/word/2020/wordml/sdtdatahash" xmlns:w16se="http://schemas.microsoft.com/office/word/2015/wordml/symex" xmlns:wpg="http://schemas.microsoft.com/office/word/2010/wordprocessingGroup" xmlns:wpi="http://schemas.microsoft.com/office/word/2010/wordprocessingInk" xmlns:wne="http://schemas.microsoft.com/office/word/2006/wordml" xmlns:wps="http://schemas.microsoft.com/office/word/2010/wordprocessingShape" mc:Ignorable="w14 w15 w16se w16cid w16 w16cex w16sdtdh wp14">
+<w:ftr xmlns:wpc="http://schemas.microsoft.com/office/word/2010/wordprocessingCanvas" xmlns:cx="http://schemas.microsoft.com/office/drawing/2014/chartex" xmlns:cx1="http://schemas.microsoft.com/office/drawing/2015/9/8/chartex" xmlns:cx2="http://schemas.microsoft.com/office/drawing/2015/10/21/chartex" xmlns:cx3="http://schemas.microsoft.com/office/drawing/2016/5/9/chartex" xmlns:cx4="http://schemas.microsoft.com/office/drawing/2016/5/10/chartex" xmlns:cx5="http://schemas.microsoft.com/office/drawing/2016/5/11/chartex" xmlns:cx6="http://schemas.microsoft.com/office/drawing/2016/5/12/chartex" xmlns:cx7="http://schemas.microsoft.com/office/drawing/2016/5/13/chartex" xmlns:cx8="http://schemas.microsoft.com/office/drawing/2016/5/14/chartex" xmlns:mc="http://schemas.openxmlformats.org/markup-compatibility/2006" xmlns:aink="http://schemas.microsoft.com/office/drawing/2016/ink" xmlns:am3d="http://schemas.microsoft.com/office/drawing/2017/model3d" xmlns:o="urn:schemas-microsoft-com:office:office" xmlns:oel="http://schemas.microsoft.com/office/2019/extlst" xmlns:r="http://schemas.openxmlformats.org/officeDocument/2006/relationships" xmlns:m="http://schemas.openxmlformats.org/officeDocument/2006/math" xmlns:v="urn:schemas-microsoft-com:vml" xmlns:wp14="http://schemas.microsoft.com/office/word/2010/wordprocessingDrawing" xmlns:wp="http://schemas.openxmlformats.org/drawingml/2006/wordprocessingDrawing" xmlns:w10="urn:schemas-microsoft-com:office:word" xmlns:w="http://schemas.openxmlformats.org/wordprocessingml/2006/main" xmlns:w14="http://schemas.microsoft.com/office/word/2010/wordml" xmlns:w15="http://schemas.microsoft.com/office/word/2012/wordml" xmlns:w16cex="http://schemas.microsoft.com/office/word/2018/wordml/cex" xmlns:w16cid="http://schemas.microsoft.com/office/word/2016/wordml/cid" xmlns:w16="http://schemas.microsoft.com/office/word/2018/wordml" xmlns:w16sdtdh="http://schemas.microsoft.com/office/word/2020/wordml/sdtdatahash" xmlns:w16se="http://schemas.microsoft.com/office/word/2015/wordml/symex" xmlns:wpg="http://schemas.microsoft.com/office/word/2010/wordprocessingGroup" xmlns:wpi="http://schemas.microsoft.com/office/word/2010/wordprocessingInk" xmlns:wne="http://schemas.microsoft.com/office/word/2006/wordml" xmlns:wps="http://schemas.microsoft.com/office/word/2010/wordprocessingShape" mc:Ignorable="w14 w15 w16se w16cid w16 w16cex w16sdtdh wp14">
   <w:p>
     <w:pPr>
       <w:pStyle w:val="Textoindependiente"/>
@@ -10936,7 +10780,7 @@
               <v:stroke joinstyle="miter"/>
               <v:path gradientshapeok="t" o:connecttype="rect"/>
             </v:shapetype>
-            <v:shape id="Cuadro de texto 9" o:spid="_x0000_s1026" type="#_x0000_t202" style="position:absolute;margin-left:202.65pt;margin-top:897.2pt;width:14.1pt;height:13.1pt;z-index:-251658752;visibility:visible;mso-wrap-style:square;mso-width-percent:0;mso-height-percent:0;mso-wrap-distance-left:9pt;mso-wrap-distance-top:0;mso-wrap-distance-right:9pt;mso-wrap-distance-bottom:0;mso-position-horizontal:absolute;mso-position-horizontal-relative:margin;mso-position-vertical:absolute;mso-position-vertical-relative:page;mso-width-percent:0;mso-height-percent:0;mso-width-relative:page;mso-height-relative:page;v-text-anchor:top" o:gfxdata="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" filled="f" stroked="f">
+            <v:shape id="Cuadro de texto 9" o:spid="_x0000_s1026" type="#_x0000_t202" style="position:absolute;margin-left:202.65pt;margin-top:897.2pt;width:14.1pt;height:13.1pt;z-index:-251658752;visibility:visible;mso-wrap-style:square;mso-width-percent:0;mso-height-percent:0;mso-wrap-distance-left:9pt;mso-wrap-distance-top:0;mso-wrap-distance-right:9pt;mso-wrap-distance-bottom:0;mso-position-horizontal:absolute;mso-position-horizontal-relative:margin;mso-position-vertical:absolute;mso-position-vertical-relative:page;mso-width-percent:0;mso-height-percent:0;mso-width-relative:page;mso-height-relative:page;v-text-anchor:top" o:gfxdata="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" filled="f" stroked="f">
               <o:lock v:ext="edit" aspectratio="t" verticies="t" text="t" shapetype="t"/>
               <v:textbox inset="0,0,0,0">
                 <w:txbxContent>
@@ -10996,7 +10840,7 @@
 </file>
 
 <file path=word/footnotes.xml><?xml version="1.0" encoding="utf-8"?>
-<w:footnotes xmlns:wpc="http://schemas.microsoft.com/office/word/2010/wordprocessingCanvas" xmlns:cx="http://schemas.microsoft.com/office/drawing/2014/chartex" xmlns:cx1="http://schemas.microsoft.com/office/drawing/2015/9/8/chartex" xmlns:cx2="http://schemas.microsoft.com/office/drawing/2015/10/21/chartex" xmlns:cx3="http://schemas.microsoft.com/office/drawing/2016/5/9/chartex" xmlns:cx4="http://schemas.microsoft.com/office/drawing/2016/5/10/chartex" xmlns:cx5="http://schemas.microsoft.com/office/drawing/2016/5/11/chartex" xmlns:cx6="http://schemas.microsoft.com/office/drawing/2016/5/12/chartex" xmlns:cx7="http://schemas.microsoft.com/office/drawing/2016/5/13/chartex" xmlns:cx8="http://schemas.microsoft.com/office/drawing/2016/5/14/chartex" xmlns:mc="http://schemas.openxmlformats.org/markup-compatibility/2006" xmlns:aink="http://schemas.microsoft.com/office/drawing/2016/ink" xmlns:am3d="http://schemas.microsoft.com/office/drawing/2017/model3d" xmlns:o="urn:schemas-microsoft-com:office:office" xmlns:r="http://schemas.openxmlformats.org/officeDocument/2006/relationships" xmlns:m="http://schemas.openxmlformats.org/officeDocument/2006/math" xmlns:v="urn:schemas-microsoft-com:vml" xmlns:wp14="http://schemas.microsoft.com/office/word/2010/wordprocessingDrawing" xmlns:wp="http://schemas.openxmlformats.org/drawingml/2006/wordprocessingDrawing" xmlns:w10="urn:schemas-microsoft-com:office:word" xmlns:w="http://schemas.openxmlformats.org/wordprocessingml/2006/main" xmlns:w14="http://schemas.microsoft.com/office/word/2010/wordml" xmlns:w15="http://schemas.microsoft.com/office/word/2012/wordml" xmlns:w16cex="http://schemas.microsoft.com/office/word/2018/wordml/cex" xmlns:w16cid="http://schemas.microsoft.com/office/word/2016/wordml/cid" xmlns:w16="http://schemas.microsoft.com/office/word/2018/wordml" xmlns:w16sdtdh="http://schemas.microsoft.com/office/word/2020/wordml/sdtdatahash" xmlns:w16se="http://schemas.microsoft.com/office/word/2015/wordml/symex" xmlns:wpg="http://schemas.microsoft.com/office/word/2010/wordprocessingGroup" xmlns:wpi="http://schemas.microsoft.com/office/word/2010/wordprocessingInk" xmlns:wne="http://schemas.microsoft.com/office/word/2006/wordml" xmlns:wps="http://schemas.microsoft.com/office/word/2010/wordprocessingShape" mc:Ignorable="w14 w15 w16se w16cid w16 w16cex w16sdtdh wp14">
+<w:footnotes xmlns:wpc="http://schemas.microsoft.com/office/word/2010/wordprocessingCanvas" xmlns:cx="http://schemas.microsoft.com/office/drawing/2014/chartex" xmlns:cx1="http://schemas.microsoft.com/office/drawing/2015/9/8/chartex" xmlns:cx2="http://schemas.microsoft.com/office/drawing/2015/10/21/chartex" xmlns:cx3="http://schemas.microsoft.com/office/drawing/2016/5/9/chartex" xmlns:cx4="http://schemas.microsoft.com/office/drawing/2016/5/10/chartex" xmlns:cx5="http://schemas.microsoft.com/office/drawing/2016/5/11/chartex" xmlns:cx6="http://schemas.microsoft.com/office/drawing/2016/5/12/chartex" xmlns:cx7="http://schemas.microsoft.com/office/drawing/2016/5/13/chartex" xmlns:cx8="http://schemas.microsoft.com/office/drawing/2016/5/14/chartex" xmlns:mc="http://schemas.openxmlformats.org/markup-compatibility/2006" xmlns:aink="http://schemas.microsoft.com/office/drawing/2016/ink" xmlns:am3d="http://schemas.microsoft.com/office/drawing/2017/model3d" xmlns:o="urn:schemas-microsoft-com:office:office" xmlns:oel="http://schemas.microsoft.com/office/2019/extlst" xmlns:r="http://schemas.openxmlformats.org/officeDocument/2006/relationships" xmlns:m="http://schemas.openxmlformats.org/officeDocument/2006/math" xmlns:v="urn:schemas-microsoft-com:vml" xmlns:wp14="http://schemas.microsoft.com/office/word/2010/wordprocessingDrawing" xmlns:wp="http://schemas.openxmlformats.org/drawingml/2006/wordprocessingDrawing" xmlns:w10="urn:schemas-microsoft-com:office:word" xmlns:w="http://schemas.openxmlformats.org/wordprocessingml/2006/main" xmlns:w14="http://schemas.microsoft.com/office/word/2010/wordml" xmlns:w15="http://schemas.microsoft.com/office/word/2012/wordml" xmlns:w16cex="http://schemas.microsoft.com/office/word/2018/wordml/cex" xmlns:w16cid="http://schemas.microsoft.com/office/word/2016/wordml/cid" xmlns:w16="http://schemas.microsoft.com/office/word/2018/wordml" xmlns:w16sdtdh="http://schemas.microsoft.com/office/word/2020/wordml/sdtdatahash" xmlns:w16se="http://schemas.microsoft.com/office/word/2015/wordml/symex" xmlns:wpg="http://schemas.microsoft.com/office/word/2010/wordprocessingGroup" xmlns:wpi="http://schemas.microsoft.com/office/word/2010/wordprocessingInk" xmlns:wne="http://schemas.microsoft.com/office/word/2006/wordml" xmlns:wps="http://schemas.microsoft.com/office/word/2010/wordprocessingShape" mc:Ignorable="w14 w15 w16se w16cid w16 w16cex w16sdtdh wp14">
   <w:footnote w:type="separator" w:id="-1">
     <w:p>
       <w:r>
@@ -11018,7 +10862,7 @@
 </file>
 
 <file path=word/header1.xml><?xml version="1.0" encoding="utf-8"?>
-<w:hdr xmlns:wpc="http://schemas.microsoft.com/office/word/2010/wordprocessingCanvas" xmlns:cx="http://schemas.microsoft.com/office/drawing/2014/chartex" xmlns:cx1="http://schemas.microsoft.com/office/drawing/2015/9/8/chartex" xmlns:cx2="http://schemas.microsoft.com/office/drawing/2015/10/21/chartex" xmlns:cx3="http://schemas.microsoft.com/office/drawing/2016/5/9/chartex" xmlns:cx4="http://schemas.microsoft.com/office/drawing/2016/5/10/chartex" xmlns:cx5="http://schemas.microsoft.com/office/drawing/2016/5/11/chartex" xmlns:cx6="http://schemas.microsoft.com/office/drawing/2016/5/12/chartex" xmlns:cx7="http://schemas.microsoft.com/office/drawing/2016/5/13/chartex" xmlns:cx8="http://schemas.microsoft.com/office/drawing/2016/5/14/chartex" xmlns:mc="http://schemas.openxmlformats.org/markup-compatibility/2006" xmlns:aink="http://schemas.microsoft.com/office/drawing/2016/ink" xmlns:am3d="http://schemas.microsoft.com/office/drawing/2017/model3d" xmlns:o="urn:schemas-microsoft-com:office:office" xmlns:r="http://schemas.openxmlformats.org/officeDocument/2006/relationships" xmlns:m="http://schemas.openxmlformats.org/officeDocument/2006/math" xmlns:v="urn:schemas-microsoft-com:vml" xmlns:wp14="http://schemas.microsoft.com/office/word/2010/wordprocessingDrawing" xmlns:wp="http://schemas.openxmlformats.org/drawingml/2006/wordprocessingDrawing" xmlns:w10="urn:schemas-microsoft-com:office:word" xmlns:w="http://schemas.openxmlformats.org/wordprocessingml/2006/main" xmlns:w14="http://schemas.microsoft.com/office/word/2010/wordml" xmlns:w15="http://schemas.microsoft.com/office/word/2012/wordml" xmlns:w16cex="http://schemas.microsoft.com/office/word/2018/wordml/cex" xmlns:w16cid="http://schemas.microsoft.com/office/word/2016/wordml/cid" xmlns:w16="http://schemas.microsoft.com/office/word/2018/wordml" xmlns:w16sdtdh="http://schemas.microsoft.com/office/word/2020/wordml/sdtdatahash" xmlns:w16se="http://schemas.microsoft.com/office/word/2015/wordml/symex" xmlns:wpg="http://schemas.microsoft.com/office/word/2010/wordprocessingGroup" xmlns:wpi="http://schemas.microsoft.com/office/word/2010/wordprocessingInk" xmlns:wne="http://schemas.microsoft.com/office/word/2006/wordml" xmlns:wps="http://schemas.microsoft.com/office/word/2010/wordprocessingShape" mc:Ignorable="w14 w15 w16se w16cid w16 w16cex w16sdtdh wp14">
+<w:hdr xmlns:wpc="http://schemas.microsoft.com/office/word/2010/wordprocessingCanvas" xmlns:cx="http://schemas.microsoft.com/office/drawing/2014/chartex" xmlns:cx1="http://schemas.microsoft.com/office/drawing/2015/9/8/chartex" xmlns:cx2="http://schemas.microsoft.com/office/drawing/2015/10/21/chartex" xmlns:cx3="http://schemas.microsoft.com/office/drawing/2016/5/9/chartex" xmlns:cx4="http://schemas.microsoft.com/office/drawing/2016/5/10/chartex" xmlns:cx5="http://schemas.microsoft.com/office/drawing/2016/5/11/chartex" xmlns:cx6="http://schemas.microsoft.com/office/drawing/2016/5/12/chartex" xmlns:cx7="http://schemas.microsoft.com/office/drawing/2016/5/13/chartex" xmlns:cx8="http://schemas.microsoft.com/office/drawing/2016/5/14/chartex" xmlns:mc="http://schemas.openxmlformats.org/markup-compatibility/2006" xmlns:aink="http://schemas.microsoft.com/office/drawing/2016/ink" xmlns:am3d="http://schemas.microsoft.com/office/drawing/2017/model3d" xmlns:o="urn:schemas-microsoft-com:office:office" xmlns:oel="http://schemas.microsoft.com/office/2019/extlst" xmlns:r="http://schemas.openxmlformats.org/officeDocument/2006/relationships" xmlns:m="http://schemas.openxmlformats.org/officeDocument/2006/math" xmlns:v="urn:schemas-microsoft-com:vml" xmlns:wp14="http://schemas.microsoft.com/office/word/2010/wordprocessingDrawing" xmlns:wp="http://schemas.openxmlformats.org/drawingml/2006/wordprocessingDrawing" xmlns:w10="urn:schemas-microsoft-com:office:word" xmlns:w="http://schemas.openxmlformats.org/wordprocessingml/2006/main" xmlns:w14="http://schemas.microsoft.com/office/word/2010/wordml" xmlns:w15="http://schemas.microsoft.com/office/word/2012/wordml" xmlns:w16cex="http://schemas.microsoft.com/office/word/2018/wordml/cex" xmlns:w16cid="http://schemas.microsoft.com/office/word/2016/wordml/cid" xmlns:w16="http://schemas.microsoft.com/office/word/2018/wordml" xmlns:w16sdtdh="http://schemas.microsoft.com/office/word/2020/wordml/sdtdatahash" xmlns:w16se="http://schemas.microsoft.com/office/word/2015/wordml/symex" xmlns:wpg="http://schemas.microsoft.com/office/word/2010/wordprocessingGroup" xmlns:wpi="http://schemas.microsoft.com/office/word/2010/wordprocessingInk" xmlns:wne="http://schemas.microsoft.com/office/word/2006/wordml" xmlns:wps="http://schemas.microsoft.com/office/word/2010/wordprocessingShape" mc:Ignorable="w14 w15 w16se w16cid w16 w16cex w16sdtdh wp14">
   <w:p>
     <w:pPr>
       <w:pStyle w:val="Encabezado"/>
@@ -11156,7 +11000,7 @@
 </file>
 
 <file path=word/numbering.xml><?xml version="1.0" encoding="utf-8"?>
-<w:numbering xmlns:wpc="http://schemas.microsoft.com/office/word/2010/wordprocessingCanvas" xmlns:cx="http://schemas.microsoft.com/office/drawing/2014/chartex" xmlns:cx1="http://schemas.microsoft.com/office/drawing/2015/9/8/chartex" xmlns:cx2="http://schemas.microsoft.com/office/drawing/2015/10/21/chartex" xmlns:cx3="http://schemas.microsoft.com/office/drawing/2016/5/9/chartex" xmlns:cx4="http://schemas.microsoft.com/office/drawing/2016/5/10/chartex" xmlns:cx5="http://schemas.microsoft.com/office/drawing/2016/5/11/chartex" xmlns:cx6="http://schemas.microsoft.com/office/drawing/2016/5/12/chartex" xmlns:cx7="http://schemas.microsoft.com/office/drawing/2016/5/13/chartex" xmlns:cx8="http://schemas.microsoft.com/office/drawing/2016/5/14/chartex" xmlns:mc="http://schemas.openxmlformats.org/markup-compatibility/2006" xmlns:aink="http://schemas.microsoft.com/office/drawing/2016/ink" xmlns:am3d="http://schemas.microsoft.com/office/drawing/2017/model3d" xmlns:o="urn:schemas-microsoft-com:office:office" xmlns:r="http://schemas.openxmlformats.org/officeDocument/2006/relationships" xmlns:m="http://schemas.openxmlformats.org/officeDocument/2006/math" xmlns:v="urn:schemas-microsoft-com:vml" xmlns:wp14="http://schemas.microsoft.com/office/word/2010/wordprocessingDrawing" xmlns:wp="http://schemas.openxmlformats.org/drawingml/2006/wordprocessingDrawing" xmlns:w10="urn:schemas-microsoft-com:office:word" xmlns:w="http://schemas.openxmlformats.org/wordprocessingml/2006/main" xmlns:w14="http://schemas.microsoft.com/office/word/2010/wordml" xmlns:w15="http://schemas.microsoft.com/office/word/2012/wordml" xmlns:w16cex="http://schemas.microsoft.com/office/word/2018/wordml/cex" xmlns:w16cid="http://schemas.microsoft.com/office/word/2016/wordml/cid" xmlns:w16="http://schemas.microsoft.com/office/word/2018/wordml" xmlns:w16sdtdh="http://schemas.microsoft.com/office/word/2020/wordml/sdtdatahash" xmlns:w16se="http://schemas.microsoft.com/office/word/2015/wordml/symex" xmlns:wpg="http://schemas.microsoft.com/office/word/2010/wordprocessingGroup" xmlns:wpi="http://schemas.microsoft.com/office/word/2010/wordprocessingInk" xmlns:wne="http://schemas.microsoft.com/office/word/2006/wordml" xmlns:wps="http://schemas.microsoft.com/office/word/2010/wordprocessingShape" mc:Ignorable="w14 w15 w16se w16cid w16 w16cex w16sdtdh wp14">
+<w:numbering xmlns:wpc="http://schemas.microsoft.com/office/word/2010/wordprocessingCanvas" xmlns:cx="http://schemas.microsoft.com/office/drawing/2014/chartex" xmlns:cx1="http://schemas.microsoft.com/office/drawing/2015/9/8/chartex" xmlns:cx2="http://schemas.microsoft.com/office/drawing/2015/10/21/chartex" xmlns:cx3="http://schemas.microsoft.com/office/drawing/2016/5/9/chartex" xmlns:cx4="http://schemas.microsoft.com/office/drawing/2016/5/10/chartex" xmlns:cx5="http://schemas.microsoft.com/office/drawing/2016/5/11/chartex" xmlns:cx6="http://schemas.microsoft.com/office/drawing/2016/5/12/chartex" xmlns:cx7="http://schemas.microsoft.com/office/drawing/2016/5/13/chartex" xmlns:cx8="http://schemas.microsoft.com/office/drawing/2016/5/14/chartex" xmlns:mc="http://schemas.openxmlformats.org/markup-compatibility/2006" xmlns:aink="http://schemas.microsoft.com/office/drawing/2016/ink" xmlns:am3d="http://schemas.microsoft.com/office/drawing/2017/model3d" xmlns:o="urn:schemas-microsoft-com:office:office" xmlns:oel="http://schemas.microsoft.com/office/2019/extlst" xmlns:r="http://schemas.openxmlformats.org/officeDocument/2006/relationships" xmlns:m="http://schemas.openxmlformats.org/officeDocument/2006/math" xmlns:v="urn:schemas-microsoft-com:vml" xmlns:wp14="http://schemas.microsoft.com/office/word/2010/wordprocessingDrawing" xmlns:wp="http://schemas.openxmlformats.org/drawingml/2006/wordprocessingDrawing" xmlns:w10="urn:schemas-microsoft-com:office:word" xmlns:w="http://schemas.openxmlformats.org/wordprocessingml/2006/main" xmlns:w14="http://schemas.microsoft.com/office/word/2010/wordml" xmlns:w15="http://schemas.microsoft.com/office/word/2012/wordml" xmlns:w16cex="http://schemas.microsoft.com/office/word/2018/wordml/cex" xmlns:w16cid="http://schemas.microsoft.com/office/word/2016/wordml/cid" xmlns:w16="http://schemas.microsoft.com/office/word/2018/wordml" xmlns:w16sdtdh="http://schemas.microsoft.com/office/word/2020/wordml/sdtdatahash" xmlns:w16se="http://schemas.microsoft.com/office/word/2015/wordml/symex" xmlns:wpg="http://schemas.microsoft.com/office/word/2010/wordprocessingGroup" xmlns:wpi="http://schemas.microsoft.com/office/word/2010/wordprocessingInk" xmlns:wne="http://schemas.microsoft.com/office/word/2006/wordml" xmlns:wps="http://schemas.microsoft.com/office/word/2010/wordprocessingShape" mc:Ignorable="w14 w15 w16se w16cid w16 w16cex w16sdtdh wp14">
   <w:abstractNum w:abstractNumId="0" w15:restartNumberingAfterBreak="0">
     <w:nsid w:val="101F1C0A"/>
     <w:multiLevelType w:val="hybridMultilevel"/>
@@ -12260,37 +12104,37 @@
       </w:rPr>
     </w:lvl>
   </w:abstractNum>
-  <w:num w:numId="1">
+  <w:num w:numId="1" w16cid:durableId="2091269172">
     <w:abstractNumId w:val="6"/>
   </w:num>
-  <w:num w:numId="2">
+  <w:num w:numId="2" w16cid:durableId="1850098706">
     <w:abstractNumId w:val="10"/>
   </w:num>
-  <w:num w:numId="3">
+  <w:num w:numId="3" w16cid:durableId="32005568">
     <w:abstractNumId w:val="5"/>
   </w:num>
-  <w:num w:numId="4">
+  <w:num w:numId="4" w16cid:durableId="1745487641">
     <w:abstractNumId w:val="4"/>
   </w:num>
-  <w:num w:numId="5">
+  <w:num w:numId="5" w16cid:durableId="384642442">
     <w:abstractNumId w:val="0"/>
   </w:num>
-  <w:num w:numId="6">
+  <w:num w:numId="6" w16cid:durableId="477263034">
     <w:abstractNumId w:val="1"/>
   </w:num>
-  <w:num w:numId="7">
+  <w:num w:numId="7" w16cid:durableId="1971324003">
     <w:abstractNumId w:val="3"/>
   </w:num>
-  <w:num w:numId="8">
+  <w:num w:numId="8" w16cid:durableId="1639845303">
     <w:abstractNumId w:val="9"/>
   </w:num>
-  <w:num w:numId="9">
+  <w:num w:numId="9" w16cid:durableId="731737419">
     <w:abstractNumId w:val="8"/>
   </w:num>
-  <w:num w:numId="10">
+  <w:num w:numId="10" w16cid:durableId="525142405">
     <w:abstractNumId w:val="7"/>
   </w:num>
-  <w:num w:numId="11">
+  <w:num w:numId="11" w16cid:durableId="826172402">
     <w:abstractNumId w:val="2"/>
   </w:num>
   <w:numIdMacAtCleanup w:val="4"/>
@@ -13910,15 +13754,6 @@
 </file>
 
 <file path=customXml/item1.xml><?xml version="1.0" encoding="utf-8"?>
-<?mso-contentType ?>
-<FormTemplates xmlns="http://schemas.microsoft.com/sharepoint/v3/contenttype/forms">
-  <Display>DocumentLibraryForm</Display>
-  <Edit>DocumentLibraryForm</Edit>
-  <New>DocumentLibraryForm</New>
-</FormTemplates>
-</file>
-
-<file path=customXml/item2.xml><?xml version="1.0" encoding="utf-8"?>
 <ct:contentTypeSchema xmlns:ct="http://schemas.microsoft.com/office/2006/metadata/contentType" xmlns:ma="http://schemas.microsoft.com/office/2006/metadata/properties/metaAttributes" ct:_="" ma:_="" ma:contentTypeName="Documento" ma:contentTypeID="0x010100AF28BDBD65D93F4BA99B6439AFEA320E" ma:contentTypeVersion="10" ma:contentTypeDescription="Crear nuevo documento." ma:contentTypeScope="" ma:versionID="11d45d99e0339591c68aad091688ac92">
   <xsd:schema xmlns:xsd="http://www.w3.org/2001/XMLSchema" xmlns:xs="http://www.w3.org/2001/XMLSchema" xmlns:p="http://schemas.microsoft.com/office/2006/metadata/properties" xmlns:ns2="9b0ef35d-78e7-41bf-847f-3c0497ad5352" xmlns:ns3="3c969135-7855-44e0-a9fe-01d799f07605" targetNamespace="http://schemas.microsoft.com/office/2006/metadata/properties" ma:root="true" ma:fieldsID="0e603a3f7bf67670d682b80385fe4b00" ns2:_="" ns3:_="">
     <xsd:import namespace="9b0ef35d-78e7-41bf-847f-3c0497ad5352"/>
@@ -14119,25 +13954,26 @@
 </ct:contentTypeSchema>
 </file>
 
+<file path=customXml/item2.xml><?xml version="1.0" encoding="utf-8"?>
+<?mso-contentType ?>
+<FormTemplates xmlns="http://schemas.microsoft.com/sharepoint/v3/contenttype/forms">
+  <Display>DocumentLibraryForm</Display>
+  <Edit>DocumentLibraryForm</Edit>
+  <New>DocumentLibraryForm</New>
+</FormTemplates>
+</file>
+
 <file path=customXml/item3.xml><?xml version="1.0" encoding="utf-8"?>
+<b:Sources xmlns:b="http://schemas.openxmlformats.org/officeDocument/2006/bibliography" xmlns="http://schemas.openxmlformats.org/officeDocument/2006/bibliography" SelectedStyle="/APASixthEditionOfficeOnline.xsl" StyleName="APA" Version="6"/>
+</file>
+
+<file path=customXml/item4.xml><?xml version="1.0" encoding="utf-8"?>
 <p:properties xmlns:p="http://schemas.microsoft.com/office/2006/metadata/properties" xmlns:xsi="http://www.w3.org/2001/XMLSchema-instance" xmlns:pc="http://schemas.microsoft.com/office/infopath/2007/PartnerControls">
   <documentManagement/>
 </p:properties>
 </file>
 
-<file path=customXml/item4.xml><?xml version="1.0" encoding="utf-8"?>
-<b:Sources xmlns:b="http://schemas.openxmlformats.org/officeDocument/2006/bibliography" xmlns="http://schemas.openxmlformats.org/officeDocument/2006/bibliography" SelectedStyle="/APASixthEditionOfficeOnline.xsl" StyleName="APA" Version="6"/>
-</file>
-
 <file path=customXml/itemProps1.xml><?xml version="1.0" encoding="utf-8"?>
-<ds:datastoreItem xmlns:ds="http://schemas.openxmlformats.org/officeDocument/2006/customXml" ds:itemID="{836CD6ED-D121-451D-9009-89041862BDCC}">
-  <ds:schemaRefs>
-    <ds:schemaRef ds:uri="http://schemas.microsoft.com/sharepoint/v3/contenttype/forms"/>
-  </ds:schemaRefs>
-</ds:datastoreItem>
-</file>
-
-<file path=customXml/itemProps2.xml><?xml version="1.0" encoding="utf-8"?>
 <ds:datastoreItem xmlns:ds="http://schemas.openxmlformats.org/officeDocument/2006/customXml" ds:itemID="{45AF2103-6344-4B3B-BBB6-7B451BD9DA8A}">
   <ds:schemaRefs>
     <ds:schemaRef ds:uri="http://schemas.microsoft.com/office/2006/metadata/contentType"/>
@@ -14156,19 +13992,27 @@
 </ds:datastoreItem>
 </file>
 
+<file path=customXml/itemProps2.xml><?xml version="1.0" encoding="utf-8"?>
+<ds:datastoreItem xmlns:ds="http://schemas.openxmlformats.org/officeDocument/2006/customXml" ds:itemID="{836CD6ED-D121-451D-9009-89041862BDCC}">
+  <ds:schemaRefs>
+    <ds:schemaRef ds:uri="http://schemas.microsoft.com/sharepoint/v3/contenttype/forms"/>
+  </ds:schemaRefs>
+</ds:datastoreItem>
+</file>
+
 <file path=customXml/itemProps3.xml><?xml version="1.0" encoding="utf-8"?>
+<ds:datastoreItem xmlns:ds="http://schemas.openxmlformats.org/officeDocument/2006/customXml" ds:itemID="{7BCEAE7D-0658-4599-9467-160E0680ABF1}">
+  <ds:schemaRefs>
+    <ds:schemaRef ds:uri="http://schemas.openxmlformats.org/officeDocument/2006/bibliography"/>
+  </ds:schemaRefs>
+</ds:datastoreItem>
+</file>
+
+<file path=customXml/itemProps4.xml><?xml version="1.0" encoding="utf-8"?>
 <ds:datastoreItem xmlns:ds="http://schemas.openxmlformats.org/officeDocument/2006/customXml" ds:itemID="{1F0F8696-2F11-4ED2-B3BB-20313B5F1328}">
   <ds:schemaRefs>
     <ds:schemaRef ds:uri="http://schemas.microsoft.com/office/2006/metadata/properties"/>
     <ds:schemaRef ds:uri="http://schemas.microsoft.com/office/infopath/2007/PartnerControls"/>
   </ds:schemaRefs>
 </ds:datastoreItem>
-</file>
-
-<file path=customXml/itemProps4.xml><?xml version="1.0" encoding="utf-8"?>
-<ds:datastoreItem xmlns:ds="http://schemas.openxmlformats.org/officeDocument/2006/customXml" ds:itemID="{7BCEAE7D-0658-4599-9467-160E0680ABF1}">
-  <ds:schemaRefs>
-    <ds:schemaRef ds:uri="http://schemas.openxmlformats.org/officeDocument/2006/bibliography"/>
-  </ds:schemaRefs>
-</ds:datastoreItem>
 </file>
</xml_diff>